<commit_message>
docs: mise a jour du cahier des charges
</commit_message>
<xml_diff>
--- a/cahier de charge/Cahier_des_charges.docx
+++ b/cahier de charge/Cahier_des_charges.docx
@@ -707,15 +707,15 @@
                 <w:sz w:val="21"/>
                 <w:szCs w:val="21"/>
               </w:rPr>
-              <w:t xml:space="preserve">7 paiements</w:t>
-            </w:r>
-            <w:r>
-              <w:rPr>
-                <w:rFonts w:ascii="Calibri" w:eastAsia="Times New Roman" w:hAnsi="Calibri" w:cs="Calibri"/>
-                <w:sz w:val="21"/>
-                <w:szCs w:val="21"/>
-              </w:rPr>
-              <w:t xml:space="preserve">, soit un acompte au démarrage puis un paiement par semaine, chacun lié à une étape que vous avez déjà vue et essayée. Le plus petit fait 40 000 FCFA.</w:t>
+              <w:t xml:space="preserve">5 paiements</w:t>
+            </w:r>
+            <w:r>
+              <w:rPr>
+                <w:rFonts w:ascii="Calibri" w:eastAsia="Times New Roman" w:hAnsi="Calibri" w:cs="Calibri"/>
+                <w:sz w:val="21"/>
+                <w:szCs w:val="21"/>
+              </w:rPr>
+              <w:t xml:space="preserve">, soit un acompte de 50 000 FCFA à verser avant tout démarrage, puis un paiement de 75 000 FCFA à la fin de chacune des 4 semaines de développement, au moment où je vous présente un résultat que vous avez déjà vu et essayé.</w:t>
             </w:r>
           </w:p>
         </w:tc>
@@ -782,7 +782,7 @@
                 <w:sz w:val="21"/>
                 <w:szCs w:val="21"/>
               </w:rPr>
-              <w:t>À la date que vous choisissez, quand votre hébergement est prêt</w:t>
+              <w:t xml:space="preserve">À la date que vous choisissez, une fois que vous avez réglé l'hébergement et le nom de domaine que je vous indique</w:t>
             </w:r>
           </w:p>
         </w:tc>
@@ -4121,85 +4121,15 @@
                 <w:szCs w:val="20"/>
               </w:rPr>
               <w:t xml:space="preserve">• Tableau de bord et aperçu des ventes (chiffres clés, comparaison avec la période précédente, export PDF)</w:t>
-            </w:r>
-            <w:r>
-              <w:rPr>
-                <w:rFonts w:ascii="Calibri" w:eastAsia="Times New Roman" w:hAnsi="Calibri" w:cs="Calibri"/>
-                <w:sz w:val="20"/>
-                <w:szCs w:val="20"/>
-              </w:rPr>
               <w:br/>
-            </w:r>
-            <w:r>
-              <w:rPr>
-                <w:rFonts w:ascii="Calibri" w:eastAsia="Times New Roman" w:hAnsi="Calibri" w:cs="Calibri"/>
-                <w:sz w:val="20"/>
-                <w:szCs w:val="20"/>
-              </w:rPr>
               <w:t xml:space="preserve">• Gestion des produits (textes en deux langues, photos, prix)</w:t>
-            </w:r>
-            <w:r>
-              <w:rPr>
-                <w:rFonts w:ascii="Calibri" w:eastAsia="Times New Roman" w:hAnsi="Calibri" w:cs="Calibri"/>
-                <w:sz w:val="20"/>
-                <w:szCs w:val="20"/>
-              </w:rPr>
               <w:br/>
-            </w:r>
-            <w:r>
-              <w:rPr>
-                <w:rFonts w:ascii="Calibri" w:eastAsia="Times New Roman" w:hAnsi="Calibri" w:cs="Calibri"/>
-                <w:sz w:val="20"/>
-                <w:szCs w:val="20"/>
-              </w:rPr>
               <w:t xml:space="preserve">• Stock avec historique et export</w:t>
-            </w:r>
-            <w:r>
-              <w:rPr>
-                <w:rFonts w:ascii="Calibri" w:eastAsia="Times New Roman" w:hAnsi="Calibri" w:cs="Calibri"/>
-                <w:sz w:val="20"/>
-                <w:szCs w:val="20"/>
-              </w:rPr>
               <w:br/>
-            </w:r>
-            <w:r>
-              <w:rPr>
-                <w:rFonts w:ascii="Calibri" w:eastAsia="Times New Roman" w:hAnsi="Calibri" w:cs="Calibri"/>
-                <w:sz w:val="20"/>
-                <w:szCs w:val="20"/>
-              </w:rPr>
               <w:t xml:space="preserve">• Commandes : suivre, avancer le statut (même plusieurs à la fois), annuler, exporter, imprimer un bon</w:t>
-            </w:r>
-            <w:r>
-              <w:rPr>
-                <w:rFonts w:ascii="Calibri" w:eastAsia="Times New Roman" w:hAnsi="Calibri" w:cs="Calibri"/>
-                <w:sz w:val="20"/>
-                <w:szCs w:val="20"/>
-              </w:rPr>
               <w:br/>
-            </w:r>
-            <w:r>
-              <w:rPr>
-                <w:rFonts w:ascii="Calibri" w:eastAsia="Times New Roman" w:hAnsi="Calibri" w:cs="Calibri"/>
-                <w:sz w:val="20"/>
-                <w:szCs w:val="20"/>
-              </w:rPr>
               <w:t xml:space="preserve">• Paiements à vérifier : notification à chaque paiement déclaré par un client, puis validation « paiement reçu » ou « non reçu » en un clic. Vos numéros Wave et Orange Money se règlent ici.</w:t>
-            </w:r>
-            <w:r>
-              <w:rPr>
-                <w:rFonts w:ascii="Calibri" w:eastAsia="Times New Roman" w:hAnsi="Calibri" w:cs="Calibri"/>
-                <w:sz w:val="20"/>
-                <w:szCs w:val="20"/>
-              </w:rPr>
               <w:br/>
-            </w:r>
-            <w:r>
-              <w:rPr>
-                <w:rFonts w:ascii="Calibri" w:eastAsia="Times New Roman" w:hAnsi="Calibri" w:cs="Calibri"/>
-                <w:sz w:val="20"/>
-                <w:szCs w:val="20"/>
-              </w:rPr>
               <w:t xml:space="preserve">• Factures : consulter, télécharger, ou récupérer plusieurs d'un coup</w:t>
             </w:r>
           </w:p>
@@ -5425,17 +5355,17 @@
                 <w:sz w:val="20"/>
                 <w:szCs w:val="20"/>
               </w:rPr>
-              <w:t xml:space="preserve">Après la validation de ce cahier des charges, vous me remettez tous les documents, accès et informations nécessaires. Je les analyse pour bien organiser le travail. </w:t>
-            </w:r>
-            <w:r>
-              <w:rPr>
-                <w:rFonts w:ascii="Calibri" w:eastAsia="Times New Roman" w:hAnsi="Calibri" w:cs="Calibri"/>
-                <w:b/>
-                <w:bCs/>
-                <w:sz w:val="20"/>
-                <w:szCs w:val="20"/>
-              </w:rPr>
-              <w:t xml:space="preserve">Cette semaine n'est pas comprise dans les 4 semaines de développement.</w:t>
+              <w:t xml:space="preserve">Après la validation de ce cahier des charges et le versement de l'acompte, vous me remettez, dans les 7 jours, tous les documents, accès et informations listés en annexe. Je les analyse et je vous dis, à la fin de la semaine, s'il manque quelque chose. Le développement ne commence qu'une fois tout reçu. Cette semaine n'est pas comprise dans les 4 semaines de développement.</w:t>
+            </w:r>
+            <w:r>
+              <w:rPr>
+                <w:rFonts w:ascii="Calibri" w:eastAsia="Times New Roman" w:hAnsi="Calibri" w:cs="Calibri"/>
+                <w:b/>
+                <w:bCs/>
+                <w:sz w:val="20"/>
+                <w:szCs w:val="20"/>
+              </w:rPr>
+              <w:t xml:space="preserve"/>
             </w:r>
           </w:p>
         </w:tc>
@@ -5631,7 +5561,7 @@
                 <w:sz w:val="20"/>
                 <w:szCs w:val="20"/>
               </w:rPr>
-              <w:t>Installation sur votre hébergement, une fois celui-ci prêt (section 10)</w:t>
+              <w:t xml:space="preserve">Préparation de l'environnement de mise en ligne, une fois que vous avez réglé la somme de l'hébergement et du nom de domaine que je vous ai indiqués, puis 2 semaines d'observation du fonctionnement (voir section 12)</w:t>
             </w:r>
           </w:p>
         </w:tc>
@@ -6884,7 +6814,7 @@
                 <w:sz w:val="20"/>
                 <w:szCs w:val="20"/>
               </w:rPr>
-              <w:t xml:space="preserve">J'installe la plateforme sur votre hébergement, j'y renseigne vos numéros Wave et Orange Money, je la relie à vos comptes (réunions, vidéos, emails), je fais les derniers essais en conditions réelles et nous faisons ensemble une séance de prise en main d'une heure. La plateforme est ensuite ouverte au public.</w:t>
+              <w:t xml:space="preserve">Une fois que vous avez réglé la somme de l'hébergement et du nom de domaine que je vous ai indiqués et que vous m'avez donné les accès, je prépare l'environnement de mise en ligne : j'installe la plateforme sur votre hébergement, j'y renseigne vos numéros Wave et Orange Money, je la relie à vos comptes (réunions, vidéos, emails), je fais les derniers essais en conditions réelles et nous faisons ensemble une séance de prise en main d'une heure. La plateforme est ensuite ouverte au public, et commencent alors les 2 semaines d'observation du fonctionnement (voir section 12).</w:t>
             </w:r>
           </w:p>
         </w:tc>
@@ -6939,7 +6869,7 @@
           <w:sz w:val="21"/>
           <w:szCs w:val="21"/>
         </w:rPr>
-        <w:t xml:space="preserve">Prix total : 350 000 FCFA, payés en 7 fois.</w:t>
+        <w:t xml:space="preserve">Prix total : 350 000 FCFA, payés en 5 fois : un acompte de 50 000 FCFA avant le démarrage, puis 4 paiements de 75 000 FCFA, un à la fin de chaque semaine.</w:t>
       </w:r>
     </w:p>
     <w:p>
@@ -7021,7 +6951,7 @@
                 <w:sz w:val="21"/>
                 <w:szCs w:val="21"/>
               </w:rPr>
-              <w:t xml:space="preserve">. À la fin de chaque semaine, je vous présente un résultat que vous pouvez essayer, et c'est à ce moment-là que le paiement correspondant est dû : un seul paiement par semaine, simple à suivre et léger pour votre trésorerie. L'acompte couvre la semaine de préparation, c'est-à-dire l'analyse de tous les éléments que vous me remettez et l'organisation complète du travail, indispensables pour bien démarrer. Le montant le plus important n'arrive qu'à la fin, quand vous avez déjà validé toute la plateforme.</w:t>
+              <w:t xml:space="preserve">. À la fin de chaque semaine, je vous présente un résultat que vous pouvez essayer, et c'est à ce moment-là que le paiement correspondant est dû : un seul paiement par semaine, de 75 000 FCFA, simple à suivre et léger pour votre trésorerie. L'acompte de 50 000 FCFA est versé avant le démarrage : il couvre la semaine de préparation, c'est-à-dire l'analyse de tous les éléments que vous me remettez et l'organisation complète du travail, indispensables pour bien démarrer. Les 4 paiements de fin de semaine soldent le prix total à la fin de la semaine 4.</w:t>
             </w:r>
           </w:p>
         </w:tc>
@@ -7678,7 +7608,7 @@
                 <w:sz w:val="20"/>
                 <w:szCs w:val="20"/>
               </w:rPr>
-              <w:t>40 000</w:t>
+              <w:t>75 000</w:t>
             </w:r>
           </w:p>
         </w:tc>
@@ -7710,7 +7640,7 @@
                 <w:sz w:val="20"/>
                 <w:szCs w:val="20"/>
               </w:rPr>
-              <w:t>90 000</w:t>
+              <w:t>125 000</w:t>
             </w:r>
           </w:p>
         </w:tc>
@@ -7738,8 +7668,8 @@
               <w:tblLook w:val="04A0" w:firstRow="1" w:lastRow="0" w:firstColumn="1" w:lastColumn="0" w:noHBand="0" w:noVBand="1"/>
             </w:tblPr>
             <w:tblGrid>
-              <w:gridCol w:w="430"/>
-              <w:gridCol w:w="1223"/>
+              <w:gridCol w:w="595"/>
+              <w:gridCol w:w="1058"/>
             </w:tblGrid>
             <w:tr>
               <w:trPr>
@@ -7747,7 +7677,7 @@
               </w:trPr>
               <w:tc>
                 <w:tcPr>
-                  <w:tcW w:w="1300" w:type="pct"/>
+                  <w:tcW w:w="1800" w:type="pct"/>
                   <w:shd w:val="clear" w:color="auto" w:fill="E8833A"/>
                   <w:vAlign w:val="center"/>
                   <w:hideMark/>
@@ -7773,7 +7703,7 @@
               </w:tc>
               <w:tc>
                 <w:tcPr>
-                  <w:tcW w:w="3700" w:type="pct"/>
+                  <w:tcW w:w="3200" w:type="pct"/>
                   <w:shd w:val="clear" w:color="auto" w:fill="DDE3EA"/>
                   <w:vAlign w:val="center"/>
                   <w:hideMark/>
@@ -7814,7 +7744,7 @@
                 <w:sz w:val="15"/>
                 <w:szCs w:val="15"/>
               </w:rPr>
-              <w:t>26 %</w:t>
+              <w:t>36 %</w:t>
             </w:r>
           </w:p>
         </w:tc>
@@ -7947,7 +7877,7 @@
                 <w:sz w:val="20"/>
                 <w:szCs w:val="20"/>
               </w:rPr>
-              <w:t>40 000</w:t>
+              <w:t>75 000</w:t>
             </w:r>
           </w:p>
         </w:tc>
@@ -7979,7 +7909,7 @@
                 <w:sz w:val="20"/>
                 <w:szCs w:val="20"/>
               </w:rPr>
-              <w:t>130 000</w:t>
+              <w:t>200 000</w:t>
             </w:r>
           </w:p>
         </w:tc>
@@ -8007,8 +7937,8 @@
               <w:tblLook w:val="04A0" w:firstRow="1" w:lastRow="0" w:firstColumn="1" w:lastColumn="0" w:noHBand="0" w:noVBand="1"/>
             </w:tblPr>
             <w:tblGrid>
-              <w:gridCol w:w="612"/>
-              <w:gridCol w:w="1041"/>
+              <w:gridCol w:w="942"/>
+              <w:gridCol w:w="711"/>
             </w:tblGrid>
             <w:tr>
               <w:trPr>
@@ -8016,7 +7946,7 @@
               </w:trPr>
               <w:tc>
                 <w:tcPr>
-                  <w:tcW w:w="1850" w:type="pct"/>
+                  <w:tcW w:w="2850" w:type="pct"/>
                   <w:shd w:val="clear" w:color="auto" w:fill="E8833A"/>
                   <w:vAlign w:val="center"/>
                   <w:hideMark/>
@@ -8042,7 +7972,7 @@
               </w:tc>
               <w:tc>
                 <w:tcPr>
-                  <w:tcW w:w="3150" w:type="pct"/>
+                  <w:tcW w:w="2150" w:type="pct"/>
                   <w:shd w:val="clear" w:color="auto" w:fill="DDE3EA"/>
                   <w:vAlign w:val="center"/>
                   <w:hideMark/>
@@ -8083,7 +8013,7 @@
                 <w:sz w:val="15"/>
                 <w:szCs w:val="15"/>
               </w:rPr>
-              <w:t>37 %</w:t>
+              <w:t>57 %</w:t>
             </w:r>
           </w:p>
         </w:tc>
@@ -8216,7 +8146,7 @@
                 <w:sz w:val="20"/>
                 <w:szCs w:val="20"/>
               </w:rPr>
-              <w:t>40 000</w:t>
+              <w:t>75 000</w:t>
             </w:r>
           </w:p>
         </w:tc>
@@ -8248,7 +8178,7 @@
                 <w:sz w:val="20"/>
                 <w:szCs w:val="20"/>
               </w:rPr>
-              <w:t>170 000</w:t>
+              <w:t>275 000</w:t>
             </w:r>
           </w:p>
         </w:tc>
@@ -8276,8 +8206,8 @@
               <w:tblLook w:val="04A0" w:firstRow="1" w:lastRow="0" w:firstColumn="1" w:lastColumn="0" w:noHBand="0" w:noVBand="1"/>
             </w:tblPr>
             <w:tblGrid>
-              <w:gridCol w:w="810"/>
-              <w:gridCol w:w="843"/>
+              <w:gridCol w:w="1306"/>
+              <w:gridCol w:w="347"/>
             </w:tblGrid>
             <w:tr>
               <w:trPr>
@@ -8285,7 +8215,7 @@
               </w:trPr>
               <w:tc>
                 <w:tcPr>
-                  <w:tcW w:w="2450" w:type="pct"/>
+                  <w:tcW w:w="3950" w:type="pct"/>
                   <w:shd w:val="clear" w:color="auto" w:fill="E8833A"/>
                   <w:vAlign w:val="center"/>
                   <w:hideMark/>
@@ -8311,7 +8241,7 @@
               </w:tc>
               <w:tc>
                 <w:tcPr>
-                  <w:tcW w:w="2550" w:type="pct"/>
+                  <w:tcW w:w="1050" w:type="pct"/>
                   <w:shd w:val="clear" w:color="auto" w:fill="DDE3EA"/>
                   <w:vAlign w:val="center"/>
                   <w:hideMark/>
@@ -8352,276 +8282,7 @@
                 <w:sz w:val="15"/>
                 <w:szCs w:val="15"/>
               </w:rPr>
-              <w:t>49 %</w:t>
-            </w:r>
-          </w:p>
-        </w:tc>
-      </w:tr>
-      <w:tr>
-        <w:tc>
-          <w:tcPr>
-            <w:tcW w:w="0" w:type="auto"/>
-            <w:tcBorders>
-              <w:top w:val="single" w:sz="6" w:space="0" w:color="C9D3DE"/>
-              <w:left w:val="single" w:sz="6" w:space="0" w:color="C9D3DE"/>
-              <w:bottom w:val="single" w:sz="6" w:space="0" w:color="C9D3DE"/>
-              <w:right w:val="single" w:sz="6" w:space="0" w:color="C9D3DE"/>
-            </w:tcBorders>
-            <w:shd w:val="clear" w:color="auto" w:fill="FFFFFF"/>
-            <w:vAlign w:val="center"/>
-            <w:hideMark/>
-          </w:tcPr>
-          <w:p>
-            <w:pPr>
-              <w:spacing w:before="120" w:after="120"/>
-              <w:rPr>
-                <w:rFonts w:ascii="Calibri" w:eastAsia="Times New Roman" w:hAnsi="Calibri" w:cs="Calibri"/>
-                <w:sz w:val="20"/>
-                <w:szCs w:val="20"/>
-              </w:rPr>
-            </w:pPr>
-            <w:r>
-              <w:rPr>
-                <w:rFonts w:ascii="Calibri" w:eastAsia="Times New Roman" w:hAnsi="Calibri" w:cs="Calibri"/>
-                <w:b/>
-                <w:bCs/>
-                <w:color w:val="1F3A5F"/>
-                <w:sz w:val="20"/>
-                <w:szCs w:val="20"/>
-              </w:rPr>
-              <w:t>4</w:t>
-            </w:r>
-          </w:p>
-        </w:tc>
-        <w:tc>
-          <w:tcPr>
-            <w:tcW w:w="0" w:type="auto"/>
-            <w:tcBorders>
-              <w:top w:val="single" w:sz="6" w:space="0" w:color="C9D3DE"/>
-              <w:left w:val="single" w:sz="6" w:space="0" w:color="C9D3DE"/>
-              <w:bottom w:val="single" w:sz="6" w:space="0" w:color="C9D3DE"/>
-              <w:right w:val="single" w:sz="6" w:space="0" w:color="C9D3DE"/>
-            </w:tcBorders>
-            <w:shd w:val="clear" w:color="auto" w:fill="FFFFFF"/>
-            <w:vAlign w:val="center"/>
-            <w:hideMark/>
-          </w:tcPr>
-          <w:p>
-            <w:pPr>
-              <w:spacing w:before="120" w:after="120"/>
-              <w:rPr>
-                <w:rFonts w:ascii="Calibri" w:eastAsia="Times New Roman" w:hAnsi="Calibri" w:cs="Calibri"/>
-                <w:sz w:val="20"/>
-                <w:szCs w:val="20"/>
-              </w:rPr>
-            </w:pPr>
-            <w:r>
-              <w:rPr>
-                <w:rFonts w:ascii="Calibri" w:eastAsia="Times New Roman" w:hAnsi="Calibri" w:cs="Calibri"/>
-                <w:sz w:val="20"/>
-                <w:szCs w:val="20"/>
-              </w:rPr>
-              <w:t>Semaine 4, fin</w:t>
-            </w:r>
-          </w:p>
-        </w:tc>
-        <w:tc>
-          <w:tcPr>
-            <w:tcW w:w="0" w:type="auto"/>
-            <w:tcBorders>
-              <w:top w:val="single" w:sz="6" w:space="0" w:color="C9D3DE"/>
-              <w:left w:val="single" w:sz="6" w:space="0" w:color="C9D3DE"/>
-              <w:bottom w:val="single" w:sz="6" w:space="0" w:color="C9D3DE"/>
-              <w:right w:val="single" w:sz="6" w:space="0" w:color="C9D3DE"/>
-            </w:tcBorders>
-            <w:shd w:val="clear" w:color="auto" w:fill="FFFFFF"/>
-            <w:vAlign w:val="center"/>
-            <w:hideMark/>
-          </w:tcPr>
-          <w:p>
-            <w:pPr>
-              <w:spacing w:before="120" w:after="120"/>
-              <w:rPr>
-                <w:rFonts w:ascii="Calibri" w:eastAsia="Times New Roman" w:hAnsi="Calibri" w:cs="Calibri"/>
-                <w:sz w:val="20"/>
-                <w:szCs w:val="20"/>
-              </w:rPr>
-            </w:pPr>
-            <w:r>
-              <w:rPr>
-                <w:rFonts w:ascii="Calibri" w:eastAsia="Times New Roman" w:hAnsi="Calibri" w:cs="Calibri"/>
-                <w:sz w:val="20"/>
-                <w:szCs w:val="20"/>
-              </w:rPr>
-              <w:t>Tests, guide d'utilisation, préparation</w:t>
-            </w:r>
-          </w:p>
-        </w:tc>
-        <w:tc>
-          <w:tcPr>
-            <w:tcW w:w="0" w:type="auto"/>
-            <w:tcBorders>
-              <w:top w:val="single" w:sz="6" w:space="0" w:color="C9D3DE"/>
-              <w:left w:val="single" w:sz="6" w:space="0" w:color="C9D3DE"/>
-              <w:bottom w:val="single" w:sz="6" w:space="0" w:color="C9D3DE"/>
-              <w:right w:val="single" w:sz="6" w:space="0" w:color="C9D3DE"/>
-            </w:tcBorders>
-            <w:shd w:val="clear" w:color="auto" w:fill="FFFFFF"/>
-            <w:vAlign w:val="center"/>
-            <w:hideMark/>
-          </w:tcPr>
-          <w:p>
-            <w:pPr>
-              <w:spacing w:before="120" w:after="120"/>
-              <w:rPr>
-                <w:rFonts w:ascii="Calibri" w:eastAsia="Times New Roman" w:hAnsi="Calibri" w:cs="Calibri"/>
-                <w:sz w:val="20"/>
-                <w:szCs w:val="20"/>
-              </w:rPr>
-            </w:pPr>
-            <w:r>
-              <w:rPr>
-                <w:rFonts w:ascii="Calibri" w:eastAsia="Times New Roman" w:hAnsi="Calibri" w:cs="Calibri"/>
-                <w:sz w:val="20"/>
-                <w:szCs w:val="20"/>
-              </w:rPr>
-              <w:t>40 000</w:t>
-            </w:r>
-          </w:p>
-        </w:tc>
-        <w:tc>
-          <w:tcPr>
-            <w:tcW w:w="0" w:type="auto"/>
-            <w:tcBorders>
-              <w:top w:val="single" w:sz="6" w:space="0" w:color="C9D3DE"/>
-              <w:left w:val="single" w:sz="6" w:space="0" w:color="C9D3DE"/>
-              <w:bottom w:val="single" w:sz="6" w:space="0" w:color="C9D3DE"/>
-              <w:right w:val="single" w:sz="6" w:space="0" w:color="C9D3DE"/>
-            </w:tcBorders>
-            <w:shd w:val="clear" w:color="auto" w:fill="FFFFFF"/>
-            <w:vAlign w:val="center"/>
-            <w:hideMark/>
-          </w:tcPr>
-          <w:p>
-            <w:pPr>
-              <w:spacing w:before="120" w:after="120"/>
-              <w:rPr>
-                <w:rFonts w:ascii="Calibri" w:eastAsia="Times New Roman" w:hAnsi="Calibri" w:cs="Calibri"/>
-                <w:sz w:val="20"/>
-                <w:szCs w:val="20"/>
-              </w:rPr>
-            </w:pPr>
-            <w:r>
-              <w:rPr>
-                <w:rFonts w:ascii="Calibri" w:eastAsia="Times New Roman" w:hAnsi="Calibri" w:cs="Calibri"/>
-                <w:sz w:val="20"/>
-                <w:szCs w:val="20"/>
-              </w:rPr>
-              <w:t>210 000</w:t>
-            </w:r>
-          </w:p>
-        </w:tc>
-        <w:tc>
-          <w:tcPr>
-            <w:tcW w:w="0" w:type="auto"/>
-            <w:tcBorders>
-              <w:top w:val="single" w:sz="6" w:space="0" w:color="C9D3DE"/>
-              <w:left w:val="single" w:sz="6" w:space="0" w:color="C9D3DE"/>
-              <w:bottom w:val="single" w:sz="6" w:space="0" w:color="C9D3DE"/>
-              <w:right w:val="single" w:sz="6" w:space="0" w:color="C9D3DE"/>
-            </w:tcBorders>
-            <w:shd w:val="clear" w:color="auto" w:fill="FFFFFF"/>
-            <w:vAlign w:val="center"/>
-            <w:hideMark/>
-          </w:tcPr>
-          <w:tbl>
-            <w:tblPr>
-              <w:tblW w:w="5000" w:type="pct"/>
-              <w:tblCellSpacing w:w="0" w:type="dxa"/>
-              <w:tblCellMar>
-                <w:left w:w="0" w:type="dxa"/>
-                <w:right w:w="0" w:type="dxa"/>
-              </w:tblCellMar>
-              <w:tblLook w:val="04A0" w:firstRow="1" w:lastRow="0" w:firstColumn="1" w:lastColumn="0" w:noHBand="0" w:noVBand="1"/>
-            </w:tblPr>
-            <w:tblGrid>
-              <w:gridCol w:w="992"/>
-              <w:gridCol w:w="661"/>
-            </w:tblGrid>
-            <w:tr>
-              <w:trPr>
-                <w:tblCellSpacing w:w="0" w:type="dxa"/>
-              </w:trPr>
-              <w:tc>
-                <w:tcPr>
-                  <w:tcW w:w="3000" w:type="pct"/>
-                  <w:shd w:val="clear" w:color="auto" w:fill="E8833A"/>
-                  <w:vAlign w:val="center"/>
-                  <w:hideMark/>
-                </w:tcPr>
-                <w:p>
-                  <w:pPr>
-                    <w:spacing w:line="60" w:lineRule="atLeast"/>
-                    <w:rPr>
-                      <w:rFonts w:ascii="Calibri" w:eastAsia="Times New Roman" w:hAnsi="Calibri" w:cs="Calibri"/>
-                      <w:sz w:val="6"/>
-                      <w:szCs w:val="6"/>
-                    </w:rPr>
-                  </w:pPr>
-                  <w:r>
-                    <w:rPr>
-                      <w:rFonts w:ascii="Calibri" w:eastAsia="Times New Roman" w:hAnsi="Calibri" w:cs="Calibri"/>
-                      <w:sz w:val="6"/>
-                      <w:szCs w:val="6"/>
-                    </w:rPr>
-                    <w:t> </w:t>
-                  </w:r>
-                </w:p>
-              </w:tc>
-              <w:tc>
-                <w:tcPr>
-                  <w:tcW w:w="2000" w:type="pct"/>
-                  <w:shd w:val="clear" w:color="auto" w:fill="DDE3EA"/>
-                  <w:vAlign w:val="center"/>
-                  <w:hideMark/>
-                </w:tcPr>
-                <w:p>
-                  <w:pPr>
-                    <w:spacing w:line="60" w:lineRule="atLeast"/>
-                    <w:rPr>
-                      <w:rFonts w:ascii="Calibri" w:eastAsia="Times New Roman" w:hAnsi="Calibri" w:cs="Calibri"/>
-                      <w:sz w:val="6"/>
-                      <w:szCs w:val="6"/>
-                    </w:rPr>
-                  </w:pPr>
-                  <w:r>
-                    <w:rPr>
-                      <w:rFonts w:ascii="Calibri" w:eastAsia="Times New Roman" w:hAnsi="Calibri" w:cs="Calibri"/>
-                      <w:sz w:val="6"/>
-                      <w:szCs w:val="6"/>
-                    </w:rPr>
-                    <w:t> </w:t>
-                  </w:r>
-                </w:p>
-              </w:tc>
-            </w:tr>
-          </w:tbl>
-          <w:p>
-            <w:pPr>
-              <w:spacing w:before="120" w:after="120"/>
-              <w:rPr>
-                <w:rFonts w:ascii="Calibri" w:eastAsia="Times New Roman" w:hAnsi="Calibri" w:cs="Calibri"/>
-                <w:sz w:val="20"/>
-                <w:szCs w:val="20"/>
-              </w:rPr>
-            </w:pPr>
-            <w:r>
-              <w:rPr>
-                <w:rFonts w:ascii="Calibri" w:eastAsia="Times New Roman" w:hAnsi="Calibri" w:cs="Calibri"/>
-                <w:sz w:val="15"/>
-                <w:szCs w:val="15"/>
-              </w:rPr>
-              <w:t>60 %</w:t>
+              <w:t>79 %</w:t>
             </w:r>
           </w:p>
         </w:tc>
@@ -8658,7 +8319,7 @@
                 <w:sz w:val="20"/>
                 <w:szCs w:val="20"/>
               </w:rPr>
-              <w:t>5</w:t>
+              <w:t>4</w:t>
             </w:r>
           </w:p>
         </w:tc>
@@ -8690,7 +8351,7 @@
                 <w:sz w:val="20"/>
                 <w:szCs w:val="20"/>
               </w:rPr>
-              <w:t>Validation finale</w:t>
+              <w:t>Semaine 4, fin</w:t>
             </w:r>
           </w:p>
         </w:tc>
@@ -8722,7 +8383,7 @@
                 <w:sz w:val="20"/>
                 <w:szCs w:val="20"/>
               </w:rPr>
-              <w:t>Plateforme complète validée par vous</w:t>
+              <w:t>Tests, guide d'utilisation, préparation de la mise en ligne</w:t>
             </w:r>
           </w:p>
         </w:tc>
@@ -8756,278 +8417,7 @@
                 <w:sz w:val="20"/>
                 <w:szCs w:val="20"/>
               </w:rPr>
-              <w:t>90 000</w:t>
-            </w:r>
-          </w:p>
-        </w:tc>
-        <w:tc>
-          <w:tcPr>
-            <w:tcW w:w="0" w:type="auto"/>
-            <w:tcBorders>
-              <w:top w:val="single" w:sz="6" w:space="0" w:color="C9D3DE"/>
-              <w:left w:val="single" w:sz="6" w:space="0" w:color="C9D3DE"/>
-              <w:bottom w:val="single" w:sz="6" w:space="0" w:color="C9D3DE"/>
-              <w:right w:val="single" w:sz="6" w:space="0" w:color="C9D3DE"/>
-            </w:tcBorders>
-            <w:shd w:val="clear" w:color="auto" w:fill="FFF4E8"/>
-            <w:vAlign w:val="center"/>
-            <w:hideMark/>
-          </w:tcPr>
-          <w:p>
-            <w:pPr>
-              <w:spacing w:before="120" w:after="120"/>
-              <w:rPr>
-                <w:rFonts w:ascii="Calibri" w:eastAsia="Times New Roman" w:hAnsi="Calibri" w:cs="Calibri"/>
-                <w:sz w:val="20"/>
-                <w:szCs w:val="20"/>
-              </w:rPr>
-            </w:pPr>
-            <w:r>
-              <w:rPr>
-                <w:rFonts w:ascii="Calibri" w:eastAsia="Times New Roman" w:hAnsi="Calibri" w:cs="Calibri"/>
-                <w:sz w:val="20"/>
-                <w:szCs w:val="20"/>
-              </w:rPr>
-              <w:t>300 000</w:t>
-            </w:r>
-          </w:p>
-        </w:tc>
-        <w:tc>
-          <w:tcPr>
-            <w:tcW w:w="0" w:type="auto"/>
-            <w:tcBorders>
-              <w:top w:val="single" w:sz="6" w:space="0" w:color="C9D3DE"/>
-              <w:left w:val="single" w:sz="6" w:space="0" w:color="C9D3DE"/>
-              <w:bottom w:val="single" w:sz="6" w:space="0" w:color="C9D3DE"/>
-              <w:right w:val="single" w:sz="6" w:space="0" w:color="C9D3DE"/>
-            </w:tcBorders>
-            <w:shd w:val="clear" w:color="auto" w:fill="FFF4E8"/>
-            <w:vAlign w:val="center"/>
-            <w:hideMark/>
-          </w:tcPr>
-          <w:tbl>
-            <w:tblPr>
-              <w:tblW w:w="5000" w:type="pct"/>
-              <w:tblCellSpacing w:w="0" w:type="dxa"/>
-              <w:tblCellMar>
-                <w:left w:w="0" w:type="dxa"/>
-                <w:right w:w="0" w:type="dxa"/>
-              </w:tblCellMar>
-              <w:tblLook w:val="04A0" w:firstRow="1" w:lastRow="0" w:firstColumn="1" w:lastColumn="0" w:noHBand="0" w:noVBand="1"/>
-            </w:tblPr>
-            <w:tblGrid>
-              <w:gridCol w:w="1422"/>
-              <w:gridCol w:w="231"/>
-            </w:tblGrid>
-            <w:tr>
-              <w:trPr>
-                <w:tblCellSpacing w:w="0" w:type="dxa"/>
-              </w:trPr>
-              <w:tc>
-                <w:tcPr>
-                  <w:tcW w:w="4300" w:type="pct"/>
-                  <w:shd w:val="clear" w:color="auto" w:fill="E8833A"/>
-                  <w:vAlign w:val="center"/>
-                  <w:hideMark/>
-                </w:tcPr>
-                <w:p>
-                  <w:pPr>
-                    <w:spacing w:line="60" w:lineRule="atLeast"/>
-                    <w:rPr>
-                      <w:rFonts w:ascii="Calibri" w:eastAsia="Times New Roman" w:hAnsi="Calibri" w:cs="Calibri"/>
-                      <w:sz w:val="6"/>
-                      <w:szCs w:val="6"/>
-                    </w:rPr>
-                  </w:pPr>
-                  <w:r>
-                    <w:rPr>
-                      <w:rFonts w:ascii="Calibri" w:eastAsia="Times New Roman" w:hAnsi="Calibri" w:cs="Calibri"/>
-                      <w:sz w:val="6"/>
-                      <w:szCs w:val="6"/>
-                    </w:rPr>
-                    <w:t> </w:t>
-                  </w:r>
-                </w:p>
-              </w:tc>
-              <w:tc>
-                <w:tcPr>
-                  <w:tcW w:w="700" w:type="pct"/>
-                  <w:shd w:val="clear" w:color="auto" w:fill="DDE3EA"/>
-                  <w:vAlign w:val="center"/>
-                  <w:hideMark/>
-                </w:tcPr>
-                <w:p>
-                  <w:pPr>
-                    <w:spacing w:line="60" w:lineRule="atLeast"/>
-                    <w:rPr>
-                      <w:rFonts w:ascii="Calibri" w:eastAsia="Times New Roman" w:hAnsi="Calibri" w:cs="Calibri"/>
-                      <w:sz w:val="6"/>
-                      <w:szCs w:val="6"/>
-                    </w:rPr>
-                  </w:pPr>
-                  <w:r>
-                    <w:rPr>
-                      <w:rFonts w:ascii="Calibri" w:eastAsia="Times New Roman" w:hAnsi="Calibri" w:cs="Calibri"/>
-                      <w:sz w:val="6"/>
-                      <w:szCs w:val="6"/>
-                    </w:rPr>
-                    <w:t> </w:t>
-                  </w:r>
-                </w:p>
-              </w:tc>
-            </w:tr>
-          </w:tbl>
-          <w:p>
-            <w:pPr>
-              <w:spacing w:before="120" w:after="120"/>
-              <w:rPr>
-                <w:rFonts w:ascii="Calibri" w:eastAsia="Times New Roman" w:hAnsi="Calibri" w:cs="Calibri"/>
-                <w:sz w:val="20"/>
-                <w:szCs w:val="20"/>
-              </w:rPr>
-            </w:pPr>
-            <w:r>
-              <w:rPr>
-                <w:rFonts w:ascii="Calibri" w:eastAsia="Times New Roman" w:hAnsi="Calibri" w:cs="Calibri"/>
-                <w:sz w:val="15"/>
-                <w:szCs w:val="15"/>
-              </w:rPr>
-              <w:t>86 %</w:t>
-            </w:r>
-          </w:p>
-        </w:tc>
-      </w:tr>
-      <w:tr>
-        <w:tc>
-          <w:tcPr>
-            <w:tcW w:w="0" w:type="auto"/>
-            <w:tcBorders>
-              <w:top w:val="single" w:sz="6" w:space="0" w:color="C9D3DE"/>
-              <w:left w:val="single" w:sz="6" w:space="0" w:color="C9D3DE"/>
-              <w:bottom w:val="single" w:sz="6" w:space="0" w:color="C9D3DE"/>
-              <w:right w:val="single" w:sz="6" w:space="0" w:color="C9D3DE"/>
-            </w:tcBorders>
-            <w:shd w:val="clear" w:color="auto" w:fill="FFF4E8"/>
-            <w:vAlign w:val="center"/>
-            <w:hideMark/>
-          </w:tcPr>
-          <w:p>
-            <w:pPr>
-              <w:spacing w:before="120" w:after="120"/>
-              <w:rPr>
-                <w:rFonts w:ascii="Calibri" w:eastAsia="Times New Roman" w:hAnsi="Calibri" w:cs="Calibri"/>
-                <w:sz w:val="20"/>
-                <w:szCs w:val="20"/>
-              </w:rPr>
-            </w:pPr>
-            <w:r>
-              <w:rPr>
-                <w:rFonts w:ascii="Calibri" w:eastAsia="Times New Roman" w:hAnsi="Calibri" w:cs="Calibri"/>
-                <w:b/>
-                <w:bCs/>
-                <w:color w:val="1F3A5F"/>
-                <w:sz w:val="20"/>
-                <w:szCs w:val="20"/>
-              </w:rPr>
-              <w:t>6</w:t>
-            </w:r>
-          </w:p>
-        </w:tc>
-        <w:tc>
-          <w:tcPr>
-            <w:tcW w:w="0" w:type="auto"/>
-            <w:tcBorders>
-              <w:top w:val="single" w:sz="6" w:space="0" w:color="C9D3DE"/>
-              <w:left w:val="single" w:sz="6" w:space="0" w:color="C9D3DE"/>
-              <w:bottom w:val="single" w:sz="6" w:space="0" w:color="C9D3DE"/>
-              <w:right w:val="single" w:sz="6" w:space="0" w:color="C9D3DE"/>
-            </w:tcBorders>
-            <w:shd w:val="clear" w:color="auto" w:fill="FFF4E8"/>
-            <w:vAlign w:val="center"/>
-            <w:hideMark/>
-          </w:tcPr>
-          <w:p>
-            <w:pPr>
-              <w:spacing w:before="120" w:after="120"/>
-              <w:rPr>
-                <w:rFonts w:ascii="Calibri" w:eastAsia="Times New Roman" w:hAnsi="Calibri" w:cs="Calibri"/>
-                <w:sz w:val="20"/>
-                <w:szCs w:val="20"/>
-              </w:rPr>
-            </w:pPr>
-            <w:r>
-              <w:rPr>
-                <w:rFonts w:ascii="Calibri" w:eastAsia="Times New Roman" w:hAnsi="Calibri" w:cs="Calibri"/>
-                <w:sz w:val="20"/>
-                <w:szCs w:val="20"/>
-              </w:rPr>
-              <w:t>Mise en ligne</w:t>
-            </w:r>
-          </w:p>
-        </w:tc>
-        <w:tc>
-          <w:tcPr>
-            <w:tcW w:w="0" w:type="auto"/>
-            <w:tcBorders>
-              <w:top w:val="single" w:sz="6" w:space="0" w:color="C9D3DE"/>
-              <w:left w:val="single" w:sz="6" w:space="0" w:color="C9D3DE"/>
-              <w:bottom w:val="single" w:sz="6" w:space="0" w:color="C9D3DE"/>
-              <w:right w:val="single" w:sz="6" w:space="0" w:color="C9D3DE"/>
-            </w:tcBorders>
-            <w:shd w:val="clear" w:color="auto" w:fill="FFF4E8"/>
-            <w:vAlign w:val="center"/>
-            <w:hideMark/>
-          </w:tcPr>
-          <w:p>
-            <w:pPr>
-              <w:spacing w:before="120" w:after="120"/>
-              <w:rPr>
-                <w:rFonts w:ascii="Calibri" w:eastAsia="Times New Roman" w:hAnsi="Calibri" w:cs="Calibri"/>
-                <w:sz w:val="20"/>
-                <w:szCs w:val="20"/>
-              </w:rPr>
-            </w:pPr>
-            <w:r>
-              <w:rPr>
-                <w:rFonts w:ascii="Calibri" w:eastAsia="Times New Roman" w:hAnsi="Calibri" w:cs="Calibri"/>
-                <w:sz w:val="20"/>
-                <w:szCs w:val="20"/>
-              </w:rPr>
-              <w:t>Plateforme en ligne et prise en main</w:t>
-            </w:r>
-          </w:p>
-        </w:tc>
-        <w:tc>
-          <w:tcPr>
-            <w:tcW w:w="0" w:type="auto"/>
-            <w:tcBorders>
-              <w:top w:val="single" w:sz="6" w:space="0" w:color="C9D3DE"/>
-              <w:left w:val="single" w:sz="6" w:space="0" w:color="C9D3DE"/>
-              <w:bottom w:val="single" w:sz="6" w:space="0" w:color="C9D3DE"/>
-              <w:right w:val="single" w:sz="6" w:space="0" w:color="C9D3DE"/>
-            </w:tcBorders>
-            <w:shd w:val="clear" w:color="auto" w:fill="FFF4E8"/>
-            <w:vAlign w:val="center"/>
-            <w:hideMark/>
-          </w:tcPr>
-          <w:p>
-            <w:pPr>
-              <w:spacing w:before="120" w:after="120"/>
-              <w:rPr>
-                <w:rFonts w:ascii="Calibri" w:eastAsia="Times New Roman" w:hAnsi="Calibri" w:cs="Calibri"/>
-                <w:sz w:val="20"/>
-                <w:szCs w:val="20"/>
-              </w:rPr>
-            </w:pPr>
-            <w:r>
-              <w:rPr>
-                <w:rFonts w:ascii="Calibri" w:eastAsia="Times New Roman" w:hAnsi="Calibri" w:cs="Calibri"/>
-                <w:b/>
-                <w:bCs/>
-                <w:sz w:val="20"/>
-                <w:szCs w:val="20"/>
-              </w:rPr>
-              <w:t>50 000</w:t>
+              <w:t>75 000</w:t>
             </w:r>
           </w:p>
         </w:tc>
@@ -9315,7 +8705,7 @@
                 <w:sz w:val="20"/>
                 <w:szCs w:val="20"/>
               </w:rPr>
-              <w:t xml:space="preserve">Le projet démarre à la réception de l'acompte de 50 000 FCFA, avec la semaine de préparation. Les 4 semaines de développement commencent dès que j'ai reçu l'ensemble des éléments demandés (voir section 12).</w:t>
+              <w:t xml:space="preserve">Le projet démarre à la réception de l'acompte de 50 000 FCFA : aucune action n'est engagée avant ce versement. L'acompte ouvre la semaine de préparation (voir section 12 et annexe). Les 4 semaines de développement ne commencent que lorsque j'ai reçu l'ensemble des éléments de l'annexe et que l'analyse est terminée.</w:t>
             </w:r>
           </w:p>
         </w:tc>
@@ -9351,7 +8741,7 @@
                 <w:sz w:val="20"/>
                 <w:szCs w:val="20"/>
               </w:rPr>
-              <w:t xml:space="preserve">Paiements de fin de semaine (4 × 40 000)</w:t>
+              <w:t xml:space="preserve">Paiements de fin de semaine (4 × 75 000)</w:t>
             </w:r>
           </w:p>
         </w:tc>
@@ -9382,7 +8772,7 @@
                 <w:sz w:val="20"/>
                 <w:szCs w:val="20"/>
               </w:rPr>
-              <w:t xml:space="preserve">Chaque paiement est dû à la présentation de fin de semaine. Si vous trouvez une erreur dans les 3 jours, je la corrige sans coût supplémentaire. La semaine suivante démarre à réception du paiement.</w:t>
+              <w:t xml:space="preserve">Chaque paiement de 75 000 FCFA est dû le jour de la présentation de fin de semaine, quand je vous montre le résultat de la semaine. Si vous trouvez une erreur dans les 3 jours, je la corrige sans coût supplémentaire. La semaine suivante démarre à réception du paiement.</w:t>
             </w:r>
           </w:p>
         </w:tc>
@@ -9418,38 +8808,38 @@
                 <w:sz w:val="20"/>
                 <w:szCs w:val="20"/>
               </w:rPr>
-              <w:t>Validation finale (90 000)</w:t>
-            </w:r>
-          </w:p>
-        </w:tc>
-        <w:tc>
-          <w:tcPr>
-            <w:tcW w:w="0" w:type="auto"/>
-            <w:tcBorders>
-              <w:top w:val="single" w:sz="6" w:space="0" w:color="C9D3DE"/>
-              <w:left w:val="single" w:sz="6" w:space="0" w:color="C9D3DE"/>
-              <w:bottom w:val="single" w:sz="6" w:space="0" w:color="C9D3DE"/>
-              <w:right w:val="single" w:sz="6" w:space="0" w:color="C9D3DE"/>
-            </w:tcBorders>
-            <w:shd w:val="clear" w:color="auto" w:fill="FFFFFF"/>
-            <w:hideMark/>
-          </w:tcPr>
-          <w:p>
-            <w:pPr>
-              <w:spacing w:before="120" w:after="120"/>
-              <w:rPr>
-                <w:rFonts w:ascii="Calibri" w:eastAsia="Times New Roman" w:hAnsi="Calibri" w:cs="Calibri"/>
-                <w:sz w:val="20"/>
-                <w:szCs w:val="20"/>
-              </w:rPr>
-            </w:pPr>
-            <w:r>
-              <w:rPr>
-                <w:rFonts w:ascii="Calibri" w:eastAsia="Times New Roman" w:hAnsi="Calibri" w:cs="Calibri"/>
-                <w:sz w:val="20"/>
-                <w:szCs w:val="20"/>
-              </w:rPr>
-              <w:t xml:space="preserve">Due quand vous validez l'ensemble de la plateforme, ou 5 jours après la présentation de fin de semaine 4 si vous n'avez signalé aucune anomalie</w:t>
+              <w:t>Validation finale</w:t>
+            </w:r>
+          </w:p>
+        </w:tc>
+        <w:tc>
+          <w:tcPr>
+            <w:tcW w:w="0" w:type="auto"/>
+            <w:tcBorders>
+              <w:top w:val="single" w:sz="6" w:space="0" w:color="C9D3DE"/>
+              <w:left w:val="single" w:sz="6" w:space="0" w:color="C9D3DE"/>
+              <w:bottom w:val="single" w:sz="6" w:space="0" w:color="C9D3DE"/>
+              <w:right w:val="single" w:sz="6" w:space="0" w:color="C9D3DE"/>
+            </w:tcBorders>
+            <w:shd w:val="clear" w:color="auto" w:fill="FFFFFF"/>
+            <w:hideMark/>
+          </w:tcPr>
+          <w:p>
+            <w:pPr>
+              <w:spacing w:before="120" w:after="120"/>
+              <w:rPr>
+                <w:rFonts w:ascii="Calibri" w:eastAsia="Times New Roman" w:hAnsi="Calibri" w:cs="Calibri"/>
+                <w:sz w:val="20"/>
+                <w:szCs w:val="20"/>
+              </w:rPr>
+            </w:pPr>
+            <w:r>
+              <w:rPr>
+                <w:rFonts w:ascii="Calibri" w:eastAsia="Times New Roman" w:hAnsi="Calibri" w:cs="Calibri"/>
+                <w:sz w:val="20"/>
+                <w:szCs w:val="20"/>
+              </w:rPr>
+              <w:t xml:space="preserve">Après la semaine 4, vous disposez de 5 jours pour vérifier l'ensemble de la plateforme sur le site de démonstration. Aucun paiement supplémentaire n'est dû : le prix total est soldé à la fin de la semaine 4.</w:t>
             </w:r>
           </w:p>
         </w:tc>
@@ -9485,7 +8875,7 @@
                 <w:sz w:val="20"/>
                 <w:szCs w:val="20"/>
               </w:rPr>
-              <w:t>Mise en ligne (50 000)</w:t>
+              <w:t>Mise en ligne</w:t>
             </w:r>
           </w:p>
         </w:tc>
@@ -9516,25 +8906,25 @@
                 <w:sz w:val="20"/>
                 <w:szCs w:val="20"/>
               </w:rPr>
-              <w:t xml:space="preserve">Due le jour de la mise en ligne. Si elle est retardée parce que votre hébergement ou vos comptes ne sont pas prêts, ce montant est dû </w:t>
-            </w:r>
-            <w:r>
-              <w:rPr>
-                <w:rFonts w:ascii="Calibri" w:eastAsia="Times New Roman" w:hAnsi="Calibri" w:cs="Calibri"/>
-                <w:b/>
-                <w:bCs/>
-                <w:sz w:val="20"/>
-                <w:szCs w:val="20"/>
-              </w:rPr>
-              <w:t xml:space="preserve">30 jours après la validation finale</w:t>
-            </w:r>
-            <w:r>
-              <w:rPr>
-                <w:rFonts w:ascii="Calibri" w:eastAsia="Times New Roman" w:hAnsi="Calibri" w:cs="Calibri"/>
-                <w:sz w:val="20"/>
-                <w:szCs w:val="20"/>
-              </w:rPr>
-              <w:t xml:space="preserve">, car la plateforme est alors considérée comme livrée. Ce montant est le prix de mon travail d'installation : il ne comprend ni l'hébergement ni le nom de domaine (voir section 10).</w:t>
+              <w:t xml:space="preserve">Incluse dans le prix total. La mise en ligne consiste à préparer l'environnement de mise en ligne de la plateforme. Elle est engagée une fois que vous avez réglé la somme de l'hébergement et du nom de domaine que je vous ai indiqués, et que vous m'avez donné les accès (section 10). Elle a lieu à la date de votre choix. L'hébergement et le nom de domaine ne sont pas compris dans les 350 000 FCFA : ils sont payés directement aux fournisseurs.</w:t>
+            </w:r>
+            <w:r>
+              <w:rPr>
+                <w:rFonts w:ascii="Calibri" w:eastAsia="Times New Roman" w:hAnsi="Calibri" w:cs="Calibri"/>
+                <w:b/>
+                <w:bCs/>
+                <w:sz w:val="20"/>
+                <w:szCs w:val="20"/>
+              </w:rPr>
+              <w:t xml:space="preserve"/>
+            </w:r>
+            <w:r>
+              <w:rPr>
+                <w:rFonts w:ascii="Calibri" w:eastAsia="Times New Roman" w:hAnsi="Calibri" w:cs="Calibri"/>
+                <w:sz w:val="20"/>
+                <w:szCs w:val="20"/>
+              </w:rPr>
+              <w:t xml:space="preserve"/>
             </w:r>
           </w:p>
         </w:tc>
@@ -9601,7 +8991,7 @@
                 <w:sz w:val="20"/>
                 <w:szCs w:val="20"/>
               </w:rPr>
-              <w:t>Remis après le paiement du dernier montant</w:t>
+              <w:t>Remis après le paiement du dernier montant (fin de semaine 4), au moment de la mise en ligne</w:t>
             </w:r>
           </w:p>
         </w:tc>
@@ -9747,15 +9137,15 @@
                 <w:sz w:val="21"/>
                 <w:szCs w:val="21"/>
               </w:rPr>
-              <w:t>L'hébergement n'est pas géré par le prestataire.</w:t>
-            </w:r>
-            <w:r>
-              <w:rPr>
-                <w:rFonts w:ascii="Calibri" w:eastAsia="Times New Roman" w:hAnsi="Calibri" w:cs="Calibri"/>
-                <w:sz w:val="21"/>
-                <w:szCs w:val="21"/>
-              </w:rPr>
-              <w:t xml:space="preserve"> L'hébergement est l'espace sur internet où la plateforme est installée. Vous le choisissez, l'achetez et le gérez à vos frais. Je vous indiquerai précisément ce qu'il faut acheter et j'installerai la plateforme dessus.</w:t>
+              <w:t xml:space="preserve">L'hébergement n'est pas géré par le prestataire. L'hébergement est l'espace sur internet où la plateforme est installée. Vous le choisissez, l'achetez et le gérez à vos frais. Je vous indiquerai précisément ce qu'il faut acheter et la somme à prévoir. Une fois cette somme réglée par vous et les accès transmis, je prépare l'environnement de mise en ligne et j'y installe la plateforme : c'est en cela que consiste la mise en ligne.</w:t>
+            </w:r>
+            <w:r>
+              <w:rPr>
+                <w:rFonts w:ascii="Calibri" w:eastAsia="Times New Roman" w:hAnsi="Calibri" w:cs="Calibri"/>
+                <w:sz w:val="21"/>
+                <w:szCs w:val="21"/>
+              </w:rPr>
+              <w:t xml:space="preserve"/>
             </w:r>
           </w:p>
         </w:tc>
@@ -10341,7 +9731,7 @@
           <w:sz w:val="21"/>
           <w:szCs w:val="21"/>
         </w:rPr>
-        <w:t xml:space="preserve"> et n'est pas le paiement de mise en ligne de 50 000 FCFA prévu en 9.2. Il peut varier selon les tarifs du moment et la demande auprès des fournisseurs d'hébergement.</w:t>
+        <w:t xml:space="preserve"> et ne remplace aucun des paiements prévus en 9.2. Il peut varier selon les tarifs du moment et la demande auprès des fournisseurs d'hébergement.</w:t>
       </w:r>
     </w:p>
     <w:p>
@@ -11367,7 +10757,7 @@
                 <w:sz w:val="20"/>
                 <w:szCs w:val="20"/>
               </w:rPr>
-              <w:t xml:space="preserve">Dans la semaine qui suit la validation de ce cahier des charges : tous les documents, accès et informations nécessaires (textes, logo, images, vidéos, accès à vos comptes, etc.). Cette semaine de préparation n'est pas comprise dans les 4 semaines de développement : elle me permet de tout analyser pour bien organiser le travail. Si ces éléments arrivent en retard, le planning est décalé d'autant, et les paiements prévus ne changent pas.</w:t>
+              <w:t xml:space="preserve">Dans les 7 jours qui suivent la validation de ce cahier des charges et le versement de l'acompte : tous les documents, accès et informations listés dans l'annexe (textes, logo, images, vidéos, accès à vos comptes, etc.). Cette semaine de préparation n'est pas comprise dans les 4 semaines de développement : elle me permet de tout analyser et de vous signaler ce qui manque. Le développement commence dès que le dossier est complet. Si des éléments arrivent en retard, le planning est décalé d'autant, et les paiements prévus ne changent pas.</w:t>
             </w:r>
           </w:p>
         </w:tc>
@@ -11403,7 +10793,7 @@
                 <w:sz w:val="20"/>
                 <w:szCs w:val="20"/>
               </w:rPr>
-              <w:t>Garantie</w:t>
+              <w:t xml:space="preserve">Observation et maintenance</w:t>
             </w:r>
           </w:p>
         </w:tc>
@@ -11434,7 +10824,7 @@
                 <w:sz w:val="20"/>
                 <w:szCs w:val="20"/>
               </w:rPr>
-              <w:t>Après la mise en ligne, je corrige gratuitement les erreurs pendant 30 jours. Ensuite, un suivi mensuel est proposé en option.</w:t>
+              <w:t xml:space="preserve">Après la mise en ligne, le site est observé pendant 2 semaines pour vérifier son bon fonctionnement. Si des erreurs apparaissent pendant ces 2 semaines, je les corrige gratuitement. Passé ce délai, la maintenance (corrections, mises à jour, suivi) fait l'objet d'un devis séparé.</w:t>
             </w:r>
           </w:p>
         </w:tc>
@@ -11821,6 +11211,3833 @@
           <w:rFonts w:eastAsia="Times New Roman"/>
         </w:rPr>
       </w:pPr>
+    </w:p>
+    <w:p>
+      <w:pPr>
+        <w:pStyle w:val="Titre1"/>
+        <w:pageBreakBefore/>
+        <w:pBdr>
+          <w:bottom w:val="single" w:sz="18" w:space="3" w:color="E8833A"/>
+        </w:pBdr>
+        <w:spacing w:before="400" w:beforeAutospacing="0" w:after="120" w:afterAutospacing="0"/>
+        <w:rPr>
+          <w:rFonts w:ascii="Calibri" w:eastAsia="Times New Roman" w:hAnsi="Calibri" w:cs="Calibri"/>
+          <w:color w:val="1F3A5F"/>
+          <w:sz w:val="36"/>
+          <w:szCs w:val="36"/>
+        </w:rPr>
+      </w:pPr>
+      <w:r>
+        <w:rPr>
+          <w:rFonts w:ascii="Calibri" w:eastAsia="Times New Roman" w:hAnsi="Calibri" w:cs="Calibri"/>
+          <w:color w:val="1F3A5F"/>
+          <w:sz w:val="36"/>
+          <w:szCs w:val="36"/>
+        </w:rPr>
+        <w:t xml:space="preserve">Annexe : ce que vous devez me remettre avant le démarrage</w:t>
+      </w:r>
+    </w:p>
+    <w:p>
+      <w:pPr>
+        <w:pStyle w:val="NormalWeb"/>
+        <w:spacing w:beforeAutospacing="0" w:afterAutospacing="0" w:line="324" w:lineRule="auto"/>
+        <w:rPr>
+          <w:rFonts w:ascii="Calibri" w:hAnsi="Calibri" w:cs="Calibri"/>
+          <w:sz w:val="21"/>
+          <w:szCs w:val="21"/>
+        </w:rPr>
+      </w:pPr>
+      <w:r>
+        <w:rPr>
+          <w:rFonts w:ascii="Calibri" w:hAnsi="Calibri" w:cs="Calibri"/>
+          <w:sz w:val="21"/>
+          <w:szCs w:val="21"/>
+        </w:rPr>
+        <w:t xml:space="preserve">Ces éléments sont à me remettre dans les 7 jours qui suivent la validation de ce cahier des charges et le versement de l'acompte. Pendant cette semaine de préparation, j'analyse tout et je vous signale ce qui manque. Le développement commence quand le dossier est complet. Un élément manquant ou en retard décale le planning d'autant, sans changer les paiements prévus.</w:t>
+      </w:r>
+    </w:p>
+    <w:p>
+      <w:pPr>
+        <w:pStyle w:val="Titre2"/>
+        <w:spacing w:before="240" w:beforeAutospacing="0" w:after="80" w:afterAutospacing="0"/>
+        <w:rPr>
+          <w:rFonts w:ascii="Calibri" w:eastAsia="Times New Roman" w:hAnsi="Calibri" w:cs="Calibri"/>
+          <w:color w:val="E8833A"/>
+          <w:sz w:val="26"/>
+          <w:szCs w:val="26"/>
+        </w:rPr>
+      </w:pPr>
+      <w:r>
+        <w:rPr>
+          <w:rFonts w:ascii="Calibri" w:eastAsia="Times New Roman" w:hAnsi="Calibri" w:cs="Calibri"/>
+          <w:color w:val="E8833A"/>
+          <w:sz w:val="26"/>
+          <w:szCs w:val="26"/>
+        </w:rPr>
+        <w:t xml:space="preserve">1. Votre entreprise et les documents légaux</w:t>
+      </w:r>
+    </w:p>
+    <w:tbl>
+      <w:tblPr>
+        <w:tblW w:w="5000" w:type="pct"/>
+        <w:tblCellMar>
+          <w:top w:w="60" w:type="dxa"/>
+          <w:left w:w="60" w:type="dxa"/>
+          <w:bottom w:w="60" w:type="dxa"/>
+          <w:right w:w="60" w:type="dxa"/>
+        </w:tblCellMar>
+        <w:tblLook w:val="04A0" w:firstRow="1" w:lastRow="0" w:firstColumn="1" w:lastColumn="0" w:noHBand="0" w:noVBand="1"/>
+      </w:tblPr>
+      <w:tblGrid>
+        <w:gridCol w:w="2364"/>
+        <w:gridCol w:w="7485"/>
+      </w:tblGrid>
+      <w:tr>
+        <w:tc>
+          <w:tcPr>
+            <w:tcW w:w="1200" w:type="pct"/>
+            <w:tcBorders>
+              <w:top w:val="single" w:sz="6" w:space="0" w:color="1F3A5F"/>
+              <w:left w:val="single" w:sz="6" w:space="0" w:color="1F3A5F"/>
+              <w:bottom w:val="single" w:sz="6" w:space="0" w:color="1F3A5F"/>
+              <w:right w:val="single" w:sz="6" w:space="0" w:color="1F3A5F"/>
+            </w:tcBorders>
+            <w:shd w:val="clear" w:color="auto" w:fill="1F3A5F"/>
+            <w:vAlign w:val="center"/>
+            <w:hideMark/>
+          </w:tcPr>
+          <w:p>
+            <w:pPr>
+              <w:spacing w:before="120" w:after="120"/>
+              <w:rPr>
+                <w:rFonts w:ascii="Calibri" w:eastAsia="Times New Roman" w:hAnsi="Calibri" w:cs="Calibri"/>
+                <w:sz w:val="21"/>
+                <w:szCs w:val="21"/>
+              </w:rPr>
+            </w:pPr>
+            <w:r>
+              <w:rPr>
+                <w:rFonts w:ascii="Calibri" w:eastAsia="Times New Roman" w:hAnsi="Calibri" w:cs="Calibri"/>
+                <w:b/>
+                <w:bCs/>
+                <w:color w:val="FFFFFF"/>
+                <w:sz w:val="21"/>
+                <w:szCs w:val="21"/>
+              </w:rPr>
+              <w:t>Élément à fournir</w:t>
+            </w:r>
+          </w:p>
+        </w:tc>
+        <w:tc>
+          <w:tcPr>
+            <w:tcW w:w="3800" w:type="pct"/>
+            <w:tcBorders>
+              <w:top w:val="single" w:sz="6" w:space="0" w:color="1F3A5F"/>
+              <w:left w:val="single" w:sz="6" w:space="0" w:color="1F3A5F"/>
+              <w:bottom w:val="single" w:sz="6" w:space="0" w:color="1F3A5F"/>
+              <w:right w:val="single" w:sz="6" w:space="0" w:color="1F3A5F"/>
+            </w:tcBorders>
+            <w:shd w:val="clear" w:color="auto" w:fill="1F3A5F"/>
+            <w:vAlign w:val="center"/>
+            <w:hideMark/>
+          </w:tcPr>
+          <w:p>
+            <w:pPr>
+              <w:spacing w:before="120" w:after="120"/>
+              <w:rPr>
+                <w:rFonts w:ascii="Calibri" w:eastAsia="Times New Roman" w:hAnsi="Calibri" w:cs="Calibri"/>
+                <w:sz w:val="21"/>
+                <w:szCs w:val="21"/>
+              </w:rPr>
+            </w:pPr>
+            <w:r>
+              <w:rPr>
+                <w:rFonts w:ascii="Calibri" w:eastAsia="Times New Roman" w:hAnsi="Calibri" w:cs="Calibri"/>
+                <w:b/>
+                <w:bCs/>
+                <w:color w:val="FFFFFF"/>
+                <w:sz w:val="21"/>
+                <w:szCs w:val="21"/>
+              </w:rPr>
+              <w:t>Précision</w:t>
+            </w:r>
+          </w:p>
+        </w:tc>
+      </w:tr>
+      <w:tr>
+        <w:tc>
+          <w:tcPr>
+            <w:tcW w:w="0" w:type="auto"/>
+            <w:tcBorders>
+              <w:top w:val="single" w:sz="6" w:space="0" w:color="C9D3DE"/>
+              <w:left w:val="single" w:sz="6" w:space="0" w:color="C9D3DE"/>
+              <w:bottom w:val="single" w:sz="6" w:space="0" w:color="C9D3DE"/>
+              <w:right w:val="single" w:sz="6" w:space="0" w:color="C9D3DE"/>
+            </w:tcBorders>
+            <w:shd w:val="clear" w:color="auto" w:fill="FFFFFF"/>
+            <w:hideMark/>
+          </w:tcPr>
+          <w:p>
+            <w:pPr>
+              <w:spacing w:before="120" w:after="120"/>
+              <w:rPr>
+                <w:rFonts w:ascii="Calibri" w:eastAsia="Times New Roman" w:hAnsi="Calibri" w:cs="Calibri"/>
+                <w:sz w:val="20"/>
+                <w:szCs w:val="20"/>
+              </w:rPr>
+            </w:pPr>
+            <w:r>
+              <w:rPr>
+                <w:rFonts w:ascii="Calibri" w:eastAsia="Times New Roman" w:hAnsi="Calibri" w:cs="Calibri"/>
+                <w:b/>
+                <w:bCs/>
+                <w:color w:val="1F3A5F"/>
+                <w:sz w:val="20"/>
+                <w:szCs w:val="20"/>
+              </w:rPr>
+              <w:t>Identité de l'entreprise</w:t>
+            </w:r>
+          </w:p>
+        </w:tc>
+        <w:tc>
+          <w:tcPr>
+            <w:tcW w:w="0" w:type="auto"/>
+            <w:tcBorders>
+              <w:top w:val="single" w:sz="6" w:space="0" w:color="C9D3DE"/>
+              <w:left w:val="single" w:sz="6" w:space="0" w:color="C9D3DE"/>
+              <w:bottom w:val="single" w:sz="6" w:space="0" w:color="C9D3DE"/>
+              <w:right w:val="single" w:sz="6" w:space="0" w:color="C9D3DE"/>
+            </w:tcBorders>
+            <w:shd w:val="clear" w:color="auto" w:fill="FFFFFF"/>
+            <w:hideMark/>
+          </w:tcPr>
+          <w:p>
+            <w:pPr>
+              <w:spacing w:before="120" w:after="120"/>
+              <w:rPr>
+                <w:rFonts w:ascii="Calibri" w:eastAsia="Times New Roman" w:hAnsi="Calibri" w:cs="Calibri"/>
+                <w:sz w:val="20"/>
+                <w:szCs w:val="20"/>
+              </w:rPr>
+            </w:pPr>
+            <w:r>
+              <w:rPr>
+                <w:rFonts w:ascii="Calibri" w:eastAsia="Times New Roman" w:hAnsi="Calibri" w:cs="Calibri"/>
+                <w:sz w:val="20"/>
+                <w:szCs w:val="20"/>
+              </w:rPr>
+              <w:t>Nom commercial, raison sociale, adresse, téléphone, email de contact, numéros d'enregistrement à faire figurer sur les factures (NINEA, RCCM ou équivalent)</w:t>
+            </w:r>
+          </w:p>
+        </w:tc>
+      </w:tr>
+      <w:tr>
+        <w:tc>
+          <w:tcPr>
+            <w:tcW w:w="0" w:type="auto"/>
+            <w:tcBorders>
+              <w:top w:val="single" w:sz="6" w:space="0" w:color="C9D3DE"/>
+              <w:left w:val="single" w:sz="6" w:space="0" w:color="C9D3DE"/>
+              <w:bottom w:val="single" w:sz="6" w:space="0" w:color="C9D3DE"/>
+              <w:right w:val="single" w:sz="6" w:space="0" w:color="C9D3DE"/>
+            </w:tcBorders>
+            <w:shd w:val="clear" w:color="auto" w:fill="FFFFFF"/>
+            <w:hideMark/>
+          </w:tcPr>
+          <w:p>
+            <w:pPr>
+              <w:spacing w:before="120" w:after="120"/>
+              <w:rPr>
+                <w:rFonts w:ascii="Calibri" w:eastAsia="Times New Roman" w:hAnsi="Calibri" w:cs="Calibri"/>
+                <w:sz w:val="20"/>
+                <w:szCs w:val="20"/>
+              </w:rPr>
+            </w:pPr>
+            <w:r>
+              <w:rPr>
+                <w:rFonts w:ascii="Calibri" w:eastAsia="Times New Roman" w:hAnsi="Calibri" w:cs="Calibri"/>
+                <w:b/>
+                <w:bCs/>
+                <w:color w:val="1F3A5F"/>
+                <w:sz w:val="20"/>
+                <w:szCs w:val="20"/>
+              </w:rPr>
+              <w:t xml:space="preserve">Adresse email du client</w:t>
+            </w:r>
+          </w:p>
+        </w:tc>
+        <w:tc>
+          <w:tcPr>
+            <w:tcW w:w="0" w:type="auto"/>
+            <w:tcBorders>
+              <w:top w:val="single" w:sz="6" w:space="0" w:color="C9D3DE"/>
+              <w:left w:val="single" w:sz="6" w:space="0" w:color="C9D3DE"/>
+              <w:bottom w:val="single" w:sz="6" w:space="0" w:color="C9D3DE"/>
+              <w:right w:val="single" w:sz="6" w:space="0" w:color="C9D3DE"/>
+            </w:tcBorders>
+            <w:shd w:val="clear" w:color="auto" w:fill="FFFFFF"/>
+            <w:hideMark/>
+          </w:tcPr>
+          <w:p>
+            <w:pPr>
+              <w:spacing w:before="120" w:after="120"/>
+              <w:rPr>
+                <w:rFonts w:ascii="Calibri" w:eastAsia="Times New Roman" w:hAnsi="Calibri" w:cs="Calibri"/>
+                <w:sz w:val="20"/>
+                <w:szCs w:val="20"/>
+              </w:rPr>
+            </w:pPr>
+            <w:r>
+              <w:rPr>
+                <w:rFonts w:ascii="Calibri" w:eastAsia="Times New Roman" w:hAnsi="Calibri" w:cs="Calibri"/>
+                <w:sz w:val="20"/>
+                <w:szCs w:val="20"/>
+              </w:rPr>
+              <w:t xml:space="preserve">Adresse email principale du client (et de chaque personne à qui envoyer les accès, factures et notifications). Elle sert à toutes les communications du projet et à créer son compte administrateur.</w:t>
+            </w:r>
+          </w:p>
+        </w:tc>
+      </w:tr>
+      <w:tr>
+        <w:tc>
+          <w:tcPr>
+            <w:tcW w:w="0" w:type="auto"/>
+            <w:tcBorders>
+              <w:top w:val="single" w:sz="6" w:space="0" w:color="C9D3DE"/>
+              <w:left w:val="single" w:sz="6" w:space="0" w:color="C9D3DE"/>
+              <w:bottom w:val="single" w:sz="6" w:space="0" w:color="C9D3DE"/>
+              <w:right w:val="single" w:sz="6" w:space="0" w:color="C9D3DE"/>
+            </w:tcBorders>
+            <w:shd w:val="clear" w:color="auto" w:fill="FFFFFF"/>
+            <w:hideMark/>
+          </w:tcPr>
+          <w:p>
+            <w:pPr>
+              <w:spacing w:before="120" w:after="120"/>
+              <w:rPr>
+                <w:rFonts w:ascii="Calibri" w:eastAsia="Times New Roman" w:hAnsi="Calibri" w:cs="Calibri"/>
+                <w:sz w:val="20"/>
+                <w:szCs w:val="20"/>
+              </w:rPr>
+            </w:pPr>
+            <w:r>
+              <w:rPr>
+                <w:rFonts w:ascii="Calibri" w:eastAsia="Times New Roman" w:hAnsi="Calibri" w:cs="Calibri"/>
+                <w:b/>
+                <w:bCs/>
+                <w:color w:val="1F3A5F"/>
+                <w:sz w:val="20"/>
+                <w:szCs w:val="20"/>
+              </w:rPr>
+              <w:t>Textes légaux</w:t>
+            </w:r>
+          </w:p>
+        </w:tc>
+        <w:tc>
+          <w:tcPr>
+            <w:tcW w:w="0" w:type="auto"/>
+            <w:tcBorders>
+              <w:top w:val="single" w:sz="6" w:space="0" w:color="C9D3DE"/>
+              <w:left w:val="single" w:sz="6" w:space="0" w:color="C9D3DE"/>
+              <w:bottom w:val="single" w:sz="6" w:space="0" w:color="C9D3DE"/>
+              <w:right w:val="single" w:sz="6" w:space="0" w:color="C9D3DE"/>
+            </w:tcBorders>
+            <w:shd w:val="clear" w:color="auto" w:fill="FFFFFF"/>
+            <w:hideMark/>
+          </w:tcPr>
+          <w:p>
+            <w:pPr>
+              <w:spacing w:before="120" w:after="120"/>
+              <w:rPr>
+                <w:rFonts w:ascii="Calibri" w:eastAsia="Times New Roman" w:hAnsi="Calibri" w:cs="Calibri"/>
+                <w:sz w:val="20"/>
+                <w:szCs w:val="20"/>
+              </w:rPr>
+            </w:pPr>
+            <w:r>
+              <w:rPr>
+                <w:rFonts w:ascii="Calibri" w:eastAsia="Times New Roman" w:hAnsi="Calibri" w:cs="Calibri"/>
+                <w:sz w:val="20"/>
+                <w:szCs w:val="20"/>
+              </w:rPr>
+              <w:t>Conditions générales de vente, politique de confidentialité, mentions légales, conditions de retour et de remboursement. Si vous n'en avez pas, vous devez les faire rédiger ou me confirmer que je dois utiliser un modèle.</w:t>
+            </w:r>
+          </w:p>
+        </w:tc>
+      </w:tr>
+      <w:tr>
+        <w:tc>
+          <w:tcPr>
+            <w:tcW w:w="0" w:type="auto"/>
+            <w:tcBorders>
+              <w:top w:val="single" w:sz="6" w:space="0" w:color="C9D3DE"/>
+              <w:left w:val="single" w:sz="6" w:space="0" w:color="C9D3DE"/>
+              <w:bottom w:val="single" w:sz="6" w:space="0" w:color="C9D3DE"/>
+              <w:right w:val="single" w:sz="6" w:space="0" w:color="C9D3DE"/>
+            </w:tcBorders>
+            <w:shd w:val="clear" w:color="auto" w:fill="FFFFFF"/>
+            <w:hideMark/>
+          </w:tcPr>
+          <w:p>
+            <w:pPr>
+              <w:spacing w:before="120" w:after="120"/>
+              <w:rPr>
+                <w:rFonts w:ascii="Calibri" w:eastAsia="Times New Roman" w:hAnsi="Calibri" w:cs="Calibri"/>
+                <w:sz w:val="20"/>
+                <w:szCs w:val="20"/>
+              </w:rPr>
+            </w:pPr>
+            <w:r>
+              <w:rPr>
+                <w:rFonts w:ascii="Calibri" w:eastAsia="Times New Roman" w:hAnsi="Calibri" w:cs="Calibri"/>
+                <w:b/>
+                <w:bCs/>
+                <w:color w:val="1F3A5F"/>
+                <w:sz w:val="20"/>
+                <w:szCs w:val="20"/>
+              </w:rPr>
+              <w:t>Personne référente</w:t>
+            </w:r>
+          </w:p>
+        </w:tc>
+        <w:tc>
+          <w:tcPr>
+            <w:tcW w:w="0" w:type="auto"/>
+            <w:tcBorders>
+              <w:top w:val="single" w:sz="6" w:space="0" w:color="C9D3DE"/>
+              <w:left w:val="single" w:sz="6" w:space="0" w:color="C9D3DE"/>
+              <w:bottom w:val="single" w:sz="6" w:space="0" w:color="C9D3DE"/>
+              <w:right w:val="single" w:sz="6" w:space="0" w:color="C9D3DE"/>
+            </w:tcBorders>
+            <w:shd w:val="clear" w:color="auto" w:fill="FFFFFF"/>
+            <w:hideMark/>
+          </w:tcPr>
+          <w:p>
+            <w:pPr>
+              <w:spacing w:before="120" w:after="120"/>
+              <w:rPr>
+                <w:rFonts w:ascii="Calibri" w:eastAsia="Times New Roman" w:hAnsi="Calibri" w:cs="Calibri"/>
+                <w:sz w:val="20"/>
+                <w:szCs w:val="20"/>
+              </w:rPr>
+            </w:pPr>
+            <w:r>
+              <w:rPr>
+                <w:rFonts w:ascii="Calibri" w:eastAsia="Times New Roman" w:hAnsi="Calibri" w:cs="Calibri"/>
+                <w:sz w:val="20"/>
+                <w:szCs w:val="20"/>
+              </w:rPr>
+              <w:t>Nom, téléphone et email de la personne qui répond à mes questions et valide les jalons, ainsi que ses jours et horaires de disponibilité</w:t>
+            </w:r>
+          </w:p>
+        </w:tc>
+      </w:tr>
+      <w:tr>
+        <w:tc>
+          <w:tcPr>
+            <w:tcW w:w="0" w:type="auto"/>
+            <w:tcBorders>
+              <w:top w:val="single" w:sz="6" w:space="0" w:color="C9D3DE"/>
+              <w:left w:val="single" w:sz="6" w:space="0" w:color="C9D3DE"/>
+              <w:bottom w:val="single" w:sz="6" w:space="0" w:color="C9D3DE"/>
+              <w:right w:val="single" w:sz="6" w:space="0" w:color="C9D3DE"/>
+            </w:tcBorders>
+            <w:shd w:val="clear" w:color="auto" w:fill="FFFFFF"/>
+            <w:hideMark/>
+          </w:tcPr>
+          <w:p>
+            <w:pPr>
+              <w:spacing w:before="120" w:after="120"/>
+              <w:rPr>
+                <w:rFonts w:ascii="Calibri" w:eastAsia="Times New Roman" w:hAnsi="Calibri" w:cs="Calibri"/>
+                <w:sz w:val="20"/>
+                <w:szCs w:val="20"/>
+              </w:rPr>
+            </w:pPr>
+            <w:r>
+              <w:rPr>
+                <w:rFonts w:ascii="Calibri" w:eastAsia="Times New Roman" w:hAnsi="Calibri" w:cs="Calibri"/>
+                <w:b/>
+                <w:bCs/>
+                <w:color w:val="1F3A5F"/>
+                <w:sz w:val="20"/>
+                <w:szCs w:val="20"/>
+              </w:rPr>
+              <w:t>Calendrier souhaité</w:t>
+            </w:r>
+          </w:p>
+        </w:tc>
+        <w:tc>
+          <w:tcPr>
+            <w:tcW w:w="0" w:type="auto"/>
+            <w:tcBorders>
+              <w:top w:val="single" w:sz="6" w:space="0" w:color="C9D3DE"/>
+              <w:left w:val="single" w:sz="6" w:space="0" w:color="C9D3DE"/>
+              <w:bottom w:val="single" w:sz="6" w:space="0" w:color="C9D3DE"/>
+              <w:right w:val="single" w:sz="6" w:space="0" w:color="C9D3DE"/>
+            </w:tcBorders>
+            <w:shd w:val="clear" w:color="auto" w:fill="FFFFFF"/>
+            <w:hideMark/>
+          </w:tcPr>
+          <w:p>
+            <w:pPr>
+              <w:spacing w:before="120" w:after="120"/>
+              <w:rPr>
+                <w:rFonts w:ascii="Calibri" w:eastAsia="Times New Roman" w:hAnsi="Calibri" w:cs="Calibri"/>
+                <w:sz w:val="20"/>
+                <w:szCs w:val="20"/>
+              </w:rPr>
+            </w:pPr>
+            <w:r>
+              <w:rPr>
+                <w:rFonts w:ascii="Calibri" w:eastAsia="Times New Roman" w:hAnsi="Calibri" w:cs="Calibri"/>
+                <w:sz w:val="20"/>
+                <w:szCs w:val="20"/>
+              </w:rPr>
+              <w:t>Date de mise en ligne souhaitée, jours et heures des présentations de milieu et de fin de semaine</w:t>
+            </w:r>
+          </w:p>
+        </w:tc>
+      </w:tr>
+    </w:tbl>
+    <w:p>
+      <w:pPr>
+        <w:pStyle w:val="NormalWeb"/>
+        <w:spacing w:beforeAutospacing="0" w:afterAutospacing="0" w:line="324" w:lineRule="auto"/>
+        <w:rPr>
+          <w:rFonts w:ascii="Calibri" w:hAnsi="Calibri" w:cs="Calibri"/>
+          <w:sz w:val="21"/>
+          <w:szCs w:val="21"/>
+        </w:rPr>
+      </w:pPr>
+      <w:r>
+        <w:rPr>
+          <w:rFonts w:ascii="Calibri" w:hAnsi="Calibri" w:cs="Calibri"/>
+          <w:b/>
+          <w:bCs/>
+          <w:sz w:val="21"/>
+          <w:szCs w:val="21"/>
+        </w:rPr>
+        <w:t xml:space="preserve"> </w:t>
+      </w:r>
+    </w:p>
+    <w:p>
+      <w:pPr>
+        <w:pStyle w:val="Titre2"/>
+        <w:spacing w:before="240" w:beforeAutospacing="0" w:after="80" w:afterAutospacing="0"/>
+        <w:rPr>
+          <w:rFonts w:ascii="Calibri" w:eastAsia="Times New Roman" w:hAnsi="Calibri" w:cs="Calibri"/>
+          <w:color w:val="E8833A"/>
+          <w:sz w:val="26"/>
+          <w:szCs w:val="26"/>
+        </w:rPr>
+      </w:pPr>
+      <w:r>
+        <w:rPr>
+          <w:rFonts w:ascii="Calibri" w:eastAsia="Times New Roman" w:hAnsi="Calibri" w:cs="Calibri"/>
+          <w:color w:val="E8833A"/>
+          <w:sz w:val="26"/>
+          <w:szCs w:val="26"/>
+        </w:rPr>
+        <w:t xml:space="preserve">2. Identité visuelle</w:t>
+      </w:r>
+    </w:p>
+    <w:tbl>
+      <w:tblPr>
+        <w:tblW w:w="5000" w:type="pct"/>
+        <w:tblCellMar>
+          <w:top w:w="60" w:type="dxa"/>
+          <w:left w:w="60" w:type="dxa"/>
+          <w:bottom w:w="60" w:type="dxa"/>
+          <w:right w:w="60" w:type="dxa"/>
+        </w:tblCellMar>
+        <w:tblLook w:val="04A0" w:firstRow="1" w:lastRow="0" w:firstColumn="1" w:lastColumn="0" w:noHBand="0" w:noVBand="1"/>
+      </w:tblPr>
+      <w:tblGrid>
+        <w:gridCol w:w="2364"/>
+        <w:gridCol w:w="7485"/>
+      </w:tblGrid>
+      <w:tr>
+        <w:tc>
+          <w:tcPr>
+            <w:tcW w:w="1200" w:type="pct"/>
+            <w:tcBorders>
+              <w:top w:val="single" w:sz="6" w:space="0" w:color="1F3A5F"/>
+              <w:left w:val="single" w:sz="6" w:space="0" w:color="1F3A5F"/>
+              <w:bottom w:val="single" w:sz="6" w:space="0" w:color="1F3A5F"/>
+              <w:right w:val="single" w:sz="6" w:space="0" w:color="1F3A5F"/>
+            </w:tcBorders>
+            <w:shd w:val="clear" w:color="auto" w:fill="1F3A5F"/>
+            <w:vAlign w:val="center"/>
+            <w:hideMark/>
+          </w:tcPr>
+          <w:p>
+            <w:pPr>
+              <w:spacing w:before="120" w:after="120"/>
+              <w:rPr>
+                <w:rFonts w:ascii="Calibri" w:eastAsia="Times New Roman" w:hAnsi="Calibri" w:cs="Calibri"/>
+                <w:sz w:val="21"/>
+                <w:szCs w:val="21"/>
+              </w:rPr>
+            </w:pPr>
+            <w:r>
+              <w:rPr>
+                <w:rFonts w:ascii="Calibri" w:eastAsia="Times New Roman" w:hAnsi="Calibri" w:cs="Calibri"/>
+                <w:b/>
+                <w:bCs/>
+                <w:color w:val="FFFFFF"/>
+                <w:sz w:val="21"/>
+                <w:szCs w:val="21"/>
+              </w:rPr>
+              <w:t>Élément à fournir</w:t>
+            </w:r>
+          </w:p>
+        </w:tc>
+        <w:tc>
+          <w:tcPr>
+            <w:tcW w:w="3800" w:type="pct"/>
+            <w:tcBorders>
+              <w:top w:val="single" w:sz="6" w:space="0" w:color="1F3A5F"/>
+              <w:left w:val="single" w:sz="6" w:space="0" w:color="1F3A5F"/>
+              <w:bottom w:val="single" w:sz="6" w:space="0" w:color="1F3A5F"/>
+              <w:right w:val="single" w:sz="6" w:space="0" w:color="1F3A5F"/>
+            </w:tcBorders>
+            <w:shd w:val="clear" w:color="auto" w:fill="1F3A5F"/>
+            <w:vAlign w:val="center"/>
+            <w:hideMark/>
+          </w:tcPr>
+          <w:p>
+            <w:pPr>
+              <w:spacing w:before="120" w:after="120"/>
+              <w:rPr>
+                <w:rFonts w:ascii="Calibri" w:eastAsia="Times New Roman" w:hAnsi="Calibri" w:cs="Calibri"/>
+                <w:sz w:val="21"/>
+                <w:szCs w:val="21"/>
+              </w:rPr>
+            </w:pPr>
+            <w:r>
+              <w:rPr>
+                <w:rFonts w:ascii="Calibri" w:eastAsia="Times New Roman" w:hAnsi="Calibri" w:cs="Calibri"/>
+                <w:b/>
+                <w:bCs/>
+                <w:color w:val="FFFFFF"/>
+                <w:sz w:val="21"/>
+                <w:szCs w:val="21"/>
+              </w:rPr>
+              <w:t>Précision</w:t>
+            </w:r>
+          </w:p>
+        </w:tc>
+      </w:tr>
+      <w:tr>
+        <w:tc>
+          <w:tcPr>
+            <w:tcW w:w="0" w:type="auto"/>
+            <w:tcBorders>
+              <w:top w:val="single" w:sz="6" w:space="0" w:color="C9D3DE"/>
+              <w:left w:val="single" w:sz="6" w:space="0" w:color="C9D3DE"/>
+              <w:bottom w:val="single" w:sz="6" w:space="0" w:color="C9D3DE"/>
+              <w:right w:val="single" w:sz="6" w:space="0" w:color="C9D3DE"/>
+            </w:tcBorders>
+            <w:shd w:val="clear" w:color="auto" w:fill="FFFFFF"/>
+            <w:hideMark/>
+          </w:tcPr>
+          <w:p>
+            <w:pPr>
+              <w:spacing w:before="120" w:after="120"/>
+              <w:rPr>
+                <w:rFonts w:ascii="Calibri" w:eastAsia="Times New Roman" w:hAnsi="Calibri" w:cs="Calibri"/>
+                <w:sz w:val="20"/>
+                <w:szCs w:val="20"/>
+              </w:rPr>
+            </w:pPr>
+            <w:r>
+              <w:rPr>
+                <w:rFonts w:ascii="Calibri" w:eastAsia="Times New Roman" w:hAnsi="Calibri" w:cs="Calibri"/>
+                <w:b/>
+                <w:bCs/>
+                <w:color w:val="1F3A5F"/>
+                <w:sz w:val="20"/>
+                <w:szCs w:val="20"/>
+              </w:rPr>
+              <w:t>Logo</w:t>
+            </w:r>
+          </w:p>
+        </w:tc>
+        <w:tc>
+          <w:tcPr>
+            <w:tcW w:w="0" w:type="auto"/>
+            <w:tcBorders>
+              <w:top w:val="single" w:sz="6" w:space="0" w:color="C9D3DE"/>
+              <w:left w:val="single" w:sz="6" w:space="0" w:color="C9D3DE"/>
+              <w:bottom w:val="single" w:sz="6" w:space="0" w:color="C9D3DE"/>
+              <w:right w:val="single" w:sz="6" w:space="0" w:color="C9D3DE"/>
+            </w:tcBorders>
+            <w:shd w:val="clear" w:color="auto" w:fill="FFFFFF"/>
+            <w:hideMark/>
+          </w:tcPr>
+          <w:p>
+            <w:pPr>
+              <w:spacing w:before="120" w:after="120"/>
+              <w:rPr>
+                <w:rFonts w:ascii="Calibri" w:eastAsia="Times New Roman" w:hAnsi="Calibri" w:cs="Calibri"/>
+                <w:sz w:val="20"/>
+                <w:szCs w:val="20"/>
+              </w:rPr>
+            </w:pPr>
+            <w:r>
+              <w:rPr>
+                <w:rFonts w:ascii="Calibri" w:eastAsia="Times New Roman" w:hAnsi="Calibri" w:cs="Calibri"/>
+                <w:sz w:val="20"/>
+                <w:szCs w:val="20"/>
+              </w:rPr>
+              <w:t>Fichier de bonne qualité (idéalement vectoriel, sinon PNG haute résolution), en version claire et sombre si elle existe</w:t>
+            </w:r>
+          </w:p>
+        </w:tc>
+      </w:tr>
+      <w:tr>
+        <w:tc>
+          <w:tcPr>
+            <w:tcW w:w="0" w:type="auto"/>
+            <w:tcBorders>
+              <w:top w:val="single" w:sz="6" w:space="0" w:color="C9D3DE"/>
+              <w:left w:val="single" w:sz="6" w:space="0" w:color="C9D3DE"/>
+              <w:bottom w:val="single" w:sz="6" w:space="0" w:color="C9D3DE"/>
+              <w:right w:val="single" w:sz="6" w:space="0" w:color="C9D3DE"/>
+            </w:tcBorders>
+            <w:shd w:val="clear" w:color="auto" w:fill="FFFFFF"/>
+            <w:hideMark/>
+          </w:tcPr>
+          <w:p>
+            <w:pPr>
+              <w:spacing w:before="120" w:after="120"/>
+              <w:rPr>
+                <w:rFonts w:ascii="Calibri" w:eastAsia="Times New Roman" w:hAnsi="Calibri" w:cs="Calibri"/>
+                <w:sz w:val="20"/>
+                <w:szCs w:val="20"/>
+              </w:rPr>
+            </w:pPr>
+            <w:r>
+              <w:rPr>
+                <w:rFonts w:ascii="Calibri" w:eastAsia="Times New Roman" w:hAnsi="Calibri" w:cs="Calibri"/>
+                <w:b/>
+                <w:bCs/>
+                <w:color w:val="1F3A5F"/>
+                <w:sz w:val="20"/>
+                <w:szCs w:val="20"/>
+              </w:rPr>
+              <w:t>Charte graphique</w:t>
+            </w:r>
+          </w:p>
+        </w:tc>
+        <w:tc>
+          <w:tcPr>
+            <w:tcW w:w="0" w:type="auto"/>
+            <w:tcBorders>
+              <w:top w:val="single" w:sz="6" w:space="0" w:color="C9D3DE"/>
+              <w:left w:val="single" w:sz="6" w:space="0" w:color="C9D3DE"/>
+              <w:bottom w:val="single" w:sz="6" w:space="0" w:color="C9D3DE"/>
+              <w:right w:val="single" w:sz="6" w:space="0" w:color="C9D3DE"/>
+            </w:tcBorders>
+            <w:shd w:val="clear" w:color="auto" w:fill="FFFFFF"/>
+            <w:hideMark/>
+          </w:tcPr>
+          <w:p>
+            <w:pPr>
+              <w:spacing w:before="120" w:after="120"/>
+              <w:rPr>
+                <w:rFonts w:ascii="Calibri" w:eastAsia="Times New Roman" w:hAnsi="Calibri" w:cs="Calibri"/>
+                <w:sz w:val="20"/>
+                <w:szCs w:val="20"/>
+              </w:rPr>
+            </w:pPr>
+            <w:r>
+              <w:rPr>
+                <w:rFonts w:ascii="Calibri" w:eastAsia="Times New Roman" w:hAnsi="Calibri" w:cs="Calibri"/>
+                <w:sz w:val="20"/>
+                <w:szCs w:val="20"/>
+              </w:rPr>
+              <w:t>Couleurs, polices, style souhaité. Si rien n'existe, 2 ou 3 sites que vous aimez et ceux que vous n'aimez pas.</w:t>
+            </w:r>
+          </w:p>
+        </w:tc>
+      </w:tr>
+      <w:tr>
+        <w:tc>
+          <w:tcPr>
+            <w:tcW w:w="0" w:type="auto"/>
+            <w:tcBorders>
+              <w:top w:val="single" w:sz="6" w:space="0" w:color="C9D3DE"/>
+              <w:left w:val="single" w:sz="6" w:space="0" w:color="C9D3DE"/>
+              <w:bottom w:val="single" w:sz="6" w:space="0" w:color="C9D3DE"/>
+              <w:right w:val="single" w:sz="6" w:space="0" w:color="C9D3DE"/>
+            </w:tcBorders>
+            <w:shd w:val="clear" w:color="auto" w:fill="FFFFFF"/>
+            <w:hideMark/>
+          </w:tcPr>
+          <w:p>
+            <w:pPr>
+              <w:spacing w:before="120" w:after="120"/>
+              <w:rPr>
+                <w:rFonts w:ascii="Calibri" w:eastAsia="Times New Roman" w:hAnsi="Calibri" w:cs="Calibri"/>
+                <w:sz w:val="20"/>
+                <w:szCs w:val="20"/>
+              </w:rPr>
+            </w:pPr>
+            <w:r>
+              <w:rPr>
+                <w:rFonts w:ascii="Calibri" w:eastAsia="Times New Roman" w:hAnsi="Calibri" w:cs="Calibri"/>
+                <w:b/>
+                <w:bCs/>
+                <w:color w:val="1F3A5F"/>
+                <w:sz w:val="20"/>
+                <w:szCs w:val="20"/>
+              </w:rPr>
+              <w:t>Images du site</w:t>
+            </w:r>
+          </w:p>
+        </w:tc>
+        <w:tc>
+          <w:tcPr>
+            <w:tcW w:w="0" w:type="auto"/>
+            <w:tcBorders>
+              <w:top w:val="single" w:sz="6" w:space="0" w:color="C9D3DE"/>
+              <w:left w:val="single" w:sz="6" w:space="0" w:color="C9D3DE"/>
+              <w:bottom w:val="single" w:sz="6" w:space="0" w:color="C9D3DE"/>
+              <w:right w:val="single" w:sz="6" w:space="0" w:color="C9D3DE"/>
+            </w:tcBorders>
+            <w:shd w:val="clear" w:color="auto" w:fill="FFFFFF"/>
+            <w:hideMark/>
+          </w:tcPr>
+          <w:p>
+            <w:pPr>
+              <w:spacing w:before="120" w:after="120"/>
+              <w:rPr>
+                <w:rFonts w:ascii="Calibri" w:eastAsia="Times New Roman" w:hAnsi="Calibri" w:cs="Calibri"/>
+                <w:sz w:val="20"/>
+                <w:szCs w:val="20"/>
+              </w:rPr>
+            </w:pPr>
+            <w:r>
+              <w:rPr>
+                <w:rFonts w:ascii="Calibri" w:eastAsia="Times New Roman" w:hAnsi="Calibri" w:cs="Calibri"/>
+                <w:sz w:val="20"/>
+                <w:szCs w:val="20"/>
+              </w:rPr>
+              <w:t>Bannières, photo de présentation, visuels pour les deux parties (Boutique et Espace Formations)</w:t>
+            </w:r>
+          </w:p>
+        </w:tc>
+      </w:tr>
+      <w:tr>
+        <w:tc>
+          <w:tcPr>
+            <w:tcW w:w="0" w:type="auto"/>
+            <w:tcBorders>
+              <w:top w:val="single" w:sz="6" w:space="0" w:color="C9D3DE"/>
+              <w:left w:val="single" w:sz="6" w:space="0" w:color="C9D3DE"/>
+              <w:bottom w:val="single" w:sz="6" w:space="0" w:color="C9D3DE"/>
+              <w:right w:val="single" w:sz="6" w:space="0" w:color="C9D3DE"/>
+            </w:tcBorders>
+            <w:shd w:val="clear" w:color="auto" w:fill="FFFFFF"/>
+            <w:hideMark/>
+          </w:tcPr>
+          <w:p>
+            <w:pPr>
+              <w:spacing w:before="120" w:after="120"/>
+              <w:rPr>
+                <w:rFonts w:ascii="Calibri" w:eastAsia="Times New Roman" w:hAnsi="Calibri" w:cs="Calibri"/>
+                <w:sz w:val="20"/>
+                <w:szCs w:val="20"/>
+              </w:rPr>
+            </w:pPr>
+            <w:r>
+              <w:rPr>
+                <w:rFonts w:ascii="Calibri" w:eastAsia="Times New Roman" w:hAnsi="Calibri" w:cs="Calibri"/>
+                <w:b/>
+                <w:bCs/>
+                <w:color w:val="1F3A5F"/>
+                <w:sz w:val="20"/>
+                <w:szCs w:val="20"/>
+              </w:rPr>
+              <w:t>Réseaux sociaux et contacts</w:t>
+            </w:r>
+          </w:p>
+        </w:tc>
+        <w:tc>
+          <w:tcPr>
+            <w:tcW w:w="0" w:type="auto"/>
+            <w:tcBorders>
+              <w:top w:val="single" w:sz="6" w:space="0" w:color="C9D3DE"/>
+              <w:left w:val="single" w:sz="6" w:space="0" w:color="C9D3DE"/>
+              <w:bottom w:val="single" w:sz="6" w:space="0" w:color="C9D3DE"/>
+              <w:right w:val="single" w:sz="6" w:space="0" w:color="C9D3DE"/>
+            </w:tcBorders>
+            <w:shd w:val="clear" w:color="auto" w:fill="FFFFFF"/>
+            <w:hideMark/>
+          </w:tcPr>
+          <w:p>
+            <w:pPr>
+              <w:spacing w:before="120" w:after="120"/>
+              <w:rPr>
+                <w:rFonts w:ascii="Calibri" w:eastAsia="Times New Roman" w:hAnsi="Calibri" w:cs="Calibri"/>
+                <w:sz w:val="20"/>
+                <w:szCs w:val="20"/>
+              </w:rPr>
+            </w:pPr>
+            <w:r>
+              <w:rPr>
+                <w:rFonts w:ascii="Calibri" w:eastAsia="Times New Roman" w:hAnsi="Calibri" w:cs="Calibri"/>
+                <w:sz w:val="20"/>
+                <w:szCs w:val="20"/>
+              </w:rPr>
+              <w:t>Liens à afficher (Facebook, Instagram, TikTok, YouTube, etc.) et numéro WhatsApp pour le bouton de demande d'accès</w:t>
+            </w:r>
+          </w:p>
+        </w:tc>
+      </w:tr>
+    </w:tbl>
+    <w:p>
+      <w:pPr>
+        <w:pStyle w:val="NormalWeb"/>
+        <w:spacing w:beforeAutospacing="0" w:afterAutospacing="0" w:line="324" w:lineRule="auto"/>
+        <w:rPr>
+          <w:rFonts w:ascii="Calibri" w:hAnsi="Calibri" w:cs="Calibri"/>
+          <w:sz w:val="21"/>
+          <w:szCs w:val="21"/>
+        </w:rPr>
+      </w:pPr>
+      <w:r>
+        <w:rPr>
+          <w:rFonts w:ascii="Calibri" w:hAnsi="Calibri" w:cs="Calibri"/>
+          <w:b/>
+          <w:bCs/>
+          <w:sz w:val="21"/>
+          <w:szCs w:val="21"/>
+        </w:rPr>
+        <w:t xml:space="preserve"> </w:t>
+      </w:r>
+    </w:p>
+    <w:p>
+      <w:pPr>
+        <w:pStyle w:val="Titre2"/>
+        <w:spacing w:before="240" w:beforeAutospacing="0" w:after="80" w:afterAutospacing="0"/>
+        <w:rPr>
+          <w:rFonts w:ascii="Calibri" w:eastAsia="Times New Roman" w:hAnsi="Calibri" w:cs="Calibri"/>
+          <w:color w:val="E8833A"/>
+          <w:sz w:val="26"/>
+          <w:szCs w:val="26"/>
+        </w:rPr>
+      </w:pPr>
+      <w:r>
+        <w:rPr>
+          <w:rFonts w:ascii="Calibri" w:eastAsia="Times New Roman" w:hAnsi="Calibri" w:cs="Calibri"/>
+          <w:color w:val="E8833A"/>
+          <w:sz w:val="26"/>
+          <w:szCs w:val="26"/>
+        </w:rPr>
+        <w:t xml:space="preserve">3. Textes des pages</w:t>
+      </w:r>
+    </w:p>
+    <w:tbl>
+      <w:tblPr>
+        <w:tblW w:w="5000" w:type="pct"/>
+        <w:tblCellMar>
+          <w:top w:w="60" w:type="dxa"/>
+          <w:left w:w="60" w:type="dxa"/>
+          <w:bottom w:w="60" w:type="dxa"/>
+          <w:right w:w="60" w:type="dxa"/>
+        </w:tblCellMar>
+        <w:tblLook w:val="04A0" w:firstRow="1" w:lastRow="0" w:firstColumn="1" w:lastColumn="0" w:noHBand="0" w:noVBand="1"/>
+      </w:tblPr>
+      <w:tblGrid>
+        <w:gridCol w:w="2364"/>
+        <w:gridCol w:w="7485"/>
+      </w:tblGrid>
+      <w:tr>
+        <w:tc>
+          <w:tcPr>
+            <w:tcW w:w="1200" w:type="pct"/>
+            <w:tcBorders>
+              <w:top w:val="single" w:sz="6" w:space="0" w:color="1F3A5F"/>
+              <w:left w:val="single" w:sz="6" w:space="0" w:color="1F3A5F"/>
+              <w:bottom w:val="single" w:sz="6" w:space="0" w:color="1F3A5F"/>
+              <w:right w:val="single" w:sz="6" w:space="0" w:color="1F3A5F"/>
+            </w:tcBorders>
+            <w:shd w:val="clear" w:color="auto" w:fill="1F3A5F"/>
+            <w:vAlign w:val="center"/>
+            <w:hideMark/>
+          </w:tcPr>
+          <w:p>
+            <w:pPr>
+              <w:spacing w:before="120" w:after="120"/>
+              <w:rPr>
+                <w:rFonts w:ascii="Calibri" w:eastAsia="Times New Roman" w:hAnsi="Calibri" w:cs="Calibri"/>
+                <w:sz w:val="21"/>
+                <w:szCs w:val="21"/>
+              </w:rPr>
+            </w:pPr>
+            <w:r>
+              <w:rPr>
+                <w:rFonts w:ascii="Calibri" w:eastAsia="Times New Roman" w:hAnsi="Calibri" w:cs="Calibri"/>
+                <w:b/>
+                <w:bCs/>
+                <w:color w:val="FFFFFF"/>
+                <w:sz w:val="21"/>
+                <w:szCs w:val="21"/>
+              </w:rPr>
+              <w:t>Élément à fournir</w:t>
+            </w:r>
+          </w:p>
+        </w:tc>
+        <w:tc>
+          <w:tcPr>
+            <w:tcW w:w="3800" w:type="pct"/>
+            <w:tcBorders>
+              <w:top w:val="single" w:sz="6" w:space="0" w:color="1F3A5F"/>
+              <w:left w:val="single" w:sz="6" w:space="0" w:color="1F3A5F"/>
+              <w:bottom w:val="single" w:sz="6" w:space="0" w:color="1F3A5F"/>
+              <w:right w:val="single" w:sz="6" w:space="0" w:color="1F3A5F"/>
+            </w:tcBorders>
+            <w:shd w:val="clear" w:color="auto" w:fill="1F3A5F"/>
+            <w:vAlign w:val="center"/>
+            <w:hideMark/>
+          </w:tcPr>
+          <w:p>
+            <w:pPr>
+              <w:spacing w:before="120" w:after="120"/>
+              <w:rPr>
+                <w:rFonts w:ascii="Calibri" w:eastAsia="Times New Roman" w:hAnsi="Calibri" w:cs="Calibri"/>
+                <w:sz w:val="21"/>
+                <w:szCs w:val="21"/>
+              </w:rPr>
+            </w:pPr>
+            <w:r>
+              <w:rPr>
+                <w:rFonts w:ascii="Calibri" w:eastAsia="Times New Roman" w:hAnsi="Calibri" w:cs="Calibri"/>
+                <w:b/>
+                <w:bCs/>
+                <w:color w:val="FFFFFF"/>
+                <w:sz w:val="21"/>
+                <w:szCs w:val="21"/>
+              </w:rPr>
+              <w:t>Précision</w:t>
+            </w:r>
+          </w:p>
+        </w:tc>
+      </w:tr>
+      <w:tr>
+        <w:tc>
+          <w:tcPr>
+            <w:tcW w:w="0" w:type="auto"/>
+            <w:tcBorders>
+              <w:top w:val="single" w:sz="6" w:space="0" w:color="C9D3DE"/>
+              <w:left w:val="single" w:sz="6" w:space="0" w:color="C9D3DE"/>
+              <w:bottom w:val="single" w:sz="6" w:space="0" w:color="C9D3DE"/>
+              <w:right w:val="single" w:sz="6" w:space="0" w:color="C9D3DE"/>
+            </w:tcBorders>
+            <w:shd w:val="clear" w:color="auto" w:fill="FFFFFF"/>
+            <w:hideMark/>
+          </w:tcPr>
+          <w:p>
+            <w:pPr>
+              <w:spacing w:before="120" w:after="120"/>
+              <w:rPr>
+                <w:rFonts w:ascii="Calibri" w:eastAsia="Times New Roman" w:hAnsi="Calibri" w:cs="Calibri"/>
+                <w:sz w:val="20"/>
+                <w:szCs w:val="20"/>
+              </w:rPr>
+            </w:pPr>
+            <w:r>
+              <w:rPr>
+                <w:rFonts w:ascii="Calibri" w:eastAsia="Times New Roman" w:hAnsi="Calibri" w:cs="Calibri"/>
+                <w:b/>
+                <w:bCs/>
+                <w:color w:val="1F3A5F"/>
+                <w:sz w:val="20"/>
+                <w:szCs w:val="20"/>
+              </w:rPr>
+              <w:t>Pages d'information</w:t>
+            </w:r>
+          </w:p>
+        </w:tc>
+        <w:tc>
+          <w:tcPr>
+            <w:tcW w:w="0" w:type="auto"/>
+            <w:tcBorders>
+              <w:top w:val="single" w:sz="6" w:space="0" w:color="C9D3DE"/>
+              <w:left w:val="single" w:sz="6" w:space="0" w:color="C9D3DE"/>
+              <w:bottom w:val="single" w:sz="6" w:space="0" w:color="C9D3DE"/>
+              <w:right w:val="single" w:sz="6" w:space="0" w:color="C9D3DE"/>
+            </w:tcBorders>
+            <w:shd w:val="clear" w:color="auto" w:fill="FFFFFF"/>
+            <w:hideMark/>
+          </w:tcPr>
+          <w:p>
+            <w:pPr>
+              <w:spacing w:before="120" w:after="120"/>
+              <w:rPr>
+                <w:rFonts w:ascii="Calibri" w:eastAsia="Times New Roman" w:hAnsi="Calibri" w:cs="Calibri"/>
+                <w:sz w:val="20"/>
+                <w:szCs w:val="20"/>
+              </w:rPr>
+            </w:pPr>
+            <w:r>
+              <w:rPr>
+                <w:rFonts w:ascii="Calibri" w:eastAsia="Times New Roman" w:hAnsi="Calibri" w:cs="Calibri"/>
+                <w:sz w:val="20"/>
+                <w:szCs w:val="20"/>
+              </w:rPr>
+              <w:t>Accueil, à propos, contact, questions fréquentes : textes en français et en anglais</w:t>
+            </w:r>
+          </w:p>
+        </w:tc>
+      </w:tr>
+      <w:tr>
+        <w:tc>
+          <w:tcPr>
+            <w:tcW w:w="0" w:type="auto"/>
+            <w:tcBorders>
+              <w:top w:val="single" w:sz="6" w:space="0" w:color="C9D3DE"/>
+              <w:left w:val="single" w:sz="6" w:space="0" w:color="C9D3DE"/>
+              <w:bottom w:val="single" w:sz="6" w:space="0" w:color="C9D3DE"/>
+              <w:right w:val="single" w:sz="6" w:space="0" w:color="C9D3DE"/>
+            </w:tcBorders>
+            <w:shd w:val="clear" w:color="auto" w:fill="FFFFFF"/>
+            <w:hideMark/>
+          </w:tcPr>
+          <w:p>
+            <w:pPr>
+              <w:spacing w:before="120" w:after="120"/>
+              <w:rPr>
+                <w:rFonts w:ascii="Calibri" w:eastAsia="Times New Roman" w:hAnsi="Calibri" w:cs="Calibri"/>
+                <w:sz w:val="20"/>
+                <w:szCs w:val="20"/>
+              </w:rPr>
+            </w:pPr>
+            <w:r>
+              <w:rPr>
+                <w:rFonts w:ascii="Calibri" w:eastAsia="Times New Roman" w:hAnsi="Calibri" w:cs="Calibri"/>
+                <w:b/>
+                <w:bCs/>
+                <w:color w:val="1F3A5F"/>
+                <w:sz w:val="20"/>
+                <w:szCs w:val="20"/>
+              </w:rPr>
+              <w:t>Traduction</w:t>
+            </w:r>
+          </w:p>
+        </w:tc>
+        <w:tc>
+          <w:tcPr>
+            <w:tcW w:w="0" w:type="auto"/>
+            <w:tcBorders>
+              <w:top w:val="single" w:sz="6" w:space="0" w:color="C9D3DE"/>
+              <w:left w:val="single" w:sz="6" w:space="0" w:color="C9D3DE"/>
+              <w:bottom w:val="single" w:sz="6" w:space="0" w:color="C9D3DE"/>
+              <w:right w:val="single" w:sz="6" w:space="0" w:color="C9D3DE"/>
+            </w:tcBorders>
+            <w:shd w:val="clear" w:color="auto" w:fill="FFFFFF"/>
+            <w:hideMark/>
+          </w:tcPr>
+          <w:p>
+            <w:pPr>
+              <w:spacing w:before="120" w:after="120"/>
+              <w:rPr>
+                <w:rFonts w:ascii="Calibri" w:eastAsia="Times New Roman" w:hAnsi="Calibri" w:cs="Calibri"/>
+                <w:sz w:val="20"/>
+                <w:szCs w:val="20"/>
+              </w:rPr>
+            </w:pPr>
+            <w:r>
+              <w:rPr>
+                <w:rFonts w:ascii="Calibri" w:eastAsia="Times New Roman" w:hAnsi="Calibri" w:cs="Calibri"/>
+                <w:sz w:val="20"/>
+                <w:szCs w:val="20"/>
+              </w:rPr>
+              <w:t>Qui fournit les textes en anglais : vous, un traducteur, ou moi (à valider par vous) ? Langue affichée par défaut.</w:t>
+            </w:r>
+          </w:p>
+        </w:tc>
+      </w:tr>
+      <w:tr>
+        <w:tc>
+          <w:tcPr>
+            <w:tcW w:w="0" w:type="auto"/>
+            <w:tcBorders>
+              <w:top w:val="single" w:sz="6" w:space="0" w:color="C9D3DE"/>
+              <w:left w:val="single" w:sz="6" w:space="0" w:color="C9D3DE"/>
+              <w:bottom w:val="single" w:sz="6" w:space="0" w:color="C9D3DE"/>
+              <w:right w:val="single" w:sz="6" w:space="0" w:color="C9D3DE"/>
+            </w:tcBorders>
+            <w:shd w:val="clear" w:color="auto" w:fill="FFFFFF"/>
+            <w:hideMark/>
+          </w:tcPr>
+          <w:p>
+            <w:pPr>
+              <w:spacing w:before="120" w:after="120"/>
+              <w:rPr>
+                <w:rFonts w:ascii="Calibri" w:eastAsia="Times New Roman" w:hAnsi="Calibri" w:cs="Calibri"/>
+                <w:sz w:val="20"/>
+                <w:szCs w:val="20"/>
+              </w:rPr>
+            </w:pPr>
+            <w:r>
+              <w:rPr>
+                <w:rFonts w:ascii="Calibri" w:eastAsia="Times New Roman" w:hAnsi="Calibri" w:cs="Calibri"/>
+                <w:b/>
+                <w:bCs/>
+                <w:color w:val="1F3A5F"/>
+                <w:sz w:val="20"/>
+                <w:szCs w:val="20"/>
+              </w:rPr>
+              <w:t>Messages envoyés aux clients et étudiants</w:t>
+            </w:r>
+          </w:p>
+        </w:tc>
+        <w:tc>
+          <w:tcPr>
+            <w:tcW w:w="0" w:type="auto"/>
+            <w:tcBorders>
+              <w:top w:val="single" w:sz="6" w:space="0" w:color="C9D3DE"/>
+              <w:left w:val="single" w:sz="6" w:space="0" w:color="C9D3DE"/>
+              <w:bottom w:val="single" w:sz="6" w:space="0" w:color="C9D3DE"/>
+              <w:right w:val="single" w:sz="6" w:space="0" w:color="C9D3DE"/>
+            </w:tcBorders>
+            <w:shd w:val="clear" w:color="auto" w:fill="FFFFFF"/>
+            <w:hideMark/>
+          </w:tcPr>
+          <w:p>
+            <w:pPr>
+              <w:spacing w:before="120" w:after="120"/>
+              <w:rPr>
+                <w:rFonts w:ascii="Calibri" w:eastAsia="Times New Roman" w:hAnsi="Calibri" w:cs="Calibri"/>
+                <w:sz w:val="20"/>
+                <w:szCs w:val="20"/>
+              </w:rPr>
+            </w:pPr>
+            <w:r>
+              <w:rPr>
+                <w:rFonts w:ascii="Calibri" w:eastAsia="Times New Roman" w:hAnsi="Calibri" w:cs="Calibri"/>
+                <w:sz w:val="20"/>
+                <w:szCs w:val="20"/>
+              </w:rPr>
+              <w:t>Texte souhaité pour les emails de confirmation, de facture, d'accès aux formations et d'invitation aux réunions</w:t>
+            </w:r>
+          </w:p>
+        </w:tc>
+      </w:tr>
+    </w:tbl>
+    <w:p>
+      <w:pPr>
+        <w:pStyle w:val="NormalWeb"/>
+        <w:spacing w:beforeAutospacing="0" w:afterAutospacing="0" w:line="324" w:lineRule="auto"/>
+        <w:rPr>
+          <w:rFonts w:ascii="Calibri" w:hAnsi="Calibri" w:cs="Calibri"/>
+          <w:sz w:val="21"/>
+          <w:szCs w:val="21"/>
+        </w:rPr>
+      </w:pPr>
+      <w:r>
+        <w:rPr>
+          <w:rFonts w:ascii="Calibri" w:hAnsi="Calibri" w:cs="Calibri"/>
+          <w:b/>
+          <w:bCs/>
+          <w:sz w:val="21"/>
+          <w:szCs w:val="21"/>
+        </w:rPr>
+        <w:t xml:space="preserve"> </w:t>
+      </w:r>
+    </w:p>
+    <w:p>
+      <w:pPr>
+        <w:pStyle w:val="Titre2"/>
+        <w:spacing w:before="240" w:beforeAutospacing="0" w:after="80" w:afterAutospacing="0"/>
+        <w:rPr>
+          <w:rFonts w:ascii="Calibri" w:eastAsia="Times New Roman" w:hAnsi="Calibri" w:cs="Calibri"/>
+          <w:color w:val="E8833A"/>
+          <w:sz w:val="26"/>
+          <w:szCs w:val="26"/>
+        </w:rPr>
+      </w:pPr>
+      <w:r>
+        <w:rPr>
+          <w:rFonts w:ascii="Calibri" w:eastAsia="Times New Roman" w:hAnsi="Calibri" w:cs="Calibri"/>
+          <w:color w:val="E8833A"/>
+          <w:sz w:val="26"/>
+          <w:szCs w:val="26"/>
+        </w:rPr>
+        <w:t xml:space="preserve">4. La Boutique</w:t>
+      </w:r>
+    </w:p>
+    <w:tbl>
+      <w:tblPr>
+        <w:tblW w:w="5000" w:type="pct"/>
+        <w:tblCellMar>
+          <w:top w:w="60" w:type="dxa"/>
+          <w:left w:w="60" w:type="dxa"/>
+          <w:bottom w:w="60" w:type="dxa"/>
+          <w:right w:w="60" w:type="dxa"/>
+        </w:tblCellMar>
+        <w:tblLook w:val="04A0" w:firstRow="1" w:lastRow="0" w:firstColumn="1" w:lastColumn="0" w:noHBand="0" w:noVBand="1"/>
+      </w:tblPr>
+      <w:tblGrid>
+        <w:gridCol w:w="2364"/>
+        <w:gridCol w:w="7485"/>
+      </w:tblGrid>
+      <w:tr>
+        <w:tc>
+          <w:tcPr>
+            <w:tcW w:w="1200" w:type="pct"/>
+            <w:tcBorders>
+              <w:top w:val="single" w:sz="6" w:space="0" w:color="1F3A5F"/>
+              <w:left w:val="single" w:sz="6" w:space="0" w:color="1F3A5F"/>
+              <w:bottom w:val="single" w:sz="6" w:space="0" w:color="1F3A5F"/>
+              <w:right w:val="single" w:sz="6" w:space="0" w:color="1F3A5F"/>
+            </w:tcBorders>
+            <w:shd w:val="clear" w:color="auto" w:fill="1F3A5F"/>
+            <w:vAlign w:val="center"/>
+            <w:hideMark/>
+          </w:tcPr>
+          <w:p>
+            <w:pPr>
+              <w:spacing w:before="120" w:after="120"/>
+              <w:rPr>
+                <w:rFonts w:ascii="Calibri" w:eastAsia="Times New Roman" w:hAnsi="Calibri" w:cs="Calibri"/>
+                <w:sz w:val="21"/>
+                <w:szCs w:val="21"/>
+              </w:rPr>
+            </w:pPr>
+            <w:r>
+              <w:rPr>
+                <w:rFonts w:ascii="Calibri" w:eastAsia="Times New Roman" w:hAnsi="Calibri" w:cs="Calibri"/>
+                <w:b/>
+                <w:bCs/>
+                <w:color w:val="FFFFFF"/>
+                <w:sz w:val="21"/>
+                <w:szCs w:val="21"/>
+              </w:rPr>
+              <w:t>Élément à fournir</w:t>
+            </w:r>
+          </w:p>
+        </w:tc>
+        <w:tc>
+          <w:tcPr>
+            <w:tcW w:w="3800" w:type="pct"/>
+            <w:tcBorders>
+              <w:top w:val="single" w:sz="6" w:space="0" w:color="1F3A5F"/>
+              <w:left w:val="single" w:sz="6" w:space="0" w:color="1F3A5F"/>
+              <w:bottom w:val="single" w:sz="6" w:space="0" w:color="1F3A5F"/>
+              <w:right w:val="single" w:sz="6" w:space="0" w:color="1F3A5F"/>
+            </w:tcBorders>
+            <w:shd w:val="clear" w:color="auto" w:fill="1F3A5F"/>
+            <w:vAlign w:val="center"/>
+            <w:hideMark/>
+          </w:tcPr>
+          <w:p>
+            <w:pPr>
+              <w:spacing w:before="120" w:after="120"/>
+              <w:rPr>
+                <w:rFonts w:ascii="Calibri" w:eastAsia="Times New Roman" w:hAnsi="Calibri" w:cs="Calibri"/>
+                <w:sz w:val="21"/>
+                <w:szCs w:val="21"/>
+              </w:rPr>
+            </w:pPr>
+            <w:r>
+              <w:rPr>
+                <w:rFonts w:ascii="Calibri" w:eastAsia="Times New Roman" w:hAnsi="Calibri" w:cs="Calibri"/>
+                <w:b/>
+                <w:bCs/>
+                <w:color w:val="FFFFFF"/>
+                <w:sz w:val="21"/>
+                <w:szCs w:val="21"/>
+              </w:rPr>
+              <w:t>Précision</w:t>
+            </w:r>
+          </w:p>
+        </w:tc>
+      </w:tr>
+      <w:tr>
+        <w:tc>
+          <w:tcPr>
+            <w:tcW w:w="0" w:type="auto"/>
+            <w:tcBorders>
+              <w:top w:val="single" w:sz="6" w:space="0" w:color="C9D3DE"/>
+              <w:left w:val="single" w:sz="6" w:space="0" w:color="C9D3DE"/>
+              <w:bottom w:val="single" w:sz="6" w:space="0" w:color="C9D3DE"/>
+              <w:right w:val="single" w:sz="6" w:space="0" w:color="C9D3DE"/>
+            </w:tcBorders>
+            <w:shd w:val="clear" w:color="auto" w:fill="FFFFFF"/>
+            <w:hideMark/>
+          </w:tcPr>
+          <w:p>
+            <w:pPr>
+              <w:spacing w:before="120" w:after="120"/>
+              <w:rPr>
+                <w:rFonts w:ascii="Calibri" w:eastAsia="Times New Roman" w:hAnsi="Calibri" w:cs="Calibri"/>
+                <w:sz w:val="20"/>
+                <w:szCs w:val="20"/>
+              </w:rPr>
+            </w:pPr>
+            <w:r>
+              <w:rPr>
+                <w:rFonts w:ascii="Calibri" w:eastAsia="Times New Roman" w:hAnsi="Calibri" w:cs="Calibri"/>
+                <w:b/>
+                <w:bCs/>
+                <w:color w:val="1F3A5F"/>
+                <w:sz w:val="20"/>
+                <w:szCs w:val="20"/>
+              </w:rPr>
+              <w:t>Catalogue des produits</w:t>
+            </w:r>
+          </w:p>
+        </w:tc>
+        <w:tc>
+          <w:tcPr>
+            <w:tcW w:w="0" w:type="auto"/>
+            <w:tcBorders>
+              <w:top w:val="single" w:sz="6" w:space="0" w:color="C9D3DE"/>
+              <w:left w:val="single" w:sz="6" w:space="0" w:color="C9D3DE"/>
+              <w:bottom w:val="single" w:sz="6" w:space="0" w:color="C9D3DE"/>
+              <w:right w:val="single" w:sz="6" w:space="0" w:color="C9D3DE"/>
+            </w:tcBorders>
+            <w:shd w:val="clear" w:color="auto" w:fill="FFFFFF"/>
+            <w:hideMark/>
+          </w:tcPr>
+          <w:p>
+            <w:pPr>
+              <w:spacing w:before="120" w:after="120"/>
+              <w:rPr>
+                <w:rFonts w:ascii="Calibri" w:eastAsia="Times New Roman" w:hAnsi="Calibri" w:cs="Calibri"/>
+                <w:sz w:val="20"/>
+                <w:szCs w:val="20"/>
+              </w:rPr>
+            </w:pPr>
+            <w:r>
+              <w:rPr>
+                <w:rFonts w:ascii="Calibri" w:eastAsia="Times New Roman" w:hAnsi="Calibri" w:cs="Calibri"/>
+                <w:sz w:val="20"/>
+                <w:szCs w:val="20"/>
+              </w:rPr>
+              <w:t>Pour chaque produit : nom et description en français et en anglais, prix, catégorie, plusieurs photos, quantité en stock, variantes éventuelles (taille, couleur), poids ou dimensions si utile aux frais de livraison. Format conseillé : un tableau Excel.</w:t>
+            </w:r>
+          </w:p>
+        </w:tc>
+      </w:tr>
+      <w:tr>
+        <w:tc>
+          <w:tcPr>
+            <w:tcW w:w="0" w:type="auto"/>
+            <w:tcBorders>
+              <w:top w:val="single" w:sz="6" w:space="0" w:color="C9D3DE"/>
+              <w:left w:val="single" w:sz="6" w:space="0" w:color="C9D3DE"/>
+              <w:bottom w:val="single" w:sz="6" w:space="0" w:color="C9D3DE"/>
+              <w:right w:val="single" w:sz="6" w:space="0" w:color="C9D3DE"/>
+            </w:tcBorders>
+            <w:shd w:val="clear" w:color="auto" w:fill="FFFFFF"/>
+            <w:hideMark/>
+          </w:tcPr>
+          <w:p>
+            <w:pPr>
+              <w:spacing w:before="120" w:after="120"/>
+              <w:rPr>
+                <w:rFonts w:ascii="Calibri" w:eastAsia="Times New Roman" w:hAnsi="Calibri" w:cs="Calibri"/>
+                <w:sz w:val="20"/>
+                <w:szCs w:val="20"/>
+              </w:rPr>
+            </w:pPr>
+            <w:r>
+              <w:rPr>
+                <w:rFonts w:ascii="Calibri" w:eastAsia="Times New Roman" w:hAnsi="Calibri" w:cs="Calibri"/>
+                <w:b/>
+                <w:bCs/>
+                <w:color w:val="1F3A5F"/>
+                <w:sz w:val="20"/>
+                <w:szCs w:val="20"/>
+              </w:rPr>
+              <w:t>Monnaies et conversion</w:t>
+            </w:r>
+          </w:p>
+        </w:tc>
+        <w:tc>
+          <w:tcPr>
+            <w:tcW w:w="0" w:type="auto"/>
+            <w:tcBorders>
+              <w:top w:val="single" w:sz="6" w:space="0" w:color="C9D3DE"/>
+              <w:left w:val="single" w:sz="6" w:space="0" w:color="C9D3DE"/>
+              <w:bottom w:val="single" w:sz="6" w:space="0" w:color="C9D3DE"/>
+              <w:right w:val="single" w:sz="6" w:space="0" w:color="C9D3DE"/>
+            </w:tcBorders>
+            <w:shd w:val="clear" w:color="auto" w:fill="FFFFFF"/>
+            <w:hideMark/>
+          </w:tcPr>
+          <w:p>
+            <w:pPr>
+              <w:spacing w:before="120" w:after="120"/>
+              <w:rPr>
+                <w:rFonts w:ascii="Calibri" w:eastAsia="Times New Roman" w:hAnsi="Calibri" w:cs="Calibri"/>
+                <w:sz w:val="20"/>
+                <w:szCs w:val="20"/>
+              </w:rPr>
+            </w:pPr>
+            <w:r>
+              <w:rPr>
+                <w:rFonts w:ascii="Calibri" w:eastAsia="Times New Roman" w:hAnsi="Calibri" w:cs="Calibri"/>
+                <w:sz w:val="20"/>
+                <w:szCs w:val="20"/>
+              </w:rPr>
+              <w:t>Liste des monnaies à afficher (FCFA, euro, dollar, etc.) et règle de conversion : taux fixé par vous ou taux du jour</w:t>
+            </w:r>
+          </w:p>
+        </w:tc>
+      </w:tr>
+      <w:tr>
+        <w:tc>
+          <w:tcPr>
+            <w:tcW w:w="0" w:type="auto"/>
+            <w:tcBorders>
+              <w:top w:val="single" w:sz="6" w:space="0" w:color="C9D3DE"/>
+              <w:left w:val="single" w:sz="6" w:space="0" w:color="C9D3DE"/>
+              <w:bottom w:val="single" w:sz="6" w:space="0" w:color="C9D3DE"/>
+              <w:right w:val="single" w:sz="6" w:space="0" w:color="C9D3DE"/>
+            </w:tcBorders>
+            <w:shd w:val="clear" w:color="auto" w:fill="FFFFFF"/>
+            <w:hideMark/>
+          </w:tcPr>
+          <w:p>
+            <w:pPr>
+              <w:spacing w:before="120" w:after="120"/>
+              <w:rPr>
+                <w:rFonts w:ascii="Calibri" w:eastAsia="Times New Roman" w:hAnsi="Calibri" w:cs="Calibri"/>
+                <w:sz w:val="20"/>
+                <w:szCs w:val="20"/>
+              </w:rPr>
+            </w:pPr>
+            <w:r>
+              <w:rPr>
+                <w:rFonts w:ascii="Calibri" w:eastAsia="Times New Roman" w:hAnsi="Calibri" w:cs="Calibri"/>
+                <w:b/>
+                <w:bCs/>
+                <w:color w:val="1F3A5F"/>
+                <w:sz w:val="20"/>
+                <w:szCs w:val="20"/>
+              </w:rPr>
+              <w:t>Livraison</w:t>
+            </w:r>
+          </w:p>
+        </w:tc>
+        <w:tc>
+          <w:tcPr>
+            <w:tcW w:w="0" w:type="auto"/>
+            <w:tcBorders>
+              <w:top w:val="single" w:sz="6" w:space="0" w:color="C9D3DE"/>
+              <w:left w:val="single" w:sz="6" w:space="0" w:color="C9D3DE"/>
+              <w:bottom w:val="single" w:sz="6" w:space="0" w:color="C9D3DE"/>
+              <w:right w:val="single" w:sz="6" w:space="0" w:color="C9D3DE"/>
+            </w:tcBorders>
+            <w:shd w:val="clear" w:color="auto" w:fill="FFFFFF"/>
+            <w:hideMark/>
+          </w:tcPr>
+          <w:p>
+            <w:pPr>
+              <w:spacing w:before="120" w:after="120"/>
+              <w:rPr>
+                <w:rFonts w:ascii="Calibri" w:eastAsia="Times New Roman" w:hAnsi="Calibri" w:cs="Calibri"/>
+                <w:sz w:val="20"/>
+                <w:szCs w:val="20"/>
+              </w:rPr>
+            </w:pPr>
+            <w:r>
+              <w:rPr>
+                <w:rFonts w:ascii="Calibri" w:eastAsia="Times New Roman" w:hAnsi="Calibri" w:cs="Calibri"/>
+                <w:sz w:val="20"/>
+                <w:szCs w:val="20"/>
+              </w:rPr>
+              <w:t>Pays et zones desservis, frais par zone, délais, modes disponibles (livraison, retrait sur place), partenaires de livraison éventuels</w:t>
+            </w:r>
+          </w:p>
+        </w:tc>
+      </w:tr>
+      <w:tr>
+        <w:tc>
+          <w:tcPr>
+            <w:tcW w:w="0" w:type="auto"/>
+            <w:tcBorders>
+              <w:top w:val="single" w:sz="6" w:space="0" w:color="C9D3DE"/>
+              <w:left w:val="single" w:sz="6" w:space="0" w:color="C9D3DE"/>
+              <w:bottom w:val="single" w:sz="6" w:space="0" w:color="C9D3DE"/>
+              <w:right w:val="single" w:sz="6" w:space="0" w:color="C9D3DE"/>
+            </w:tcBorders>
+            <w:shd w:val="clear" w:color="auto" w:fill="FFFFFF"/>
+            <w:hideMark/>
+          </w:tcPr>
+          <w:p>
+            <w:pPr>
+              <w:spacing w:before="120" w:after="120"/>
+              <w:rPr>
+                <w:rFonts w:ascii="Calibri" w:eastAsia="Times New Roman" w:hAnsi="Calibri" w:cs="Calibri"/>
+                <w:sz w:val="20"/>
+                <w:szCs w:val="20"/>
+              </w:rPr>
+            </w:pPr>
+            <w:r>
+              <w:rPr>
+                <w:rFonts w:ascii="Calibri" w:eastAsia="Times New Roman" w:hAnsi="Calibri" w:cs="Calibri"/>
+                <w:b/>
+                <w:bCs/>
+                <w:color w:val="1F3A5F"/>
+                <w:sz w:val="20"/>
+                <w:szCs w:val="20"/>
+              </w:rPr>
+              <w:t>Paiement Wave et Orange Money</w:t>
+            </w:r>
+          </w:p>
+        </w:tc>
+        <w:tc>
+          <w:tcPr>
+            <w:tcW w:w="0" w:type="auto"/>
+            <w:tcBorders>
+              <w:top w:val="single" w:sz="6" w:space="0" w:color="C9D3DE"/>
+              <w:left w:val="single" w:sz="6" w:space="0" w:color="C9D3DE"/>
+              <w:bottom w:val="single" w:sz="6" w:space="0" w:color="C9D3DE"/>
+              <w:right w:val="single" w:sz="6" w:space="0" w:color="C9D3DE"/>
+            </w:tcBorders>
+            <w:shd w:val="clear" w:color="auto" w:fill="FFFFFF"/>
+            <w:hideMark/>
+          </w:tcPr>
+          <w:p>
+            <w:pPr>
+              <w:spacing w:before="120" w:after="120"/>
+              <w:rPr>
+                <w:rFonts w:ascii="Calibri" w:eastAsia="Times New Roman" w:hAnsi="Calibri" w:cs="Calibri"/>
+                <w:sz w:val="20"/>
+                <w:szCs w:val="20"/>
+              </w:rPr>
+            </w:pPr>
+            <w:r>
+              <w:rPr>
+                <w:rFonts w:ascii="Calibri" w:eastAsia="Times New Roman" w:hAnsi="Calibri" w:cs="Calibri"/>
+                <w:sz w:val="20"/>
+                <w:szCs w:val="20"/>
+              </w:rPr>
+              <w:t>Numéros, nom du titulaire de chaque compte, instructions à afficher au client, et personne qui valide les paiements</w:t>
+            </w:r>
+          </w:p>
+        </w:tc>
+      </w:tr>
+      <w:tr>
+        <w:tc>
+          <w:tcPr>
+            <w:tcW w:w="0" w:type="auto"/>
+            <w:tcBorders>
+              <w:top w:val="single" w:sz="6" w:space="0" w:color="C9D3DE"/>
+              <w:left w:val="single" w:sz="6" w:space="0" w:color="C9D3DE"/>
+              <w:bottom w:val="single" w:sz="6" w:space="0" w:color="C9D3DE"/>
+              <w:right w:val="single" w:sz="6" w:space="0" w:color="C9D3DE"/>
+            </w:tcBorders>
+            <w:shd w:val="clear" w:color="auto" w:fill="FFFFFF"/>
+            <w:hideMark/>
+          </w:tcPr>
+          <w:p>
+            <w:pPr>
+              <w:spacing w:before="120" w:after="120"/>
+              <w:rPr>
+                <w:rFonts w:ascii="Calibri" w:eastAsia="Times New Roman" w:hAnsi="Calibri" w:cs="Calibri"/>
+                <w:sz w:val="20"/>
+                <w:szCs w:val="20"/>
+              </w:rPr>
+            </w:pPr>
+            <w:r>
+              <w:rPr>
+                <w:rFonts w:ascii="Calibri" w:eastAsia="Times New Roman" w:hAnsi="Calibri" w:cs="Calibri"/>
+                <w:b/>
+                <w:bCs/>
+                <w:color w:val="1F3A5F"/>
+                <w:sz w:val="20"/>
+                <w:szCs w:val="20"/>
+              </w:rPr>
+              <w:t>Délai de réservation du stock</w:t>
+            </w:r>
+          </w:p>
+        </w:tc>
+        <w:tc>
+          <w:tcPr>
+            <w:tcW w:w="0" w:type="auto"/>
+            <w:tcBorders>
+              <w:top w:val="single" w:sz="6" w:space="0" w:color="C9D3DE"/>
+              <w:left w:val="single" w:sz="6" w:space="0" w:color="C9D3DE"/>
+              <w:bottom w:val="single" w:sz="6" w:space="0" w:color="C9D3DE"/>
+              <w:right w:val="single" w:sz="6" w:space="0" w:color="C9D3DE"/>
+            </w:tcBorders>
+            <w:shd w:val="clear" w:color="auto" w:fill="FFFFFF"/>
+            <w:hideMark/>
+          </w:tcPr>
+          <w:p>
+            <w:pPr>
+              <w:spacing w:before="120" w:after="120"/>
+              <w:rPr>
+                <w:rFonts w:ascii="Calibri" w:eastAsia="Times New Roman" w:hAnsi="Calibri" w:cs="Calibri"/>
+                <w:sz w:val="20"/>
+                <w:szCs w:val="20"/>
+              </w:rPr>
+            </w:pPr>
+            <w:r>
+              <w:rPr>
+                <w:rFonts w:ascii="Calibri" w:eastAsia="Times New Roman" w:hAnsi="Calibri" w:cs="Calibri"/>
+                <w:sz w:val="20"/>
+                <w:szCs w:val="20"/>
+              </w:rPr>
+              <w:t>Durée pendant laquelle un produit reste réservé en attendant la confirmation du paiement avant d'être remis en vente</w:t>
+            </w:r>
+          </w:p>
+        </w:tc>
+      </w:tr>
+      <w:tr>
+        <w:tc>
+          <w:tcPr>
+            <w:tcW w:w="0" w:type="auto"/>
+            <w:tcBorders>
+              <w:top w:val="single" w:sz="6" w:space="0" w:color="C9D3DE"/>
+              <w:left w:val="single" w:sz="6" w:space="0" w:color="C9D3DE"/>
+              <w:bottom w:val="single" w:sz="6" w:space="0" w:color="C9D3DE"/>
+              <w:right w:val="single" w:sz="6" w:space="0" w:color="C9D3DE"/>
+            </w:tcBorders>
+            <w:shd w:val="clear" w:color="auto" w:fill="FFFFFF"/>
+            <w:hideMark/>
+          </w:tcPr>
+          <w:p>
+            <w:pPr>
+              <w:spacing w:before="120" w:after="120"/>
+              <w:rPr>
+                <w:rFonts w:ascii="Calibri" w:eastAsia="Times New Roman" w:hAnsi="Calibri" w:cs="Calibri"/>
+                <w:sz w:val="20"/>
+                <w:szCs w:val="20"/>
+              </w:rPr>
+            </w:pPr>
+            <w:r>
+              <w:rPr>
+                <w:rFonts w:ascii="Calibri" w:eastAsia="Times New Roman" w:hAnsi="Calibri" w:cs="Calibri"/>
+                <w:b/>
+                <w:bCs/>
+                <w:color w:val="1F3A5F"/>
+                <w:sz w:val="20"/>
+                <w:szCs w:val="20"/>
+              </w:rPr>
+              <w:t>Factures</w:t>
+            </w:r>
+          </w:p>
+        </w:tc>
+        <w:tc>
+          <w:tcPr>
+            <w:tcW w:w="0" w:type="auto"/>
+            <w:tcBorders>
+              <w:top w:val="single" w:sz="6" w:space="0" w:color="C9D3DE"/>
+              <w:left w:val="single" w:sz="6" w:space="0" w:color="C9D3DE"/>
+              <w:bottom w:val="single" w:sz="6" w:space="0" w:color="C9D3DE"/>
+              <w:right w:val="single" w:sz="6" w:space="0" w:color="C9D3DE"/>
+            </w:tcBorders>
+            <w:shd w:val="clear" w:color="auto" w:fill="FFFFFF"/>
+            <w:hideMark/>
+          </w:tcPr>
+          <w:p>
+            <w:pPr>
+              <w:spacing w:before="120" w:after="120"/>
+              <w:rPr>
+                <w:rFonts w:ascii="Calibri" w:eastAsia="Times New Roman" w:hAnsi="Calibri" w:cs="Calibri"/>
+                <w:sz w:val="20"/>
+                <w:szCs w:val="20"/>
+              </w:rPr>
+            </w:pPr>
+            <w:r>
+              <w:rPr>
+                <w:rFonts w:ascii="Calibri" w:eastAsia="Times New Roman" w:hAnsi="Calibri" w:cs="Calibri"/>
+                <w:sz w:val="20"/>
+                <w:szCs w:val="20"/>
+              </w:rPr>
+              <w:t>Modèle souhaité (en-tête, mentions obligatoires, pied de page, tampon ou signature), règle de numérotation, taxes (TVA) applicables ou non</w:t>
+            </w:r>
+          </w:p>
+        </w:tc>
+      </w:tr>
+      <w:tr>
+        <w:tc>
+          <w:tcPr>
+            <w:tcW w:w="0" w:type="auto"/>
+            <w:tcBorders>
+              <w:top w:val="single" w:sz="6" w:space="0" w:color="C9D3DE"/>
+              <w:left w:val="single" w:sz="6" w:space="0" w:color="C9D3DE"/>
+              <w:bottom w:val="single" w:sz="6" w:space="0" w:color="C9D3DE"/>
+              <w:right w:val="single" w:sz="6" w:space="0" w:color="C9D3DE"/>
+            </w:tcBorders>
+            <w:shd w:val="clear" w:color="auto" w:fill="FFFFFF"/>
+            <w:hideMark/>
+          </w:tcPr>
+          <w:p>
+            <w:pPr>
+              <w:spacing w:before="120" w:after="120"/>
+              <w:rPr>
+                <w:rFonts w:ascii="Calibri" w:eastAsia="Times New Roman" w:hAnsi="Calibri" w:cs="Calibri"/>
+                <w:sz w:val="20"/>
+                <w:szCs w:val="20"/>
+              </w:rPr>
+            </w:pPr>
+            <w:r>
+              <w:rPr>
+                <w:rFonts w:ascii="Calibri" w:eastAsia="Times New Roman" w:hAnsi="Calibri" w:cs="Calibri"/>
+                <w:b/>
+                <w:bCs/>
+                <w:color w:val="1F3A5F"/>
+                <w:sz w:val="20"/>
+                <w:szCs w:val="20"/>
+              </w:rPr>
+              <w:t>Notifications</w:t>
+            </w:r>
+          </w:p>
+        </w:tc>
+        <w:tc>
+          <w:tcPr>
+            <w:tcW w:w="0" w:type="auto"/>
+            <w:tcBorders>
+              <w:top w:val="single" w:sz="6" w:space="0" w:color="C9D3DE"/>
+              <w:left w:val="single" w:sz="6" w:space="0" w:color="C9D3DE"/>
+              <w:bottom w:val="single" w:sz="6" w:space="0" w:color="C9D3DE"/>
+              <w:right w:val="single" w:sz="6" w:space="0" w:color="C9D3DE"/>
+            </w:tcBorders>
+            <w:shd w:val="clear" w:color="auto" w:fill="FFFFFF"/>
+            <w:hideMark/>
+          </w:tcPr>
+          <w:p>
+            <w:pPr>
+              <w:spacing w:before="120" w:after="120"/>
+              <w:rPr>
+                <w:rFonts w:ascii="Calibri" w:eastAsia="Times New Roman" w:hAnsi="Calibri" w:cs="Calibri"/>
+                <w:sz w:val="20"/>
+                <w:szCs w:val="20"/>
+              </w:rPr>
+            </w:pPr>
+            <w:r>
+              <w:rPr>
+                <w:rFonts w:ascii="Calibri" w:eastAsia="Times New Roman" w:hAnsi="Calibri" w:cs="Calibri"/>
+                <w:sz w:val="20"/>
+                <w:szCs w:val="20"/>
+              </w:rPr>
+              <w:t>Adresse(s) email et numéro(s) qui reçoivent les alertes de paiement à vérifier et de nouvelles commandes</w:t>
+            </w:r>
+          </w:p>
+        </w:tc>
+      </w:tr>
+    </w:tbl>
+    <w:p>
+      <w:pPr>
+        <w:pStyle w:val="NormalWeb"/>
+        <w:spacing w:beforeAutospacing="0" w:afterAutospacing="0" w:line="324" w:lineRule="auto"/>
+        <w:rPr>
+          <w:rFonts w:ascii="Calibri" w:hAnsi="Calibri" w:cs="Calibri"/>
+          <w:sz w:val="21"/>
+          <w:szCs w:val="21"/>
+        </w:rPr>
+      </w:pPr>
+      <w:r>
+        <w:rPr>
+          <w:rFonts w:ascii="Calibri" w:hAnsi="Calibri" w:cs="Calibri"/>
+          <w:b/>
+          <w:bCs/>
+          <w:sz w:val="21"/>
+          <w:szCs w:val="21"/>
+        </w:rPr>
+        <w:t xml:space="preserve"> </w:t>
+      </w:r>
+    </w:p>
+    <w:p>
+      <w:pPr>
+        <w:pStyle w:val="Titre2"/>
+        <w:spacing w:before="240" w:beforeAutospacing="0" w:after="80" w:afterAutospacing="0"/>
+        <w:rPr>
+          <w:rFonts w:ascii="Calibri" w:eastAsia="Times New Roman" w:hAnsi="Calibri" w:cs="Calibri"/>
+          <w:color w:val="E8833A"/>
+          <w:sz w:val="26"/>
+          <w:szCs w:val="26"/>
+        </w:rPr>
+      </w:pPr>
+      <w:r>
+        <w:rPr>
+          <w:rFonts w:ascii="Calibri" w:eastAsia="Times New Roman" w:hAnsi="Calibri" w:cs="Calibri"/>
+          <w:color w:val="E8833A"/>
+          <w:sz w:val="26"/>
+          <w:szCs w:val="26"/>
+        </w:rPr>
+        <w:t xml:space="preserve">5. L'Espace Formations</w:t>
+      </w:r>
+    </w:p>
+    <w:tbl>
+      <w:tblPr>
+        <w:tblW w:w="5000" w:type="pct"/>
+        <w:tblCellMar>
+          <w:top w:w="60" w:type="dxa"/>
+          <w:left w:w="60" w:type="dxa"/>
+          <w:bottom w:w="60" w:type="dxa"/>
+          <w:right w:w="60" w:type="dxa"/>
+        </w:tblCellMar>
+        <w:tblLook w:val="04A0" w:firstRow="1" w:lastRow="0" w:firstColumn="1" w:lastColumn="0" w:noHBand="0" w:noVBand="1"/>
+      </w:tblPr>
+      <w:tblGrid>
+        <w:gridCol w:w="2364"/>
+        <w:gridCol w:w="7485"/>
+      </w:tblGrid>
+      <w:tr>
+        <w:tc>
+          <w:tcPr>
+            <w:tcW w:w="1200" w:type="pct"/>
+            <w:tcBorders>
+              <w:top w:val="single" w:sz="6" w:space="0" w:color="1F3A5F"/>
+              <w:left w:val="single" w:sz="6" w:space="0" w:color="1F3A5F"/>
+              <w:bottom w:val="single" w:sz="6" w:space="0" w:color="1F3A5F"/>
+              <w:right w:val="single" w:sz="6" w:space="0" w:color="1F3A5F"/>
+            </w:tcBorders>
+            <w:shd w:val="clear" w:color="auto" w:fill="1F3A5F"/>
+            <w:vAlign w:val="center"/>
+            <w:hideMark/>
+          </w:tcPr>
+          <w:p>
+            <w:pPr>
+              <w:spacing w:before="120" w:after="120"/>
+              <w:rPr>
+                <w:rFonts w:ascii="Calibri" w:eastAsia="Times New Roman" w:hAnsi="Calibri" w:cs="Calibri"/>
+                <w:sz w:val="21"/>
+                <w:szCs w:val="21"/>
+              </w:rPr>
+            </w:pPr>
+            <w:r>
+              <w:rPr>
+                <w:rFonts w:ascii="Calibri" w:eastAsia="Times New Roman" w:hAnsi="Calibri" w:cs="Calibri"/>
+                <w:b/>
+                <w:bCs/>
+                <w:color w:val="FFFFFF"/>
+                <w:sz w:val="21"/>
+                <w:szCs w:val="21"/>
+              </w:rPr>
+              <w:t>Élément à fournir</w:t>
+            </w:r>
+          </w:p>
+        </w:tc>
+        <w:tc>
+          <w:tcPr>
+            <w:tcW w:w="3800" w:type="pct"/>
+            <w:tcBorders>
+              <w:top w:val="single" w:sz="6" w:space="0" w:color="1F3A5F"/>
+              <w:left w:val="single" w:sz="6" w:space="0" w:color="1F3A5F"/>
+              <w:bottom w:val="single" w:sz="6" w:space="0" w:color="1F3A5F"/>
+              <w:right w:val="single" w:sz="6" w:space="0" w:color="1F3A5F"/>
+            </w:tcBorders>
+            <w:shd w:val="clear" w:color="auto" w:fill="1F3A5F"/>
+            <w:vAlign w:val="center"/>
+            <w:hideMark/>
+          </w:tcPr>
+          <w:p>
+            <w:pPr>
+              <w:spacing w:before="120" w:after="120"/>
+              <w:rPr>
+                <w:rFonts w:ascii="Calibri" w:eastAsia="Times New Roman" w:hAnsi="Calibri" w:cs="Calibri"/>
+                <w:sz w:val="21"/>
+                <w:szCs w:val="21"/>
+              </w:rPr>
+            </w:pPr>
+            <w:r>
+              <w:rPr>
+                <w:rFonts w:ascii="Calibri" w:eastAsia="Times New Roman" w:hAnsi="Calibri" w:cs="Calibri"/>
+                <w:b/>
+                <w:bCs/>
+                <w:color w:val="FFFFFF"/>
+                <w:sz w:val="21"/>
+                <w:szCs w:val="21"/>
+              </w:rPr>
+              <w:t>Précision</w:t>
+            </w:r>
+          </w:p>
+        </w:tc>
+      </w:tr>
+      <w:tr>
+        <w:tc>
+          <w:tcPr>
+            <w:tcW w:w="0" w:type="auto"/>
+            <w:tcBorders>
+              <w:top w:val="single" w:sz="6" w:space="0" w:color="C9D3DE"/>
+              <w:left w:val="single" w:sz="6" w:space="0" w:color="C9D3DE"/>
+              <w:bottom w:val="single" w:sz="6" w:space="0" w:color="C9D3DE"/>
+              <w:right w:val="single" w:sz="6" w:space="0" w:color="C9D3DE"/>
+            </w:tcBorders>
+            <w:shd w:val="clear" w:color="auto" w:fill="FFFFFF"/>
+            <w:hideMark/>
+          </w:tcPr>
+          <w:p>
+            <w:pPr>
+              <w:spacing w:before="120" w:after="120"/>
+              <w:rPr>
+                <w:rFonts w:ascii="Calibri" w:eastAsia="Times New Roman" w:hAnsi="Calibri" w:cs="Calibri"/>
+                <w:sz w:val="20"/>
+                <w:szCs w:val="20"/>
+              </w:rPr>
+            </w:pPr>
+            <w:r>
+              <w:rPr>
+                <w:rFonts w:ascii="Calibri" w:eastAsia="Times New Roman" w:hAnsi="Calibri" w:cs="Calibri"/>
+                <w:b/>
+                <w:bCs/>
+                <w:color w:val="1F3A5F"/>
+                <w:sz w:val="20"/>
+                <w:szCs w:val="20"/>
+              </w:rPr>
+              <w:t>Liste des cours</w:t>
+            </w:r>
+          </w:p>
+        </w:tc>
+        <w:tc>
+          <w:tcPr>
+            <w:tcW w:w="0" w:type="auto"/>
+            <w:tcBorders>
+              <w:top w:val="single" w:sz="6" w:space="0" w:color="C9D3DE"/>
+              <w:left w:val="single" w:sz="6" w:space="0" w:color="C9D3DE"/>
+              <w:bottom w:val="single" w:sz="6" w:space="0" w:color="C9D3DE"/>
+              <w:right w:val="single" w:sz="6" w:space="0" w:color="C9D3DE"/>
+            </w:tcBorders>
+            <w:shd w:val="clear" w:color="auto" w:fill="FFFFFF"/>
+            <w:hideMark/>
+          </w:tcPr>
+          <w:p>
+            <w:pPr>
+              <w:spacing w:before="120" w:after="120"/>
+              <w:rPr>
+                <w:rFonts w:ascii="Calibri" w:eastAsia="Times New Roman" w:hAnsi="Calibri" w:cs="Calibri"/>
+                <w:sz w:val="20"/>
+                <w:szCs w:val="20"/>
+              </w:rPr>
+            </w:pPr>
+            <w:r>
+              <w:rPr>
+                <w:rFonts w:ascii="Calibri" w:eastAsia="Times New Roman" w:hAnsi="Calibri" w:cs="Calibri"/>
+                <w:sz w:val="20"/>
+                <w:szCs w:val="20"/>
+              </w:rPr>
+              <w:t>Pour chaque cours : titre et description en français et en anglais, image de couverture, durée, public visé</w:t>
+            </w:r>
+          </w:p>
+        </w:tc>
+      </w:tr>
+      <w:tr>
+        <w:tc>
+          <w:tcPr>
+            <w:tcW w:w="0" w:type="auto"/>
+            <w:tcBorders>
+              <w:top w:val="single" w:sz="6" w:space="0" w:color="C9D3DE"/>
+              <w:left w:val="single" w:sz="6" w:space="0" w:color="C9D3DE"/>
+              <w:bottom w:val="single" w:sz="6" w:space="0" w:color="C9D3DE"/>
+              <w:right w:val="single" w:sz="6" w:space="0" w:color="C9D3DE"/>
+            </w:tcBorders>
+            <w:shd w:val="clear" w:color="auto" w:fill="FFFFFF"/>
+            <w:hideMark/>
+          </w:tcPr>
+          <w:p>
+            <w:pPr>
+              <w:spacing w:before="120" w:after="120"/>
+              <w:rPr>
+                <w:rFonts w:ascii="Calibri" w:eastAsia="Times New Roman" w:hAnsi="Calibri" w:cs="Calibri"/>
+                <w:sz w:val="20"/>
+                <w:szCs w:val="20"/>
+              </w:rPr>
+            </w:pPr>
+            <w:r>
+              <w:rPr>
+                <w:rFonts w:ascii="Calibri" w:eastAsia="Times New Roman" w:hAnsi="Calibri" w:cs="Calibri"/>
+                <w:b/>
+                <w:bCs/>
+                <w:color w:val="1F3A5F"/>
+                <w:sz w:val="20"/>
+                <w:szCs w:val="20"/>
+              </w:rPr>
+              <w:t>Vidéos</w:t>
+            </w:r>
+          </w:p>
+        </w:tc>
+        <w:tc>
+          <w:tcPr>
+            <w:tcW w:w="0" w:type="auto"/>
+            <w:tcBorders>
+              <w:top w:val="single" w:sz="6" w:space="0" w:color="C9D3DE"/>
+              <w:left w:val="single" w:sz="6" w:space="0" w:color="C9D3DE"/>
+              <w:bottom w:val="single" w:sz="6" w:space="0" w:color="C9D3DE"/>
+              <w:right w:val="single" w:sz="6" w:space="0" w:color="C9D3DE"/>
+            </w:tcBorders>
+            <w:shd w:val="clear" w:color="auto" w:fill="FFFFFF"/>
+            <w:hideMark/>
+          </w:tcPr>
+          <w:p>
+            <w:pPr>
+              <w:spacing w:before="120" w:after="120"/>
+              <w:rPr>
+                <w:rFonts w:ascii="Calibri" w:eastAsia="Times New Roman" w:hAnsi="Calibri" w:cs="Calibri"/>
+                <w:sz w:val="20"/>
+                <w:szCs w:val="20"/>
+              </w:rPr>
+            </w:pPr>
+            <w:r>
+              <w:rPr>
+                <w:rFonts w:ascii="Calibri" w:eastAsia="Times New Roman" w:hAnsi="Calibri" w:cs="Calibri"/>
+                <w:sz w:val="20"/>
+                <w:szCs w:val="20"/>
+              </w:rPr>
+              <w:t>Fichiers vidéo de chaque cours, dans un format courant (MP4 de préférence), avec leur titre. À préciser : qui les envoie sur le service de vidéos et à quelle date.</w:t>
+            </w:r>
+          </w:p>
+        </w:tc>
+      </w:tr>
+      <w:tr>
+        <w:tc>
+          <w:tcPr>
+            <w:tcW w:w="0" w:type="auto"/>
+            <w:tcBorders>
+              <w:top w:val="single" w:sz="6" w:space="0" w:color="C9D3DE"/>
+              <w:left w:val="single" w:sz="6" w:space="0" w:color="C9D3DE"/>
+              <w:bottom w:val="single" w:sz="6" w:space="0" w:color="C9D3DE"/>
+              <w:right w:val="single" w:sz="6" w:space="0" w:color="C9D3DE"/>
+            </w:tcBorders>
+            <w:shd w:val="clear" w:color="auto" w:fill="FFFFFF"/>
+            <w:hideMark/>
+          </w:tcPr>
+          <w:p>
+            <w:pPr>
+              <w:spacing w:before="120" w:after="120"/>
+              <w:rPr>
+                <w:rFonts w:ascii="Calibri" w:eastAsia="Times New Roman" w:hAnsi="Calibri" w:cs="Calibri"/>
+                <w:sz w:val="20"/>
+                <w:szCs w:val="20"/>
+              </w:rPr>
+            </w:pPr>
+            <w:r>
+              <w:rPr>
+                <w:rFonts w:ascii="Calibri" w:eastAsia="Times New Roman" w:hAnsi="Calibri" w:cs="Calibri"/>
+                <w:b/>
+                <w:bCs/>
+                <w:color w:val="1F3A5F"/>
+                <w:sz w:val="20"/>
+                <w:szCs w:val="20"/>
+              </w:rPr>
+              <w:t>Règle de fin de cours</w:t>
+            </w:r>
+          </w:p>
+        </w:tc>
+        <w:tc>
+          <w:tcPr>
+            <w:tcW w:w="0" w:type="auto"/>
+            <w:tcBorders>
+              <w:top w:val="single" w:sz="6" w:space="0" w:color="C9D3DE"/>
+              <w:left w:val="single" w:sz="6" w:space="0" w:color="C9D3DE"/>
+              <w:bottom w:val="single" w:sz="6" w:space="0" w:color="C9D3DE"/>
+              <w:right w:val="single" w:sz="6" w:space="0" w:color="C9D3DE"/>
+            </w:tcBorders>
+            <w:shd w:val="clear" w:color="auto" w:fill="FFFFFF"/>
+            <w:hideMark/>
+          </w:tcPr>
+          <w:p>
+            <w:pPr>
+              <w:spacing w:before="120" w:after="120"/>
+              <w:rPr>
+                <w:rFonts w:ascii="Calibri" w:eastAsia="Times New Roman" w:hAnsi="Calibri" w:cs="Calibri"/>
+                <w:sz w:val="20"/>
+                <w:szCs w:val="20"/>
+              </w:rPr>
+            </w:pPr>
+            <w:r>
+              <w:rPr>
+                <w:rFonts w:ascii="Calibri" w:eastAsia="Times New Roman" w:hAnsi="Calibri" w:cs="Calibri"/>
+                <w:sz w:val="20"/>
+                <w:szCs w:val="20"/>
+              </w:rPr>
+              <w:t>À quel moment un cours est considéré comme terminé (par exemple, vidéo regardée jusqu'au bout) et donne droit au certificat</w:t>
+            </w:r>
+          </w:p>
+        </w:tc>
+      </w:tr>
+      <w:tr>
+        <w:tc>
+          <w:tcPr>
+            <w:tcW w:w="0" w:type="auto"/>
+            <w:tcBorders>
+              <w:top w:val="single" w:sz="6" w:space="0" w:color="C9D3DE"/>
+              <w:left w:val="single" w:sz="6" w:space="0" w:color="C9D3DE"/>
+              <w:bottom w:val="single" w:sz="6" w:space="0" w:color="C9D3DE"/>
+              <w:right w:val="single" w:sz="6" w:space="0" w:color="C9D3DE"/>
+            </w:tcBorders>
+            <w:shd w:val="clear" w:color="auto" w:fill="FFFFFF"/>
+            <w:hideMark/>
+          </w:tcPr>
+          <w:p>
+            <w:pPr>
+              <w:spacing w:before="120" w:after="120"/>
+              <w:rPr>
+                <w:rFonts w:ascii="Calibri" w:eastAsia="Times New Roman" w:hAnsi="Calibri" w:cs="Calibri"/>
+                <w:sz w:val="20"/>
+                <w:szCs w:val="20"/>
+              </w:rPr>
+            </w:pPr>
+            <w:r>
+              <w:rPr>
+                <w:rFonts w:ascii="Calibri" w:eastAsia="Times New Roman" w:hAnsi="Calibri" w:cs="Calibri"/>
+                <w:b/>
+                <w:bCs/>
+                <w:color w:val="1F3A5F"/>
+                <w:sz w:val="20"/>
+                <w:szCs w:val="20"/>
+              </w:rPr>
+              <w:t>Modèle de certificat</w:t>
+            </w:r>
+          </w:p>
+        </w:tc>
+        <w:tc>
+          <w:tcPr>
+            <w:tcW w:w="0" w:type="auto"/>
+            <w:tcBorders>
+              <w:top w:val="single" w:sz="6" w:space="0" w:color="C9D3DE"/>
+              <w:left w:val="single" w:sz="6" w:space="0" w:color="C9D3DE"/>
+              <w:bottom w:val="single" w:sz="6" w:space="0" w:color="C9D3DE"/>
+              <w:right w:val="single" w:sz="6" w:space="0" w:color="C9D3DE"/>
+            </w:tcBorders>
+            <w:shd w:val="clear" w:color="auto" w:fill="FFFFFF"/>
+            <w:hideMark/>
+          </w:tcPr>
+          <w:p>
+            <w:pPr>
+              <w:spacing w:before="120" w:after="120"/>
+              <w:rPr>
+                <w:rFonts w:ascii="Calibri" w:eastAsia="Times New Roman" w:hAnsi="Calibri" w:cs="Calibri"/>
+                <w:sz w:val="20"/>
+                <w:szCs w:val="20"/>
+              </w:rPr>
+            </w:pPr>
+            <w:r>
+              <w:rPr>
+                <w:rFonts w:ascii="Calibri" w:eastAsia="Times New Roman" w:hAnsi="Calibri" w:cs="Calibri"/>
+                <w:sz w:val="20"/>
+                <w:szCs w:val="20"/>
+              </w:rPr>
+              <w:t>Texte, logo, nom et signature de la personne qui signe, mise en page souhaitée, règle de numérotation</w:t>
+            </w:r>
+          </w:p>
+        </w:tc>
+      </w:tr>
+      <w:tr>
+        <w:tc>
+          <w:tcPr>
+            <w:tcW w:w="0" w:type="auto"/>
+            <w:tcBorders>
+              <w:top w:val="single" w:sz="6" w:space="0" w:color="C9D3DE"/>
+              <w:left w:val="single" w:sz="6" w:space="0" w:color="C9D3DE"/>
+              <w:bottom w:val="single" w:sz="6" w:space="0" w:color="C9D3DE"/>
+              <w:right w:val="single" w:sz="6" w:space="0" w:color="C9D3DE"/>
+            </w:tcBorders>
+            <w:shd w:val="clear" w:color="auto" w:fill="FFFFFF"/>
+            <w:hideMark/>
+          </w:tcPr>
+          <w:p>
+            <w:pPr>
+              <w:spacing w:before="120" w:after="120"/>
+              <w:rPr>
+                <w:rFonts w:ascii="Calibri" w:eastAsia="Times New Roman" w:hAnsi="Calibri" w:cs="Calibri"/>
+                <w:sz w:val="20"/>
+                <w:szCs w:val="20"/>
+              </w:rPr>
+            </w:pPr>
+            <w:r>
+              <w:rPr>
+                <w:rFonts w:ascii="Calibri" w:eastAsia="Times New Roman" w:hAnsi="Calibri" w:cs="Calibri"/>
+                <w:b/>
+                <w:bCs/>
+                <w:color w:val="1F3A5F"/>
+                <w:sz w:val="20"/>
+                <w:szCs w:val="20"/>
+              </w:rPr>
+              <w:t>Étudiants existants</w:t>
+            </w:r>
+          </w:p>
+        </w:tc>
+        <w:tc>
+          <w:tcPr>
+            <w:tcW w:w="0" w:type="auto"/>
+            <w:tcBorders>
+              <w:top w:val="single" w:sz="6" w:space="0" w:color="C9D3DE"/>
+              <w:left w:val="single" w:sz="6" w:space="0" w:color="C9D3DE"/>
+              <w:bottom w:val="single" w:sz="6" w:space="0" w:color="C9D3DE"/>
+              <w:right w:val="single" w:sz="6" w:space="0" w:color="C9D3DE"/>
+            </w:tcBorders>
+            <w:shd w:val="clear" w:color="auto" w:fill="FFFFFF"/>
+            <w:hideMark/>
+          </w:tcPr>
+          <w:p>
+            <w:pPr>
+              <w:spacing w:before="120" w:after="120"/>
+              <w:rPr>
+                <w:rFonts w:ascii="Calibri" w:eastAsia="Times New Roman" w:hAnsi="Calibri" w:cs="Calibri"/>
+                <w:sz w:val="20"/>
+                <w:szCs w:val="20"/>
+              </w:rPr>
+            </w:pPr>
+            <w:r>
+              <w:rPr>
+                <w:rFonts w:ascii="Calibri" w:eastAsia="Times New Roman" w:hAnsi="Calibri" w:cs="Calibri"/>
+                <w:sz w:val="20"/>
+                <w:szCs w:val="20"/>
+              </w:rPr>
+              <w:t>Liste des personnes à inscrire dès le départ (nom, email, cours concernés), si elle existe</w:t>
+            </w:r>
+          </w:p>
+        </w:tc>
+      </w:tr>
+      <w:tr>
+        <w:tc>
+          <w:tcPr>
+            <w:tcW w:w="0" w:type="auto"/>
+            <w:tcBorders>
+              <w:top w:val="single" w:sz="6" w:space="0" w:color="C9D3DE"/>
+              <w:left w:val="single" w:sz="6" w:space="0" w:color="C9D3DE"/>
+              <w:bottom w:val="single" w:sz="6" w:space="0" w:color="C9D3DE"/>
+              <w:right w:val="single" w:sz="6" w:space="0" w:color="C9D3DE"/>
+            </w:tcBorders>
+            <w:shd w:val="clear" w:color="auto" w:fill="FFFFFF"/>
+            <w:hideMark/>
+          </w:tcPr>
+          <w:p>
+            <w:pPr>
+              <w:spacing w:before="120" w:after="120"/>
+              <w:rPr>
+                <w:rFonts w:ascii="Calibri" w:eastAsia="Times New Roman" w:hAnsi="Calibri" w:cs="Calibri"/>
+                <w:sz w:val="20"/>
+                <w:szCs w:val="20"/>
+              </w:rPr>
+            </w:pPr>
+            <w:r>
+              <w:rPr>
+                <w:rFonts w:ascii="Calibri" w:eastAsia="Times New Roman" w:hAnsi="Calibri" w:cs="Calibri"/>
+                <w:b/>
+                <w:bCs/>
+                <w:color w:val="1F3A5F"/>
+                <w:sz w:val="20"/>
+                <w:szCs w:val="20"/>
+              </w:rPr>
+              <w:t>Règles d'accès</w:t>
+            </w:r>
+          </w:p>
+        </w:tc>
+        <w:tc>
+          <w:tcPr>
+            <w:tcW w:w="0" w:type="auto"/>
+            <w:tcBorders>
+              <w:top w:val="single" w:sz="6" w:space="0" w:color="C9D3DE"/>
+              <w:left w:val="single" w:sz="6" w:space="0" w:color="C9D3DE"/>
+              <w:bottom w:val="single" w:sz="6" w:space="0" w:color="C9D3DE"/>
+              <w:right w:val="single" w:sz="6" w:space="0" w:color="C9D3DE"/>
+            </w:tcBorders>
+            <w:shd w:val="clear" w:color="auto" w:fill="FFFFFF"/>
+            <w:hideMark/>
+          </w:tcPr>
+          <w:p>
+            <w:pPr>
+              <w:spacing w:before="120" w:after="120"/>
+              <w:rPr>
+                <w:rFonts w:ascii="Calibri" w:eastAsia="Times New Roman" w:hAnsi="Calibri" w:cs="Calibri"/>
+                <w:sz w:val="20"/>
+                <w:szCs w:val="20"/>
+              </w:rPr>
+            </w:pPr>
+            <w:r>
+              <w:rPr>
+                <w:rFonts w:ascii="Calibri" w:eastAsia="Times New Roman" w:hAnsi="Calibri" w:cs="Calibri"/>
+                <w:sz w:val="20"/>
+                <w:szCs w:val="20"/>
+              </w:rPr>
+              <w:t>Durée de l'accès à un cours, conditions pour retirer une inscription, conduite à tenir en cas d'abandon</w:t>
+            </w:r>
+          </w:p>
+        </w:tc>
+      </w:tr>
+    </w:tbl>
+    <w:p>
+      <w:pPr>
+        <w:pStyle w:val="NormalWeb"/>
+        <w:spacing w:beforeAutospacing="0" w:afterAutospacing="0" w:line="324" w:lineRule="auto"/>
+        <w:rPr>
+          <w:rFonts w:ascii="Calibri" w:hAnsi="Calibri" w:cs="Calibri"/>
+          <w:sz w:val="21"/>
+          <w:szCs w:val="21"/>
+        </w:rPr>
+      </w:pPr>
+      <w:r>
+        <w:rPr>
+          <w:rFonts w:ascii="Calibri" w:hAnsi="Calibri" w:cs="Calibri"/>
+          <w:b/>
+          <w:bCs/>
+          <w:sz w:val="21"/>
+          <w:szCs w:val="21"/>
+        </w:rPr>
+        <w:t xml:space="preserve"> </w:t>
+      </w:r>
+    </w:p>
+    <w:p>
+      <w:pPr>
+        <w:pStyle w:val="Titre2"/>
+        <w:spacing w:before="240" w:beforeAutospacing="0" w:after="80" w:afterAutospacing="0"/>
+        <w:rPr>
+          <w:rFonts w:ascii="Calibri" w:eastAsia="Times New Roman" w:hAnsi="Calibri" w:cs="Calibri"/>
+          <w:color w:val="E8833A"/>
+          <w:sz w:val="26"/>
+          <w:szCs w:val="26"/>
+        </w:rPr>
+      </w:pPr>
+      <w:r>
+        <w:rPr>
+          <w:rFonts w:ascii="Calibri" w:eastAsia="Times New Roman" w:hAnsi="Calibri" w:cs="Calibri"/>
+          <w:color w:val="E8833A"/>
+          <w:sz w:val="26"/>
+          <w:szCs w:val="26"/>
+        </w:rPr>
+        <w:t xml:space="preserve">6. Réunions et directs</w:t>
+      </w:r>
+    </w:p>
+    <w:tbl>
+      <w:tblPr>
+        <w:tblW w:w="5000" w:type="pct"/>
+        <w:tblCellMar>
+          <w:top w:w="60" w:type="dxa"/>
+          <w:left w:w="60" w:type="dxa"/>
+          <w:bottom w:w="60" w:type="dxa"/>
+          <w:right w:w="60" w:type="dxa"/>
+        </w:tblCellMar>
+        <w:tblLook w:val="04A0" w:firstRow="1" w:lastRow="0" w:firstColumn="1" w:lastColumn="0" w:noHBand="0" w:noVBand="1"/>
+      </w:tblPr>
+      <w:tblGrid>
+        <w:gridCol w:w="2364"/>
+        <w:gridCol w:w="7485"/>
+      </w:tblGrid>
+      <w:tr>
+        <w:tc>
+          <w:tcPr>
+            <w:tcW w:w="1200" w:type="pct"/>
+            <w:tcBorders>
+              <w:top w:val="single" w:sz="6" w:space="0" w:color="1F3A5F"/>
+              <w:left w:val="single" w:sz="6" w:space="0" w:color="1F3A5F"/>
+              <w:bottom w:val="single" w:sz="6" w:space="0" w:color="1F3A5F"/>
+              <w:right w:val="single" w:sz="6" w:space="0" w:color="1F3A5F"/>
+            </w:tcBorders>
+            <w:shd w:val="clear" w:color="auto" w:fill="1F3A5F"/>
+            <w:vAlign w:val="center"/>
+            <w:hideMark/>
+          </w:tcPr>
+          <w:p>
+            <w:pPr>
+              <w:spacing w:before="120" w:after="120"/>
+              <w:rPr>
+                <w:rFonts w:ascii="Calibri" w:eastAsia="Times New Roman" w:hAnsi="Calibri" w:cs="Calibri"/>
+                <w:sz w:val="21"/>
+                <w:szCs w:val="21"/>
+              </w:rPr>
+            </w:pPr>
+            <w:r>
+              <w:rPr>
+                <w:rFonts w:ascii="Calibri" w:eastAsia="Times New Roman" w:hAnsi="Calibri" w:cs="Calibri"/>
+                <w:b/>
+                <w:bCs/>
+                <w:color w:val="FFFFFF"/>
+                <w:sz w:val="21"/>
+                <w:szCs w:val="21"/>
+              </w:rPr>
+              <w:t>Élément à fournir</w:t>
+            </w:r>
+          </w:p>
+        </w:tc>
+        <w:tc>
+          <w:tcPr>
+            <w:tcW w:w="3800" w:type="pct"/>
+            <w:tcBorders>
+              <w:top w:val="single" w:sz="6" w:space="0" w:color="1F3A5F"/>
+              <w:left w:val="single" w:sz="6" w:space="0" w:color="1F3A5F"/>
+              <w:bottom w:val="single" w:sz="6" w:space="0" w:color="1F3A5F"/>
+              <w:right w:val="single" w:sz="6" w:space="0" w:color="1F3A5F"/>
+            </w:tcBorders>
+            <w:shd w:val="clear" w:color="auto" w:fill="1F3A5F"/>
+            <w:vAlign w:val="center"/>
+            <w:hideMark/>
+          </w:tcPr>
+          <w:p>
+            <w:pPr>
+              <w:spacing w:before="120" w:after="120"/>
+              <w:rPr>
+                <w:rFonts w:ascii="Calibri" w:eastAsia="Times New Roman" w:hAnsi="Calibri" w:cs="Calibri"/>
+                <w:sz w:val="21"/>
+                <w:szCs w:val="21"/>
+              </w:rPr>
+            </w:pPr>
+            <w:r>
+              <w:rPr>
+                <w:rFonts w:ascii="Calibri" w:eastAsia="Times New Roman" w:hAnsi="Calibri" w:cs="Calibri"/>
+                <w:b/>
+                <w:bCs/>
+                <w:color w:val="FFFFFF"/>
+                <w:sz w:val="21"/>
+                <w:szCs w:val="21"/>
+              </w:rPr>
+              <w:t>Précision</w:t>
+            </w:r>
+          </w:p>
+        </w:tc>
+      </w:tr>
+      <w:tr>
+        <w:tc>
+          <w:tcPr>
+            <w:tcW w:w="0" w:type="auto"/>
+            <w:tcBorders>
+              <w:top w:val="single" w:sz="6" w:space="0" w:color="C9D3DE"/>
+              <w:left w:val="single" w:sz="6" w:space="0" w:color="C9D3DE"/>
+              <w:bottom w:val="single" w:sz="6" w:space="0" w:color="C9D3DE"/>
+              <w:right w:val="single" w:sz="6" w:space="0" w:color="C9D3DE"/>
+            </w:tcBorders>
+            <w:shd w:val="clear" w:color="auto" w:fill="FFFFFF"/>
+            <w:hideMark/>
+          </w:tcPr>
+          <w:p>
+            <w:pPr>
+              <w:spacing w:before="120" w:after="120"/>
+              <w:rPr>
+                <w:rFonts w:ascii="Calibri" w:eastAsia="Times New Roman" w:hAnsi="Calibri" w:cs="Calibri"/>
+                <w:sz w:val="20"/>
+                <w:szCs w:val="20"/>
+              </w:rPr>
+            </w:pPr>
+            <w:r>
+              <w:rPr>
+                <w:rFonts w:ascii="Calibri" w:eastAsia="Times New Roman" w:hAnsi="Calibri" w:cs="Calibri"/>
+                <w:b/>
+                <w:bCs/>
+                <w:color w:val="1F3A5F"/>
+                <w:sz w:val="20"/>
+                <w:szCs w:val="20"/>
+              </w:rPr>
+              <w:t>Usage prévu</w:t>
+            </w:r>
+          </w:p>
+        </w:tc>
+        <w:tc>
+          <w:tcPr>
+            <w:tcW w:w="0" w:type="auto"/>
+            <w:tcBorders>
+              <w:top w:val="single" w:sz="6" w:space="0" w:color="C9D3DE"/>
+              <w:left w:val="single" w:sz="6" w:space="0" w:color="C9D3DE"/>
+              <w:bottom w:val="single" w:sz="6" w:space="0" w:color="C9D3DE"/>
+              <w:right w:val="single" w:sz="6" w:space="0" w:color="C9D3DE"/>
+            </w:tcBorders>
+            <w:shd w:val="clear" w:color="auto" w:fill="FFFFFF"/>
+            <w:hideMark/>
+          </w:tcPr>
+          <w:p>
+            <w:pPr>
+              <w:spacing w:before="120" w:after="120"/>
+              <w:rPr>
+                <w:rFonts w:ascii="Calibri" w:eastAsia="Times New Roman" w:hAnsi="Calibri" w:cs="Calibri"/>
+                <w:sz w:val="20"/>
+                <w:szCs w:val="20"/>
+              </w:rPr>
+            </w:pPr>
+            <w:r>
+              <w:rPr>
+                <w:rFonts w:ascii="Calibri" w:eastAsia="Times New Roman" w:hAnsi="Calibri" w:cs="Calibri"/>
+                <w:sz w:val="20"/>
+                <w:szCs w:val="20"/>
+              </w:rPr>
+              <w:t>Nombre de participants par séance, nombre de séances en même temps, durée habituelle, fréquence</w:t>
+            </w:r>
+          </w:p>
+        </w:tc>
+      </w:tr>
+      <w:tr>
+        <w:tc>
+          <w:tcPr>
+            <w:tcW w:w="0" w:type="auto"/>
+            <w:tcBorders>
+              <w:top w:val="single" w:sz="6" w:space="0" w:color="C9D3DE"/>
+              <w:left w:val="single" w:sz="6" w:space="0" w:color="C9D3DE"/>
+              <w:bottom w:val="single" w:sz="6" w:space="0" w:color="C9D3DE"/>
+              <w:right w:val="single" w:sz="6" w:space="0" w:color="C9D3DE"/>
+            </w:tcBorders>
+            <w:shd w:val="clear" w:color="auto" w:fill="FFFFFF"/>
+            <w:hideMark/>
+          </w:tcPr>
+          <w:p>
+            <w:pPr>
+              <w:spacing w:before="120" w:after="120"/>
+              <w:rPr>
+                <w:rFonts w:ascii="Calibri" w:eastAsia="Times New Roman" w:hAnsi="Calibri" w:cs="Calibri"/>
+                <w:sz w:val="20"/>
+                <w:szCs w:val="20"/>
+              </w:rPr>
+            </w:pPr>
+            <w:r>
+              <w:rPr>
+                <w:rFonts w:ascii="Calibri" w:eastAsia="Times New Roman" w:hAnsi="Calibri" w:cs="Calibri"/>
+                <w:b/>
+                <w:bCs/>
+                <w:color w:val="1F3A5F"/>
+                <w:sz w:val="20"/>
+                <w:szCs w:val="20"/>
+              </w:rPr>
+              <w:t>Organisateurs</w:t>
+            </w:r>
+          </w:p>
+        </w:tc>
+        <w:tc>
+          <w:tcPr>
+            <w:tcW w:w="0" w:type="auto"/>
+            <w:tcBorders>
+              <w:top w:val="single" w:sz="6" w:space="0" w:color="C9D3DE"/>
+              <w:left w:val="single" w:sz="6" w:space="0" w:color="C9D3DE"/>
+              <w:bottom w:val="single" w:sz="6" w:space="0" w:color="C9D3DE"/>
+              <w:right w:val="single" w:sz="6" w:space="0" w:color="C9D3DE"/>
+            </w:tcBorders>
+            <w:shd w:val="clear" w:color="auto" w:fill="FFFFFF"/>
+            <w:hideMark/>
+          </w:tcPr>
+          <w:p>
+            <w:pPr>
+              <w:spacing w:before="120" w:after="120"/>
+              <w:rPr>
+                <w:rFonts w:ascii="Calibri" w:eastAsia="Times New Roman" w:hAnsi="Calibri" w:cs="Calibri"/>
+                <w:sz w:val="20"/>
+                <w:szCs w:val="20"/>
+              </w:rPr>
+            </w:pPr>
+            <w:r>
+              <w:rPr>
+                <w:rFonts w:ascii="Calibri" w:eastAsia="Times New Roman" w:hAnsi="Calibri" w:cs="Calibri"/>
+                <w:sz w:val="20"/>
+                <w:szCs w:val="20"/>
+              </w:rPr>
+              <w:t>Qui peut créer et animer une séance, et qui peut seulement y participer</w:t>
+            </w:r>
+          </w:p>
+        </w:tc>
+      </w:tr>
+      <w:tr>
+        <w:tc>
+          <w:tcPr>
+            <w:tcW w:w="0" w:type="auto"/>
+            <w:tcBorders>
+              <w:top w:val="single" w:sz="6" w:space="0" w:color="C9D3DE"/>
+              <w:left w:val="single" w:sz="6" w:space="0" w:color="C9D3DE"/>
+              <w:bottom w:val="single" w:sz="6" w:space="0" w:color="C9D3DE"/>
+              <w:right w:val="single" w:sz="6" w:space="0" w:color="C9D3DE"/>
+            </w:tcBorders>
+            <w:shd w:val="clear" w:color="auto" w:fill="FFFFFF"/>
+            <w:hideMark/>
+          </w:tcPr>
+          <w:p>
+            <w:pPr>
+              <w:spacing w:before="120" w:after="120"/>
+              <w:rPr>
+                <w:rFonts w:ascii="Calibri" w:eastAsia="Times New Roman" w:hAnsi="Calibri" w:cs="Calibri"/>
+                <w:sz w:val="20"/>
+                <w:szCs w:val="20"/>
+              </w:rPr>
+            </w:pPr>
+            <w:r>
+              <w:rPr>
+                <w:rFonts w:ascii="Calibri" w:eastAsia="Times New Roman" w:hAnsi="Calibri" w:cs="Calibri"/>
+                <w:b/>
+                <w:bCs/>
+                <w:color w:val="1F3A5F"/>
+                <w:sz w:val="20"/>
+                <w:szCs w:val="20"/>
+              </w:rPr>
+              <w:t>Règles de la salle d'attente</w:t>
+            </w:r>
+          </w:p>
+        </w:tc>
+        <w:tc>
+          <w:tcPr>
+            <w:tcW w:w="0" w:type="auto"/>
+            <w:tcBorders>
+              <w:top w:val="single" w:sz="6" w:space="0" w:color="C9D3DE"/>
+              <w:left w:val="single" w:sz="6" w:space="0" w:color="C9D3DE"/>
+              <w:bottom w:val="single" w:sz="6" w:space="0" w:color="C9D3DE"/>
+              <w:right w:val="single" w:sz="6" w:space="0" w:color="C9D3DE"/>
+            </w:tcBorders>
+            <w:shd w:val="clear" w:color="auto" w:fill="FFFFFF"/>
+            <w:hideMark/>
+          </w:tcPr>
+          <w:p>
+            <w:pPr>
+              <w:spacing w:before="120" w:after="120"/>
+              <w:rPr>
+                <w:rFonts w:ascii="Calibri" w:eastAsia="Times New Roman" w:hAnsi="Calibri" w:cs="Calibri"/>
+                <w:sz w:val="20"/>
+                <w:szCs w:val="20"/>
+              </w:rPr>
+            </w:pPr>
+            <w:r>
+              <w:rPr>
+                <w:rFonts w:ascii="Calibri" w:eastAsia="Times New Roman" w:hAnsi="Calibri" w:cs="Calibri"/>
+                <w:sz w:val="20"/>
+                <w:szCs w:val="20"/>
+              </w:rPr>
+              <w:t>Entrée un par un ou tous ensemble, par défaut, selon le type de séance</w:t>
+            </w:r>
+          </w:p>
+        </w:tc>
+      </w:tr>
+    </w:tbl>
+    <w:p>
+      <w:pPr>
+        <w:pStyle w:val="NormalWeb"/>
+        <w:spacing w:beforeAutospacing="0" w:afterAutospacing="0" w:line="324" w:lineRule="auto"/>
+        <w:rPr>
+          <w:rFonts w:ascii="Calibri" w:hAnsi="Calibri" w:cs="Calibri"/>
+          <w:sz w:val="21"/>
+          <w:szCs w:val="21"/>
+        </w:rPr>
+      </w:pPr>
+      <w:r>
+        <w:rPr>
+          <w:rFonts w:ascii="Calibri" w:hAnsi="Calibri" w:cs="Calibri"/>
+          <w:b/>
+          <w:bCs/>
+          <w:sz w:val="21"/>
+          <w:szCs w:val="21"/>
+        </w:rPr>
+        <w:t xml:space="preserve"> </w:t>
+      </w:r>
+    </w:p>
+    <w:p>
+      <w:pPr>
+        <w:pStyle w:val="Titre2"/>
+        <w:spacing w:before="240" w:beforeAutospacing="0" w:after="80" w:afterAutospacing="0"/>
+        <w:rPr>
+          <w:rFonts w:ascii="Calibri" w:eastAsia="Times New Roman" w:hAnsi="Calibri" w:cs="Calibri"/>
+          <w:color w:val="E8833A"/>
+          <w:sz w:val="26"/>
+          <w:szCs w:val="26"/>
+        </w:rPr>
+      </w:pPr>
+      <w:r>
+        <w:rPr>
+          <w:rFonts w:ascii="Calibri" w:eastAsia="Times New Roman" w:hAnsi="Calibri" w:cs="Calibri"/>
+          <w:color w:val="E8833A"/>
+          <w:sz w:val="26"/>
+          <w:szCs w:val="26"/>
+        </w:rPr>
+        <w:t xml:space="preserve">7. Votre équipe et ses droits</w:t>
+      </w:r>
+    </w:p>
+    <w:tbl>
+      <w:tblPr>
+        <w:tblW w:w="5000" w:type="pct"/>
+        <w:tblCellMar>
+          <w:top w:w="60" w:type="dxa"/>
+          <w:left w:w="60" w:type="dxa"/>
+          <w:bottom w:w="60" w:type="dxa"/>
+          <w:right w:w="60" w:type="dxa"/>
+        </w:tblCellMar>
+        <w:tblLook w:val="04A0" w:firstRow="1" w:lastRow="0" w:firstColumn="1" w:lastColumn="0" w:noHBand="0" w:noVBand="1"/>
+      </w:tblPr>
+      <w:tblGrid>
+        <w:gridCol w:w="2364"/>
+        <w:gridCol w:w="7485"/>
+      </w:tblGrid>
+      <w:tr>
+        <w:tc>
+          <w:tcPr>
+            <w:tcW w:w="1200" w:type="pct"/>
+            <w:tcBorders>
+              <w:top w:val="single" w:sz="6" w:space="0" w:color="1F3A5F"/>
+              <w:left w:val="single" w:sz="6" w:space="0" w:color="1F3A5F"/>
+              <w:bottom w:val="single" w:sz="6" w:space="0" w:color="1F3A5F"/>
+              <w:right w:val="single" w:sz="6" w:space="0" w:color="1F3A5F"/>
+            </w:tcBorders>
+            <w:shd w:val="clear" w:color="auto" w:fill="1F3A5F"/>
+            <w:vAlign w:val="center"/>
+            <w:hideMark/>
+          </w:tcPr>
+          <w:p>
+            <w:pPr>
+              <w:spacing w:before="120" w:after="120"/>
+              <w:rPr>
+                <w:rFonts w:ascii="Calibri" w:eastAsia="Times New Roman" w:hAnsi="Calibri" w:cs="Calibri"/>
+                <w:sz w:val="21"/>
+                <w:szCs w:val="21"/>
+              </w:rPr>
+            </w:pPr>
+            <w:r>
+              <w:rPr>
+                <w:rFonts w:ascii="Calibri" w:eastAsia="Times New Roman" w:hAnsi="Calibri" w:cs="Calibri"/>
+                <w:b/>
+                <w:bCs/>
+                <w:color w:val="FFFFFF"/>
+                <w:sz w:val="21"/>
+                <w:szCs w:val="21"/>
+              </w:rPr>
+              <w:t>Élément à fournir</w:t>
+            </w:r>
+          </w:p>
+        </w:tc>
+        <w:tc>
+          <w:tcPr>
+            <w:tcW w:w="3800" w:type="pct"/>
+            <w:tcBorders>
+              <w:top w:val="single" w:sz="6" w:space="0" w:color="1F3A5F"/>
+              <w:left w:val="single" w:sz="6" w:space="0" w:color="1F3A5F"/>
+              <w:bottom w:val="single" w:sz="6" w:space="0" w:color="1F3A5F"/>
+              <w:right w:val="single" w:sz="6" w:space="0" w:color="1F3A5F"/>
+            </w:tcBorders>
+            <w:shd w:val="clear" w:color="auto" w:fill="1F3A5F"/>
+            <w:vAlign w:val="center"/>
+            <w:hideMark/>
+          </w:tcPr>
+          <w:p>
+            <w:pPr>
+              <w:spacing w:before="120" w:after="120"/>
+              <w:rPr>
+                <w:rFonts w:ascii="Calibri" w:eastAsia="Times New Roman" w:hAnsi="Calibri" w:cs="Calibri"/>
+                <w:sz w:val="21"/>
+                <w:szCs w:val="21"/>
+              </w:rPr>
+            </w:pPr>
+            <w:r>
+              <w:rPr>
+                <w:rFonts w:ascii="Calibri" w:eastAsia="Times New Roman" w:hAnsi="Calibri" w:cs="Calibri"/>
+                <w:b/>
+                <w:bCs/>
+                <w:color w:val="FFFFFF"/>
+                <w:sz w:val="21"/>
+                <w:szCs w:val="21"/>
+              </w:rPr>
+              <w:t>Précision</w:t>
+            </w:r>
+          </w:p>
+        </w:tc>
+      </w:tr>
+      <w:tr>
+        <w:tc>
+          <w:tcPr>
+            <w:tcW w:w="0" w:type="auto"/>
+            <w:tcBorders>
+              <w:top w:val="single" w:sz="6" w:space="0" w:color="C9D3DE"/>
+              <w:left w:val="single" w:sz="6" w:space="0" w:color="C9D3DE"/>
+              <w:bottom w:val="single" w:sz="6" w:space="0" w:color="C9D3DE"/>
+              <w:right w:val="single" w:sz="6" w:space="0" w:color="C9D3DE"/>
+            </w:tcBorders>
+            <w:shd w:val="clear" w:color="auto" w:fill="FFFFFF"/>
+            <w:hideMark/>
+          </w:tcPr>
+          <w:p>
+            <w:pPr>
+              <w:spacing w:before="120" w:after="120"/>
+              <w:rPr>
+                <w:rFonts w:ascii="Calibri" w:eastAsia="Times New Roman" w:hAnsi="Calibri" w:cs="Calibri"/>
+                <w:sz w:val="20"/>
+                <w:szCs w:val="20"/>
+              </w:rPr>
+            </w:pPr>
+            <w:r>
+              <w:rPr>
+                <w:rFonts w:ascii="Calibri" w:eastAsia="Times New Roman" w:hAnsi="Calibri" w:cs="Calibri"/>
+                <w:b/>
+                <w:bCs/>
+                <w:color w:val="1F3A5F"/>
+                <w:sz w:val="20"/>
+                <w:szCs w:val="20"/>
+              </w:rPr>
+              <w:t>Liste des membres de l'équipe</w:t>
+            </w:r>
+          </w:p>
+        </w:tc>
+        <w:tc>
+          <w:tcPr>
+            <w:tcW w:w="0" w:type="auto"/>
+            <w:tcBorders>
+              <w:top w:val="single" w:sz="6" w:space="0" w:color="C9D3DE"/>
+              <w:left w:val="single" w:sz="6" w:space="0" w:color="C9D3DE"/>
+              <w:bottom w:val="single" w:sz="6" w:space="0" w:color="C9D3DE"/>
+              <w:right w:val="single" w:sz="6" w:space="0" w:color="C9D3DE"/>
+            </w:tcBorders>
+            <w:shd w:val="clear" w:color="auto" w:fill="FFFFFF"/>
+            <w:hideMark/>
+          </w:tcPr>
+          <w:p>
+            <w:pPr>
+              <w:spacing w:before="120" w:after="120"/>
+              <w:rPr>
+                <w:rFonts w:ascii="Calibri" w:eastAsia="Times New Roman" w:hAnsi="Calibri" w:cs="Calibri"/>
+                <w:sz w:val="20"/>
+                <w:szCs w:val="20"/>
+              </w:rPr>
+            </w:pPr>
+            <w:r>
+              <w:rPr>
+                <w:rFonts w:ascii="Calibri" w:eastAsia="Times New Roman" w:hAnsi="Calibri" w:cs="Calibri"/>
+                <w:sz w:val="20"/>
+                <w:szCs w:val="20"/>
+              </w:rPr>
+              <w:t>Nom, email et rôle de chaque personne qui utilisera l'espace de gestion</w:t>
+            </w:r>
+          </w:p>
+        </w:tc>
+      </w:tr>
+      <w:tr>
+        <w:tc>
+          <w:tcPr>
+            <w:tcW w:w="0" w:type="auto"/>
+            <w:tcBorders>
+              <w:top w:val="single" w:sz="6" w:space="0" w:color="C9D3DE"/>
+              <w:left w:val="single" w:sz="6" w:space="0" w:color="C9D3DE"/>
+              <w:bottom w:val="single" w:sz="6" w:space="0" w:color="C9D3DE"/>
+              <w:right w:val="single" w:sz="6" w:space="0" w:color="C9D3DE"/>
+            </w:tcBorders>
+            <w:shd w:val="clear" w:color="auto" w:fill="FFFFFF"/>
+            <w:hideMark/>
+          </w:tcPr>
+          <w:p>
+            <w:pPr>
+              <w:spacing w:before="120" w:after="120"/>
+              <w:rPr>
+                <w:rFonts w:ascii="Calibri" w:eastAsia="Times New Roman" w:hAnsi="Calibri" w:cs="Calibri"/>
+                <w:sz w:val="20"/>
+                <w:szCs w:val="20"/>
+              </w:rPr>
+            </w:pPr>
+            <w:r>
+              <w:rPr>
+                <w:rFonts w:ascii="Calibri" w:eastAsia="Times New Roman" w:hAnsi="Calibri" w:cs="Calibri"/>
+                <w:b/>
+                <w:bCs/>
+                <w:color w:val="1F3A5F"/>
+                <w:sz w:val="20"/>
+                <w:szCs w:val="20"/>
+              </w:rPr>
+              <w:t>Droits de chacun</w:t>
+            </w:r>
+          </w:p>
+        </w:tc>
+        <w:tc>
+          <w:tcPr>
+            <w:tcW w:w="0" w:type="auto"/>
+            <w:tcBorders>
+              <w:top w:val="single" w:sz="6" w:space="0" w:color="C9D3DE"/>
+              <w:left w:val="single" w:sz="6" w:space="0" w:color="C9D3DE"/>
+              <w:bottom w:val="single" w:sz="6" w:space="0" w:color="C9D3DE"/>
+              <w:right w:val="single" w:sz="6" w:space="0" w:color="C9D3DE"/>
+            </w:tcBorders>
+            <w:shd w:val="clear" w:color="auto" w:fill="FFFFFF"/>
+            <w:hideMark/>
+          </w:tcPr>
+          <w:p>
+            <w:pPr>
+              <w:spacing w:before="120" w:after="120"/>
+              <w:rPr>
+                <w:rFonts w:ascii="Calibri" w:eastAsia="Times New Roman" w:hAnsi="Calibri" w:cs="Calibri"/>
+                <w:sz w:val="20"/>
+                <w:szCs w:val="20"/>
+              </w:rPr>
+            </w:pPr>
+            <w:r>
+              <w:rPr>
+                <w:rFonts w:ascii="Calibri" w:eastAsia="Times New Roman" w:hAnsi="Calibri" w:cs="Calibri"/>
+                <w:sz w:val="20"/>
+                <w:szCs w:val="20"/>
+              </w:rPr>
+              <w:t>Ce que chaque personne peut ou ne peut pas faire (produits, commandes, paiements, formations, utilisateurs, réglages)</w:t>
+            </w:r>
+          </w:p>
+        </w:tc>
+      </w:tr>
+      <w:tr>
+        <w:tc>
+          <w:tcPr>
+            <w:tcW w:w="0" w:type="auto"/>
+            <w:tcBorders>
+              <w:top w:val="single" w:sz="6" w:space="0" w:color="C9D3DE"/>
+              <w:left w:val="single" w:sz="6" w:space="0" w:color="C9D3DE"/>
+              <w:bottom w:val="single" w:sz="6" w:space="0" w:color="C9D3DE"/>
+              <w:right w:val="single" w:sz="6" w:space="0" w:color="C9D3DE"/>
+            </w:tcBorders>
+            <w:shd w:val="clear" w:color="auto" w:fill="FFFFFF"/>
+            <w:hideMark/>
+          </w:tcPr>
+          <w:p>
+            <w:pPr>
+              <w:spacing w:before="120" w:after="120"/>
+              <w:rPr>
+                <w:rFonts w:ascii="Calibri" w:eastAsia="Times New Roman" w:hAnsi="Calibri" w:cs="Calibri"/>
+                <w:sz w:val="20"/>
+                <w:szCs w:val="20"/>
+              </w:rPr>
+            </w:pPr>
+            <w:r>
+              <w:rPr>
+                <w:rFonts w:ascii="Calibri" w:eastAsia="Times New Roman" w:hAnsi="Calibri" w:cs="Calibri"/>
+                <w:b/>
+                <w:bCs/>
+                <w:color w:val="1F3A5F"/>
+                <w:sz w:val="20"/>
+                <w:szCs w:val="20"/>
+              </w:rPr>
+              <w:t>Responsable principal</w:t>
+            </w:r>
+          </w:p>
+        </w:tc>
+        <w:tc>
+          <w:tcPr>
+            <w:tcW w:w="0" w:type="auto"/>
+            <w:tcBorders>
+              <w:top w:val="single" w:sz="6" w:space="0" w:color="C9D3DE"/>
+              <w:left w:val="single" w:sz="6" w:space="0" w:color="C9D3DE"/>
+              <w:bottom w:val="single" w:sz="6" w:space="0" w:color="C9D3DE"/>
+              <w:right w:val="single" w:sz="6" w:space="0" w:color="C9D3DE"/>
+            </w:tcBorders>
+            <w:shd w:val="clear" w:color="auto" w:fill="FFFFFF"/>
+            <w:hideMark/>
+          </w:tcPr>
+          <w:p>
+            <w:pPr>
+              <w:spacing w:before="120" w:after="120"/>
+              <w:rPr>
+                <w:rFonts w:ascii="Calibri" w:eastAsia="Times New Roman" w:hAnsi="Calibri" w:cs="Calibri"/>
+                <w:sz w:val="20"/>
+                <w:szCs w:val="20"/>
+              </w:rPr>
+            </w:pPr>
+            <w:r>
+              <w:rPr>
+                <w:rFonts w:ascii="Calibri" w:eastAsia="Times New Roman" w:hAnsi="Calibri" w:cs="Calibri"/>
+                <w:sz w:val="20"/>
+                <w:szCs w:val="20"/>
+              </w:rPr>
+              <w:t>Personne qui a tous les droits et reçoit les alertes de sécurité</w:t>
+            </w:r>
+          </w:p>
+        </w:tc>
+      </w:tr>
+    </w:tbl>
+    <w:p>
+      <w:pPr>
+        <w:pStyle w:val="NormalWeb"/>
+        <w:spacing w:beforeAutospacing="0" w:afterAutospacing="0" w:line="324" w:lineRule="auto"/>
+        <w:rPr>
+          <w:rFonts w:ascii="Calibri" w:hAnsi="Calibri" w:cs="Calibri"/>
+          <w:sz w:val="21"/>
+          <w:szCs w:val="21"/>
+        </w:rPr>
+      </w:pPr>
+      <w:r>
+        <w:rPr>
+          <w:rFonts w:ascii="Calibri" w:hAnsi="Calibri" w:cs="Calibri"/>
+          <w:b/>
+          <w:bCs/>
+          <w:sz w:val="21"/>
+          <w:szCs w:val="21"/>
+        </w:rPr>
+        <w:t xml:space="preserve"> </w:t>
+      </w:r>
+    </w:p>
+    <w:p>
+      <w:pPr>
+        <w:pStyle w:val="Titre2"/>
+        <w:spacing w:before="240" w:beforeAutospacing="0" w:after="80" w:afterAutospacing="0"/>
+        <w:rPr>
+          <w:rFonts w:ascii="Calibri" w:eastAsia="Times New Roman" w:hAnsi="Calibri" w:cs="Calibri"/>
+          <w:color w:val="E8833A"/>
+          <w:sz w:val="26"/>
+          <w:szCs w:val="26"/>
+        </w:rPr>
+      </w:pPr>
+      <w:r>
+        <w:rPr>
+          <w:rFonts w:ascii="Calibri" w:eastAsia="Times New Roman" w:hAnsi="Calibri" w:cs="Calibri"/>
+          <w:color w:val="E8833A"/>
+          <w:sz w:val="26"/>
+          <w:szCs w:val="26"/>
+        </w:rPr>
+        <w:t xml:space="preserve">8. Comptes et accès techniques</w:t>
+      </w:r>
+    </w:p>
+    <w:tbl>
+      <w:tblPr>
+        <w:tblW w:w="5000" w:type="pct"/>
+        <w:tblCellMar>
+          <w:top w:w="60" w:type="dxa"/>
+          <w:left w:w="60" w:type="dxa"/>
+          <w:bottom w:w="60" w:type="dxa"/>
+          <w:right w:w="60" w:type="dxa"/>
+        </w:tblCellMar>
+        <w:tblLook w:val="04A0" w:firstRow="1" w:lastRow="0" w:firstColumn="1" w:lastColumn="0" w:noHBand="0" w:noVBand="1"/>
+      </w:tblPr>
+      <w:tblGrid>
+        <w:gridCol w:w="2364"/>
+        <w:gridCol w:w="7485"/>
+      </w:tblGrid>
+      <w:tr>
+        <w:tc>
+          <w:tcPr>
+            <w:tcW w:w="1200" w:type="pct"/>
+            <w:tcBorders>
+              <w:top w:val="single" w:sz="6" w:space="0" w:color="1F3A5F"/>
+              <w:left w:val="single" w:sz="6" w:space="0" w:color="1F3A5F"/>
+              <w:bottom w:val="single" w:sz="6" w:space="0" w:color="1F3A5F"/>
+              <w:right w:val="single" w:sz="6" w:space="0" w:color="1F3A5F"/>
+            </w:tcBorders>
+            <w:shd w:val="clear" w:color="auto" w:fill="1F3A5F"/>
+            <w:vAlign w:val="center"/>
+            <w:hideMark/>
+          </w:tcPr>
+          <w:p>
+            <w:pPr>
+              <w:spacing w:before="120" w:after="120"/>
+              <w:rPr>
+                <w:rFonts w:ascii="Calibri" w:eastAsia="Times New Roman" w:hAnsi="Calibri" w:cs="Calibri"/>
+                <w:sz w:val="21"/>
+                <w:szCs w:val="21"/>
+              </w:rPr>
+            </w:pPr>
+            <w:r>
+              <w:rPr>
+                <w:rFonts w:ascii="Calibri" w:eastAsia="Times New Roman" w:hAnsi="Calibri" w:cs="Calibri"/>
+                <w:b/>
+                <w:bCs/>
+                <w:color w:val="FFFFFF"/>
+                <w:sz w:val="21"/>
+                <w:szCs w:val="21"/>
+              </w:rPr>
+              <w:t>Élément à fournir</w:t>
+            </w:r>
+          </w:p>
+        </w:tc>
+        <w:tc>
+          <w:tcPr>
+            <w:tcW w:w="3800" w:type="pct"/>
+            <w:tcBorders>
+              <w:top w:val="single" w:sz="6" w:space="0" w:color="1F3A5F"/>
+              <w:left w:val="single" w:sz="6" w:space="0" w:color="1F3A5F"/>
+              <w:bottom w:val="single" w:sz="6" w:space="0" w:color="1F3A5F"/>
+              <w:right w:val="single" w:sz="6" w:space="0" w:color="1F3A5F"/>
+            </w:tcBorders>
+            <w:shd w:val="clear" w:color="auto" w:fill="1F3A5F"/>
+            <w:vAlign w:val="center"/>
+            <w:hideMark/>
+          </w:tcPr>
+          <w:p>
+            <w:pPr>
+              <w:spacing w:before="120" w:after="120"/>
+              <w:rPr>
+                <w:rFonts w:ascii="Calibri" w:eastAsia="Times New Roman" w:hAnsi="Calibri" w:cs="Calibri"/>
+                <w:sz w:val="21"/>
+                <w:szCs w:val="21"/>
+              </w:rPr>
+            </w:pPr>
+            <w:r>
+              <w:rPr>
+                <w:rFonts w:ascii="Calibri" w:eastAsia="Times New Roman" w:hAnsi="Calibri" w:cs="Calibri"/>
+                <w:b/>
+                <w:bCs/>
+                <w:color w:val="FFFFFF"/>
+                <w:sz w:val="21"/>
+                <w:szCs w:val="21"/>
+              </w:rPr>
+              <w:t>Précision</w:t>
+            </w:r>
+          </w:p>
+        </w:tc>
+      </w:tr>
+      <w:tr>
+        <w:tc>
+          <w:tcPr>
+            <w:tcW w:w="0" w:type="auto"/>
+            <w:tcBorders>
+              <w:top w:val="single" w:sz="6" w:space="0" w:color="C9D3DE"/>
+              <w:left w:val="single" w:sz="6" w:space="0" w:color="C9D3DE"/>
+              <w:bottom w:val="single" w:sz="6" w:space="0" w:color="C9D3DE"/>
+              <w:right w:val="single" w:sz="6" w:space="0" w:color="C9D3DE"/>
+            </w:tcBorders>
+            <w:shd w:val="clear" w:color="auto" w:fill="FFFFFF"/>
+            <w:hideMark/>
+          </w:tcPr>
+          <w:p>
+            <w:pPr>
+              <w:spacing w:before="120" w:after="120"/>
+              <w:rPr>
+                <w:rFonts w:ascii="Calibri" w:eastAsia="Times New Roman" w:hAnsi="Calibri" w:cs="Calibri"/>
+                <w:sz w:val="20"/>
+                <w:szCs w:val="20"/>
+              </w:rPr>
+            </w:pPr>
+            <w:r>
+              <w:rPr>
+                <w:rFonts w:ascii="Calibri" w:eastAsia="Times New Roman" w:hAnsi="Calibri" w:cs="Calibri"/>
+                <w:b/>
+                <w:bCs/>
+                <w:color w:val="1F3A5F"/>
+                <w:sz w:val="20"/>
+                <w:szCs w:val="20"/>
+              </w:rPr>
+              <w:t>Nom de domaine</w:t>
+            </w:r>
+          </w:p>
+        </w:tc>
+        <w:tc>
+          <w:tcPr>
+            <w:tcW w:w="0" w:type="auto"/>
+            <w:tcBorders>
+              <w:top w:val="single" w:sz="6" w:space="0" w:color="C9D3DE"/>
+              <w:left w:val="single" w:sz="6" w:space="0" w:color="C9D3DE"/>
+              <w:bottom w:val="single" w:sz="6" w:space="0" w:color="C9D3DE"/>
+              <w:right w:val="single" w:sz="6" w:space="0" w:color="C9D3DE"/>
+            </w:tcBorders>
+            <w:shd w:val="clear" w:color="auto" w:fill="FFFFFF"/>
+            <w:hideMark/>
+          </w:tcPr>
+          <w:p>
+            <w:pPr>
+              <w:spacing w:before="120" w:after="120"/>
+              <w:rPr>
+                <w:rFonts w:ascii="Calibri" w:eastAsia="Times New Roman" w:hAnsi="Calibri" w:cs="Calibri"/>
+                <w:sz w:val="20"/>
+                <w:szCs w:val="20"/>
+              </w:rPr>
+            </w:pPr>
+            <w:r>
+              <w:rPr>
+                <w:rFonts w:ascii="Calibri" w:eastAsia="Times New Roman" w:hAnsi="Calibri" w:cs="Calibri"/>
+                <w:sz w:val="20"/>
+                <w:szCs w:val="20"/>
+              </w:rPr>
+              <w:t>Nom choisi et accès au compte du bureau d'enregistrement, pour que je puisse le relier à la plateforme</w:t>
+            </w:r>
+          </w:p>
+        </w:tc>
+      </w:tr>
+      <w:tr>
+        <w:tc>
+          <w:tcPr>
+            <w:tcW w:w="0" w:type="auto"/>
+            <w:tcBorders>
+              <w:top w:val="single" w:sz="6" w:space="0" w:color="C9D3DE"/>
+              <w:left w:val="single" w:sz="6" w:space="0" w:color="C9D3DE"/>
+              <w:bottom w:val="single" w:sz="6" w:space="0" w:color="C9D3DE"/>
+              <w:right w:val="single" w:sz="6" w:space="0" w:color="C9D3DE"/>
+            </w:tcBorders>
+            <w:shd w:val="clear" w:color="auto" w:fill="FFFFFF"/>
+            <w:hideMark/>
+          </w:tcPr>
+          <w:p>
+            <w:pPr>
+              <w:spacing w:before="120" w:after="120"/>
+              <w:rPr>
+                <w:rFonts w:ascii="Calibri" w:eastAsia="Times New Roman" w:hAnsi="Calibri" w:cs="Calibri"/>
+                <w:sz w:val="20"/>
+                <w:szCs w:val="20"/>
+              </w:rPr>
+            </w:pPr>
+            <w:r>
+              <w:rPr>
+                <w:rFonts w:ascii="Calibri" w:eastAsia="Times New Roman" w:hAnsi="Calibri" w:cs="Calibri"/>
+                <w:b/>
+                <w:bCs/>
+                <w:color w:val="1F3A5F"/>
+                <w:sz w:val="20"/>
+                <w:szCs w:val="20"/>
+              </w:rPr>
+              <w:t>Hébergement</w:t>
+            </w:r>
+          </w:p>
+        </w:tc>
+        <w:tc>
+          <w:tcPr>
+            <w:tcW w:w="0" w:type="auto"/>
+            <w:tcBorders>
+              <w:top w:val="single" w:sz="6" w:space="0" w:color="C9D3DE"/>
+              <w:left w:val="single" w:sz="6" w:space="0" w:color="C9D3DE"/>
+              <w:bottom w:val="single" w:sz="6" w:space="0" w:color="C9D3DE"/>
+              <w:right w:val="single" w:sz="6" w:space="0" w:color="C9D3DE"/>
+            </w:tcBorders>
+            <w:shd w:val="clear" w:color="auto" w:fill="FFFFFF"/>
+            <w:hideMark/>
+          </w:tcPr>
+          <w:p>
+            <w:pPr>
+              <w:spacing w:before="120" w:after="120"/>
+              <w:rPr>
+                <w:rFonts w:ascii="Calibri" w:eastAsia="Times New Roman" w:hAnsi="Calibri" w:cs="Calibri"/>
+                <w:sz w:val="20"/>
+                <w:szCs w:val="20"/>
+              </w:rPr>
+            </w:pPr>
+            <w:r>
+              <w:rPr>
+                <w:rFonts w:ascii="Calibri" w:eastAsia="Times New Roman" w:hAnsi="Calibri" w:cs="Calibri"/>
+                <w:sz w:val="20"/>
+                <w:szCs w:val="20"/>
+              </w:rPr>
+              <w:t>Dès que vous l'avez acheté : accès (panneau de contrôle ou accès serveur). Avant l'achat, je vous indique l'offre exacte à prendre.</w:t>
+            </w:r>
+          </w:p>
+        </w:tc>
+      </w:tr>
+      <w:tr>
+        <w:tc>
+          <w:tcPr>
+            <w:tcW w:w="0" w:type="auto"/>
+            <w:tcBorders>
+              <w:top w:val="single" w:sz="6" w:space="0" w:color="C9D3DE"/>
+              <w:left w:val="single" w:sz="6" w:space="0" w:color="C9D3DE"/>
+              <w:bottom w:val="single" w:sz="6" w:space="0" w:color="C9D3DE"/>
+              <w:right w:val="single" w:sz="6" w:space="0" w:color="C9D3DE"/>
+            </w:tcBorders>
+            <w:shd w:val="clear" w:color="auto" w:fill="FFFFFF"/>
+            <w:hideMark/>
+          </w:tcPr>
+          <w:p>
+            <w:pPr>
+              <w:spacing w:before="120" w:after="120"/>
+              <w:rPr>
+                <w:rFonts w:ascii="Calibri" w:eastAsia="Times New Roman" w:hAnsi="Calibri" w:cs="Calibri"/>
+                <w:sz w:val="20"/>
+                <w:szCs w:val="20"/>
+              </w:rPr>
+            </w:pPr>
+            <w:r>
+              <w:rPr>
+                <w:rFonts w:ascii="Calibri" w:eastAsia="Times New Roman" w:hAnsi="Calibri" w:cs="Calibri"/>
+                <w:b/>
+                <w:bCs/>
+                <w:color w:val="1F3A5F"/>
+                <w:sz w:val="20"/>
+                <w:szCs w:val="20"/>
+              </w:rPr>
+              <w:t>Compte LiveKit (réunions)</w:t>
+            </w:r>
+          </w:p>
+        </w:tc>
+        <w:tc>
+          <w:tcPr>
+            <w:tcW w:w="0" w:type="auto"/>
+            <w:tcBorders>
+              <w:top w:val="single" w:sz="6" w:space="0" w:color="C9D3DE"/>
+              <w:left w:val="single" w:sz="6" w:space="0" w:color="C9D3DE"/>
+              <w:bottom w:val="single" w:sz="6" w:space="0" w:color="C9D3DE"/>
+              <w:right w:val="single" w:sz="6" w:space="0" w:color="C9D3DE"/>
+            </w:tcBorders>
+            <w:shd w:val="clear" w:color="auto" w:fill="FFFFFF"/>
+            <w:hideMark/>
+          </w:tcPr>
+          <w:p>
+            <w:pPr>
+              <w:spacing w:before="120" w:after="120"/>
+              <w:rPr>
+                <w:rFonts w:ascii="Calibri" w:eastAsia="Times New Roman" w:hAnsi="Calibri" w:cs="Calibri"/>
+                <w:sz w:val="20"/>
+                <w:szCs w:val="20"/>
+              </w:rPr>
+            </w:pPr>
+            <w:r>
+              <w:rPr>
+                <w:rFonts w:ascii="Calibri" w:eastAsia="Times New Roman" w:hAnsi="Calibri" w:cs="Calibri"/>
+                <w:sz w:val="20"/>
+                <w:szCs w:val="20"/>
+              </w:rPr>
+              <w:t>Compte créé à votre nom, avec l'adresse du projet et les clés d'accès</w:t>
+            </w:r>
+          </w:p>
+        </w:tc>
+      </w:tr>
+      <w:tr>
+        <w:tc>
+          <w:tcPr>
+            <w:tcW w:w="0" w:type="auto"/>
+            <w:tcBorders>
+              <w:top w:val="single" w:sz="6" w:space="0" w:color="C9D3DE"/>
+              <w:left w:val="single" w:sz="6" w:space="0" w:color="C9D3DE"/>
+              <w:bottom w:val="single" w:sz="6" w:space="0" w:color="C9D3DE"/>
+              <w:right w:val="single" w:sz="6" w:space="0" w:color="C9D3DE"/>
+            </w:tcBorders>
+            <w:shd w:val="clear" w:color="auto" w:fill="FFFFFF"/>
+            <w:hideMark/>
+          </w:tcPr>
+          <w:p>
+            <w:pPr>
+              <w:spacing w:before="120" w:after="120"/>
+              <w:rPr>
+                <w:rFonts w:ascii="Calibri" w:eastAsia="Times New Roman" w:hAnsi="Calibri" w:cs="Calibri"/>
+                <w:sz w:val="20"/>
+                <w:szCs w:val="20"/>
+              </w:rPr>
+            </w:pPr>
+            <w:r>
+              <w:rPr>
+                <w:rFonts w:ascii="Calibri" w:eastAsia="Times New Roman" w:hAnsi="Calibri" w:cs="Calibri"/>
+                <w:b/>
+                <w:bCs/>
+                <w:color w:val="1F3A5F"/>
+                <w:sz w:val="20"/>
+                <w:szCs w:val="20"/>
+              </w:rPr>
+              <w:t>Compte Bunny Stream (vidéos)</w:t>
+            </w:r>
+          </w:p>
+        </w:tc>
+        <w:tc>
+          <w:tcPr>
+            <w:tcW w:w="0" w:type="auto"/>
+            <w:tcBorders>
+              <w:top w:val="single" w:sz="6" w:space="0" w:color="C9D3DE"/>
+              <w:left w:val="single" w:sz="6" w:space="0" w:color="C9D3DE"/>
+              <w:bottom w:val="single" w:sz="6" w:space="0" w:color="C9D3DE"/>
+              <w:right w:val="single" w:sz="6" w:space="0" w:color="C9D3DE"/>
+            </w:tcBorders>
+            <w:shd w:val="clear" w:color="auto" w:fill="FFFFFF"/>
+            <w:hideMark/>
+          </w:tcPr>
+          <w:p>
+            <w:pPr>
+              <w:spacing w:before="120" w:after="120"/>
+              <w:rPr>
+                <w:rFonts w:ascii="Calibri" w:eastAsia="Times New Roman" w:hAnsi="Calibri" w:cs="Calibri"/>
+                <w:sz w:val="20"/>
+                <w:szCs w:val="20"/>
+              </w:rPr>
+            </w:pPr>
+            <w:r>
+              <w:rPr>
+                <w:rFonts w:ascii="Calibri" w:eastAsia="Times New Roman" w:hAnsi="Calibri" w:cs="Calibri"/>
+                <w:sz w:val="20"/>
+                <w:szCs w:val="20"/>
+              </w:rPr>
+              <w:t>Compte créé à votre nom, avec l'identifiant de la bibliothèque vidéo et la clé d'accès</w:t>
+            </w:r>
+          </w:p>
+        </w:tc>
+      </w:tr>
+      <w:tr>
+        <w:tc>
+          <w:tcPr>
+            <w:tcW w:w="0" w:type="auto"/>
+            <w:tcBorders>
+              <w:top w:val="single" w:sz="6" w:space="0" w:color="C9D3DE"/>
+              <w:left w:val="single" w:sz="6" w:space="0" w:color="C9D3DE"/>
+              <w:bottom w:val="single" w:sz="6" w:space="0" w:color="C9D3DE"/>
+              <w:right w:val="single" w:sz="6" w:space="0" w:color="C9D3DE"/>
+            </w:tcBorders>
+            <w:shd w:val="clear" w:color="auto" w:fill="FFFFFF"/>
+            <w:hideMark/>
+          </w:tcPr>
+          <w:p>
+            <w:pPr>
+              <w:spacing w:before="120" w:after="120"/>
+              <w:rPr>
+                <w:rFonts w:ascii="Calibri" w:eastAsia="Times New Roman" w:hAnsi="Calibri" w:cs="Calibri"/>
+                <w:sz w:val="20"/>
+                <w:szCs w:val="20"/>
+              </w:rPr>
+            </w:pPr>
+            <w:r>
+              <w:rPr>
+                <w:rFonts w:ascii="Calibri" w:eastAsia="Times New Roman" w:hAnsi="Calibri" w:cs="Calibri"/>
+                <w:b/>
+                <w:bCs/>
+                <w:color w:val="1F3A5F"/>
+                <w:sz w:val="20"/>
+                <w:szCs w:val="20"/>
+              </w:rPr>
+              <w:t>Service d'envoi d'emails</w:t>
+            </w:r>
+          </w:p>
+        </w:tc>
+        <w:tc>
+          <w:tcPr>
+            <w:tcW w:w="0" w:type="auto"/>
+            <w:tcBorders>
+              <w:top w:val="single" w:sz="6" w:space="0" w:color="C9D3DE"/>
+              <w:left w:val="single" w:sz="6" w:space="0" w:color="C9D3DE"/>
+              <w:bottom w:val="single" w:sz="6" w:space="0" w:color="C9D3DE"/>
+              <w:right w:val="single" w:sz="6" w:space="0" w:color="C9D3DE"/>
+            </w:tcBorders>
+            <w:shd w:val="clear" w:color="auto" w:fill="FFFFFF"/>
+            <w:hideMark/>
+          </w:tcPr>
+          <w:p>
+            <w:pPr>
+              <w:spacing w:before="120" w:after="120"/>
+              <w:rPr>
+                <w:rFonts w:ascii="Calibri" w:eastAsia="Times New Roman" w:hAnsi="Calibri" w:cs="Calibri"/>
+                <w:sz w:val="20"/>
+                <w:szCs w:val="20"/>
+              </w:rPr>
+            </w:pPr>
+            <w:r>
+              <w:rPr>
+                <w:rFonts w:ascii="Calibri" w:eastAsia="Times New Roman" w:hAnsi="Calibri" w:cs="Calibri"/>
+                <w:sz w:val="20"/>
+                <w:szCs w:val="20"/>
+              </w:rPr>
+              <w:t>Compte créé à votre nom, adresse d'expédition souhaitée (par exemple contact@votresite.com) et accès au domaine pour valider l'envoi</w:t>
+            </w:r>
+          </w:p>
+        </w:tc>
+      </w:tr>
+      <w:tr>
+        <w:tc>
+          <w:tcPr>
+            <w:tcW w:w="0" w:type="auto"/>
+            <w:tcBorders>
+              <w:top w:val="single" w:sz="6" w:space="0" w:color="C9D3DE"/>
+              <w:left w:val="single" w:sz="6" w:space="0" w:color="C9D3DE"/>
+              <w:bottom w:val="single" w:sz="6" w:space="0" w:color="C9D3DE"/>
+              <w:right w:val="single" w:sz="6" w:space="0" w:color="C9D3DE"/>
+            </w:tcBorders>
+            <w:shd w:val="clear" w:color="auto" w:fill="FFFFFF"/>
+            <w:hideMark/>
+          </w:tcPr>
+          <w:p>
+            <w:pPr>
+              <w:spacing w:before="120" w:after="120"/>
+              <w:rPr>
+                <w:rFonts w:ascii="Calibri" w:eastAsia="Times New Roman" w:hAnsi="Calibri" w:cs="Calibri"/>
+                <w:sz w:val="20"/>
+                <w:szCs w:val="20"/>
+              </w:rPr>
+            </w:pPr>
+            <w:r>
+              <w:rPr>
+                <w:rFonts w:ascii="Calibri" w:eastAsia="Times New Roman" w:hAnsi="Calibri" w:cs="Calibri"/>
+                <w:b/>
+                <w:bCs/>
+                <w:color w:val="1F3A5F"/>
+                <w:sz w:val="20"/>
+                <w:szCs w:val="20"/>
+              </w:rPr>
+              <w:t>Transmission sécurisée</w:t>
+            </w:r>
+          </w:p>
+        </w:tc>
+        <w:tc>
+          <w:tcPr>
+            <w:tcW w:w="0" w:type="auto"/>
+            <w:tcBorders>
+              <w:top w:val="single" w:sz="6" w:space="0" w:color="C9D3DE"/>
+              <w:left w:val="single" w:sz="6" w:space="0" w:color="C9D3DE"/>
+              <w:bottom w:val="single" w:sz="6" w:space="0" w:color="C9D3DE"/>
+              <w:right w:val="single" w:sz="6" w:space="0" w:color="C9D3DE"/>
+            </w:tcBorders>
+            <w:shd w:val="clear" w:color="auto" w:fill="FFFFFF"/>
+            <w:hideMark/>
+          </w:tcPr>
+          <w:p>
+            <w:pPr>
+              <w:spacing w:before="120" w:after="120"/>
+              <w:rPr>
+                <w:rFonts w:ascii="Calibri" w:eastAsia="Times New Roman" w:hAnsi="Calibri" w:cs="Calibri"/>
+                <w:sz w:val="20"/>
+                <w:szCs w:val="20"/>
+              </w:rPr>
+            </w:pPr>
+            <w:r>
+              <w:rPr>
+                <w:rFonts w:ascii="Calibri" w:eastAsia="Times New Roman" w:hAnsi="Calibri" w:cs="Calibri"/>
+                <w:sz w:val="20"/>
+                <w:szCs w:val="20"/>
+              </w:rPr>
+              <w:t>Les mots de passe et clés d'accès ne sont jamais envoyés par message ordinaire : nous convenons ensemble d'un moyen sécurisé. Tous les comptes restent à votre nom.</w:t>
+            </w:r>
+          </w:p>
+        </w:tc>
+      </w:tr>
+    </w:tbl>
+    <w:p>
+      <w:pPr>
+        <w:pStyle w:val="NormalWeb"/>
+        <w:spacing w:beforeAutospacing="0" w:afterAutospacing="0" w:line="324" w:lineRule="auto"/>
+        <w:rPr>
+          <w:rFonts w:ascii="Calibri" w:hAnsi="Calibri" w:cs="Calibri"/>
+          <w:sz w:val="21"/>
+          <w:szCs w:val="21"/>
+        </w:rPr>
+      </w:pPr>
+      <w:r>
+        <w:rPr>
+          <w:rFonts w:ascii="Calibri" w:hAnsi="Calibri" w:cs="Calibri"/>
+          <w:b/>
+          <w:bCs/>
+          <w:sz w:val="21"/>
+          <w:szCs w:val="21"/>
+        </w:rPr>
+        <w:t xml:space="preserve"> </w:t>
+      </w:r>
+    </w:p>
+    <w:p>
+      <w:pPr>
+        <w:pStyle w:val="Titre2"/>
+        <w:spacing w:before="240" w:beforeAutospacing="0" w:after="80" w:afterAutospacing="0"/>
+        <w:rPr>
+          <w:rFonts w:ascii="Calibri" w:eastAsia="Times New Roman" w:hAnsi="Calibri" w:cs="Calibri"/>
+          <w:color w:val="E8833A"/>
+          <w:sz w:val="26"/>
+          <w:szCs w:val="26"/>
+        </w:rPr>
+      </w:pPr>
+      <w:r>
+        <w:rPr>
+          <w:rFonts w:ascii="Calibri" w:eastAsia="Times New Roman" w:hAnsi="Calibri" w:cs="Calibri"/>
+          <w:color w:val="E8833A"/>
+          <w:sz w:val="26"/>
+          <w:szCs w:val="26"/>
+        </w:rPr>
+        <w:t xml:space="preserve">9. Données existantes (s'il y en a)</w:t>
+      </w:r>
+    </w:p>
+    <w:tbl>
+      <w:tblPr>
+        <w:tblW w:w="5000" w:type="pct"/>
+        <w:tblCellMar>
+          <w:top w:w="60" w:type="dxa"/>
+          <w:left w:w="60" w:type="dxa"/>
+          <w:bottom w:w="60" w:type="dxa"/>
+          <w:right w:w="60" w:type="dxa"/>
+        </w:tblCellMar>
+        <w:tblLook w:val="04A0" w:firstRow="1" w:lastRow="0" w:firstColumn="1" w:lastColumn="0" w:noHBand="0" w:noVBand="1"/>
+      </w:tblPr>
+      <w:tblGrid>
+        <w:gridCol w:w="2364"/>
+        <w:gridCol w:w="7485"/>
+      </w:tblGrid>
+      <w:tr>
+        <w:tc>
+          <w:tcPr>
+            <w:tcW w:w="1200" w:type="pct"/>
+            <w:tcBorders>
+              <w:top w:val="single" w:sz="6" w:space="0" w:color="1F3A5F"/>
+              <w:left w:val="single" w:sz="6" w:space="0" w:color="1F3A5F"/>
+              <w:bottom w:val="single" w:sz="6" w:space="0" w:color="1F3A5F"/>
+              <w:right w:val="single" w:sz="6" w:space="0" w:color="1F3A5F"/>
+            </w:tcBorders>
+            <w:shd w:val="clear" w:color="auto" w:fill="1F3A5F"/>
+            <w:vAlign w:val="center"/>
+            <w:hideMark/>
+          </w:tcPr>
+          <w:p>
+            <w:pPr>
+              <w:spacing w:before="120" w:after="120"/>
+              <w:rPr>
+                <w:rFonts w:ascii="Calibri" w:eastAsia="Times New Roman" w:hAnsi="Calibri" w:cs="Calibri"/>
+                <w:sz w:val="21"/>
+                <w:szCs w:val="21"/>
+              </w:rPr>
+            </w:pPr>
+            <w:r>
+              <w:rPr>
+                <w:rFonts w:ascii="Calibri" w:eastAsia="Times New Roman" w:hAnsi="Calibri" w:cs="Calibri"/>
+                <w:b/>
+                <w:bCs/>
+                <w:color w:val="FFFFFF"/>
+                <w:sz w:val="21"/>
+                <w:szCs w:val="21"/>
+              </w:rPr>
+              <w:t>Élément à fournir</w:t>
+            </w:r>
+          </w:p>
+        </w:tc>
+        <w:tc>
+          <w:tcPr>
+            <w:tcW w:w="3800" w:type="pct"/>
+            <w:tcBorders>
+              <w:top w:val="single" w:sz="6" w:space="0" w:color="1F3A5F"/>
+              <w:left w:val="single" w:sz="6" w:space="0" w:color="1F3A5F"/>
+              <w:bottom w:val="single" w:sz="6" w:space="0" w:color="1F3A5F"/>
+              <w:right w:val="single" w:sz="6" w:space="0" w:color="1F3A5F"/>
+            </w:tcBorders>
+            <w:shd w:val="clear" w:color="auto" w:fill="1F3A5F"/>
+            <w:vAlign w:val="center"/>
+            <w:hideMark/>
+          </w:tcPr>
+          <w:p>
+            <w:pPr>
+              <w:spacing w:before="120" w:after="120"/>
+              <w:rPr>
+                <w:rFonts w:ascii="Calibri" w:eastAsia="Times New Roman" w:hAnsi="Calibri" w:cs="Calibri"/>
+                <w:sz w:val="21"/>
+                <w:szCs w:val="21"/>
+              </w:rPr>
+            </w:pPr>
+            <w:r>
+              <w:rPr>
+                <w:rFonts w:ascii="Calibri" w:eastAsia="Times New Roman" w:hAnsi="Calibri" w:cs="Calibri"/>
+                <w:b/>
+                <w:bCs/>
+                <w:color w:val="FFFFFF"/>
+                <w:sz w:val="21"/>
+                <w:szCs w:val="21"/>
+              </w:rPr>
+              <w:t>Précision</w:t>
+            </w:r>
+          </w:p>
+        </w:tc>
+      </w:tr>
+      <w:tr>
+        <w:tc>
+          <w:tcPr>
+            <w:tcW w:w="0" w:type="auto"/>
+            <w:tcBorders>
+              <w:top w:val="single" w:sz="6" w:space="0" w:color="C9D3DE"/>
+              <w:left w:val="single" w:sz="6" w:space="0" w:color="C9D3DE"/>
+              <w:bottom w:val="single" w:sz="6" w:space="0" w:color="C9D3DE"/>
+              <w:right w:val="single" w:sz="6" w:space="0" w:color="C9D3DE"/>
+            </w:tcBorders>
+            <w:shd w:val="clear" w:color="auto" w:fill="FFFFFF"/>
+            <w:hideMark/>
+          </w:tcPr>
+          <w:p>
+            <w:pPr>
+              <w:spacing w:before="120" w:after="120"/>
+              <w:rPr>
+                <w:rFonts w:ascii="Calibri" w:eastAsia="Times New Roman" w:hAnsi="Calibri" w:cs="Calibri"/>
+                <w:sz w:val="20"/>
+                <w:szCs w:val="20"/>
+              </w:rPr>
+            </w:pPr>
+            <w:r>
+              <w:rPr>
+                <w:rFonts w:ascii="Calibri" w:eastAsia="Times New Roman" w:hAnsi="Calibri" w:cs="Calibri"/>
+                <w:b/>
+                <w:bCs/>
+                <w:color w:val="1F3A5F"/>
+                <w:sz w:val="20"/>
+                <w:szCs w:val="20"/>
+              </w:rPr>
+              <w:t>Ancien site ou anciens fichiers</w:t>
+            </w:r>
+          </w:p>
+        </w:tc>
+        <w:tc>
+          <w:tcPr>
+            <w:tcW w:w="0" w:type="auto"/>
+            <w:tcBorders>
+              <w:top w:val="single" w:sz="6" w:space="0" w:color="C9D3DE"/>
+              <w:left w:val="single" w:sz="6" w:space="0" w:color="C9D3DE"/>
+              <w:bottom w:val="single" w:sz="6" w:space="0" w:color="C9D3DE"/>
+              <w:right w:val="single" w:sz="6" w:space="0" w:color="C9D3DE"/>
+            </w:tcBorders>
+            <w:shd w:val="clear" w:color="auto" w:fill="FFFFFF"/>
+            <w:hideMark/>
+          </w:tcPr>
+          <w:p>
+            <w:pPr>
+              <w:spacing w:before="120" w:after="120"/>
+              <w:rPr>
+                <w:rFonts w:ascii="Calibri" w:eastAsia="Times New Roman" w:hAnsi="Calibri" w:cs="Calibri"/>
+                <w:sz w:val="20"/>
+                <w:szCs w:val="20"/>
+              </w:rPr>
+            </w:pPr>
+            <w:r>
+              <w:rPr>
+                <w:rFonts w:ascii="Calibri" w:eastAsia="Times New Roman" w:hAnsi="Calibri" w:cs="Calibri"/>
+                <w:sz w:val="20"/>
+                <w:szCs w:val="20"/>
+              </w:rPr>
+              <w:t>Liste de produits, de clients, de commandes ou d'étudiants à reprendre, en fichier Excel ou CSV</w:t>
+            </w:r>
+          </w:p>
+        </w:tc>
+      </w:tr>
+      <w:tr>
+        <w:tc>
+          <w:tcPr>
+            <w:tcW w:w="0" w:type="auto"/>
+            <w:tcBorders>
+              <w:top w:val="single" w:sz="6" w:space="0" w:color="C9D3DE"/>
+              <w:left w:val="single" w:sz="6" w:space="0" w:color="C9D3DE"/>
+              <w:bottom w:val="single" w:sz="6" w:space="0" w:color="C9D3DE"/>
+              <w:right w:val="single" w:sz="6" w:space="0" w:color="C9D3DE"/>
+            </w:tcBorders>
+            <w:shd w:val="clear" w:color="auto" w:fill="FFFFFF"/>
+            <w:hideMark/>
+          </w:tcPr>
+          <w:p>
+            <w:pPr>
+              <w:spacing w:before="120" w:after="120"/>
+              <w:rPr>
+                <w:rFonts w:ascii="Calibri" w:eastAsia="Times New Roman" w:hAnsi="Calibri" w:cs="Calibri"/>
+                <w:sz w:val="20"/>
+                <w:szCs w:val="20"/>
+              </w:rPr>
+            </w:pPr>
+            <w:r>
+              <w:rPr>
+                <w:rFonts w:ascii="Calibri" w:eastAsia="Times New Roman" w:hAnsi="Calibri" w:cs="Calibri"/>
+                <w:b/>
+                <w:bCs/>
+                <w:color w:val="1F3A5F"/>
+                <w:sz w:val="20"/>
+                <w:szCs w:val="20"/>
+              </w:rPr>
+              <w:t>Volumes prévus</w:t>
+            </w:r>
+          </w:p>
+        </w:tc>
+        <w:tc>
+          <w:tcPr>
+            <w:tcW w:w="0" w:type="auto"/>
+            <w:tcBorders>
+              <w:top w:val="single" w:sz="6" w:space="0" w:color="C9D3DE"/>
+              <w:left w:val="single" w:sz="6" w:space="0" w:color="C9D3DE"/>
+              <w:bottom w:val="single" w:sz="6" w:space="0" w:color="C9D3DE"/>
+              <w:right w:val="single" w:sz="6" w:space="0" w:color="C9D3DE"/>
+            </w:tcBorders>
+            <w:shd w:val="clear" w:color="auto" w:fill="FFFFFF"/>
+            <w:hideMark/>
+          </w:tcPr>
+          <w:p>
+            <w:pPr>
+              <w:spacing w:before="120" w:after="120"/>
+              <w:rPr>
+                <w:rFonts w:ascii="Calibri" w:eastAsia="Times New Roman" w:hAnsi="Calibri" w:cs="Calibri"/>
+                <w:sz w:val="20"/>
+                <w:szCs w:val="20"/>
+              </w:rPr>
+            </w:pPr>
+            <w:r>
+              <w:rPr>
+                <w:rFonts w:ascii="Calibri" w:eastAsia="Times New Roman" w:hAnsi="Calibri" w:cs="Calibri"/>
+                <w:sz w:val="20"/>
+                <w:szCs w:val="20"/>
+              </w:rPr>
+              <w:t>Nombre de produits, d'étudiants et de commandes attendus les premiers mois, pour dimensionner l'hébergement</w:t>
+            </w:r>
+          </w:p>
+        </w:tc>
+      </w:tr>
+    </w:tbl>
+    <w:p>
+      <w:pPr>
+        <w:pStyle w:val="NormalWeb"/>
+        <w:spacing w:beforeAutospacing="0" w:afterAutospacing="0" w:line="324" w:lineRule="auto"/>
+        <w:rPr>
+          <w:rFonts w:ascii="Calibri" w:hAnsi="Calibri" w:cs="Calibri"/>
+          <w:sz w:val="21"/>
+          <w:szCs w:val="21"/>
+        </w:rPr>
+      </w:pPr>
+      <w:r>
+        <w:rPr>
+          <w:rFonts w:ascii="Calibri" w:hAnsi="Calibri" w:cs="Calibri"/>
+          <w:b/>
+          <w:bCs/>
+          <w:sz w:val="21"/>
+          <w:szCs w:val="21"/>
+        </w:rPr>
+        <w:t xml:space="preserve"> </w:t>
+      </w:r>
     </w:p>
     <w:sectPr>
       <w:headerReference w:type="even" r:id="rId6"/>

</xml_diff>